<commit_message>
docs(sprint-3): explicar la matriz de confusion (VP, VN, FP, FN)
- Figura 5 con cada casilla etiquetada (acierto, falsa alarma, no detectado, detectado)
- Informe: tabla de lectura de la matriz del modelo elegido, metricas calculadas desde las casillas y que error pesa mas
- Colab y PDF de la presentacion con la misma explicacion

Co-Authored-By: Claude Opus 5.5 <noreply@anthropic.com>
</commit_message>
<xml_diff>
--- a/Contenido Entrega 3 mejoras/1_Informe/Entrega3_Grupo11.docx
+++ b/Contenido Entrega 3 mejoras/1_Informe/Entrega3_Grupo11.docx
@@ -23042,6 +23042,946 @@
           <w:szCs w:val="18"/>
         </w:rPr>
         <w:t xml:space="preserve">Matrices de confusión de los modelos finales en el período de prueba.</w:t>
+      </w:r>
+    </w:p>
+    <w:p>
+      <w:pPr>
+        <w:spacing w:after="120" w:before="0" w:line="276"/>
+        <w:jc w:val="both"/>
+      </w:pPr>
+      <w:r>
+        <w:rPr>
+          <w:b/>
+          <w:bCs/>
+        </w:rPr>
+        <w:t xml:space="preserve">Cómo leer la matriz de confusión.</w:t>
+      </w:r>
+      <w:r>
+        <w:t xml:space="preserve"> Cada casilla cruza lo que pasó en realidad (filas) con lo que predijo el modelo (columnas). Para el modelo elegido, en el período de prueba:</w:t>
+      </w:r>
+    </w:p>
+    <w:tbl>
+      <w:tblPr>
+        <w:tblW w:type="dxa" w:w="9026"/>
+        <w:tblBorders>
+          <w:top w:val="single" w:color="auto" w:sz="4"/>
+          <w:left w:val="single" w:color="auto" w:sz="4"/>
+          <w:bottom w:val="single" w:color="auto" w:sz="4"/>
+          <w:right w:val="single" w:color="auto" w:sz="4"/>
+          <w:insideH w:val="single" w:color="auto" w:sz="4"/>
+          <w:insideV w:val="single" w:color="auto" w:sz="4"/>
+        </w:tblBorders>
+        <w:tblLayout w:type="fixed"/>
+      </w:tblPr>
+      <w:tblGrid>
+        <w:gridCol w:w="2276"/>
+        <w:gridCol w:w="1177"/>
+        <w:gridCol w:w="1177"/>
+        <w:gridCol w:w="942"/>
+        <w:gridCol w:w="3454"/>
+      </w:tblGrid>
+      <w:tr>
+        <w:trPr>
+          <w:cantSplit/>
+          <w:tblHeader/>
+        </w:trPr>
+        <w:tc>
+          <w:tcPr>
+            <w:tcW w:type="dxa" w:w="2276"/>
+            <w:tcBorders>
+              <w:top w:val="single" w:color="BFBFBF" w:sz="4"/>
+              <w:left w:val="single" w:color="BFBFBF" w:sz="4"/>
+              <w:bottom w:val="single" w:color="BFBFBF" w:sz="4"/>
+              <w:right w:val="single" w:color="BFBFBF" w:sz="4"/>
+            </w:tcBorders>
+            <w:shd w:fill="F2F2F2" w:color="auto" w:val="clear"/>
+            <w:tcMar>
+              <w:top w:type="dxa" w:w="60"/>
+              <w:left w:type="dxa" w:w="100"/>
+              <w:bottom w:type="dxa" w:w="60"/>
+              <w:right w:type="dxa" w:w="100"/>
+            </w:tcMar>
+            <w:vAlign w:val="top"/>
+          </w:tcPr>
+          <w:p>
+            <w:pPr>
+              <w:spacing w:after="0" w:line="252"/>
+              <w:jc w:val="left"/>
+            </w:pPr>
+            <w:r>
+              <w:rPr>
+                <w:b/>
+                <w:bCs/>
+                <w:sz w:val="17"/>
+                <w:szCs w:val="17"/>
+              </w:rPr>
+              <w:t xml:space="preserve">Casilla</w:t>
+            </w:r>
+          </w:p>
+        </w:tc>
+        <w:tc>
+          <w:tcPr>
+            <w:tcW w:type="dxa" w:w="1177"/>
+            <w:tcBorders>
+              <w:top w:val="single" w:color="BFBFBF" w:sz="4"/>
+              <w:left w:val="single" w:color="BFBFBF" w:sz="4"/>
+              <w:bottom w:val="single" w:color="BFBFBF" w:sz="4"/>
+              <w:right w:val="single" w:color="BFBFBF" w:sz="4"/>
+            </w:tcBorders>
+            <w:shd w:fill="F2F2F2" w:color="auto" w:val="clear"/>
+            <w:tcMar>
+              <w:top w:type="dxa" w:w="60"/>
+              <w:left w:type="dxa" w:w="100"/>
+              <w:bottom w:type="dxa" w:w="60"/>
+              <w:right w:type="dxa" w:w="100"/>
+            </w:tcMar>
+            <w:vAlign w:val="top"/>
+          </w:tcPr>
+          <w:p>
+            <w:pPr>
+              <w:spacing w:after="0" w:line="252"/>
+              <w:jc w:val="left"/>
+            </w:pPr>
+            <w:r>
+              <w:rPr>
+                <w:b/>
+                <w:bCs/>
+                <w:sz w:val="17"/>
+                <w:szCs w:val="17"/>
+              </w:rPr>
+              <w:t xml:space="preserve">Real</w:t>
+            </w:r>
+          </w:p>
+        </w:tc>
+        <w:tc>
+          <w:tcPr>
+            <w:tcW w:type="dxa" w:w="1177"/>
+            <w:tcBorders>
+              <w:top w:val="single" w:color="BFBFBF" w:sz="4"/>
+              <w:left w:val="single" w:color="BFBFBF" w:sz="4"/>
+              <w:bottom w:val="single" w:color="BFBFBF" w:sz="4"/>
+              <w:right w:val="single" w:color="BFBFBF" w:sz="4"/>
+            </w:tcBorders>
+            <w:shd w:fill="F2F2F2" w:color="auto" w:val="clear"/>
+            <w:tcMar>
+              <w:top w:type="dxa" w:w="60"/>
+              <w:left w:type="dxa" w:w="100"/>
+              <w:bottom w:type="dxa" w:w="60"/>
+              <w:right w:type="dxa" w:w="100"/>
+            </w:tcMar>
+            <w:vAlign w:val="top"/>
+          </w:tcPr>
+          <w:p>
+            <w:pPr>
+              <w:spacing w:after="0" w:line="252"/>
+              <w:jc w:val="left"/>
+            </w:pPr>
+            <w:r>
+              <w:rPr>
+                <w:b/>
+                <w:bCs/>
+                <w:sz w:val="17"/>
+                <w:szCs w:val="17"/>
+              </w:rPr>
+              <w:t xml:space="preserve">Predicho</w:t>
+            </w:r>
+          </w:p>
+        </w:tc>
+        <w:tc>
+          <w:tcPr>
+            <w:tcW w:type="dxa" w:w="942"/>
+            <w:tcBorders>
+              <w:top w:val="single" w:color="BFBFBF" w:sz="4"/>
+              <w:left w:val="single" w:color="BFBFBF" w:sz="4"/>
+              <w:bottom w:val="single" w:color="BFBFBF" w:sz="4"/>
+              <w:right w:val="single" w:color="BFBFBF" w:sz="4"/>
+            </w:tcBorders>
+            <w:shd w:fill="F2F2F2" w:color="auto" w:val="clear"/>
+            <w:tcMar>
+              <w:top w:type="dxa" w:w="60"/>
+              <w:left w:type="dxa" w:w="100"/>
+              <w:bottom w:type="dxa" w:w="60"/>
+              <w:right w:type="dxa" w:w="100"/>
+            </w:tcMar>
+            <w:vAlign w:val="top"/>
+          </w:tcPr>
+          <w:p>
+            <w:pPr>
+              <w:spacing w:after="0" w:line="252"/>
+              <w:jc w:val="right"/>
+            </w:pPr>
+            <w:r>
+              <w:rPr>
+                <w:b/>
+                <w:bCs/>
+                <w:sz w:val="17"/>
+                <w:szCs w:val="17"/>
+              </w:rPr>
+              <w:t xml:space="preserve">Cantidad</w:t>
+            </w:r>
+          </w:p>
+        </w:tc>
+        <w:tc>
+          <w:tcPr>
+            <w:tcW w:type="dxa" w:w="3454"/>
+            <w:tcBorders>
+              <w:top w:val="single" w:color="BFBFBF" w:sz="4"/>
+              <w:left w:val="single" w:color="BFBFBF" w:sz="4"/>
+              <w:bottom w:val="single" w:color="BFBFBF" w:sz="4"/>
+              <w:right w:val="single" w:color="BFBFBF" w:sz="4"/>
+            </w:tcBorders>
+            <w:shd w:fill="F2F2F2" w:color="auto" w:val="clear"/>
+            <w:tcMar>
+              <w:top w:type="dxa" w:w="60"/>
+              <w:left w:type="dxa" w:w="100"/>
+              <w:bottom w:type="dxa" w:w="60"/>
+              <w:right w:type="dxa" w:w="100"/>
+            </w:tcMar>
+            <w:vAlign w:val="top"/>
+          </w:tcPr>
+          <w:p>
+            <w:pPr>
+              <w:spacing w:after="0" w:line="252"/>
+              <w:jc w:val="left"/>
+            </w:pPr>
+            <w:r>
+              <w:rPr>
+                <w:b/>
+                <w:bCs/>
+                <w:sz w:val="17"/>
+                <w:szCs w:val="17"/>
+              </w:rPr>
+              <w:t xml:space="preserve">Qué significa en el problema</w:t>
+            </w:r>
+          </w:p>
+        </w:tc>
+      </w:tr>
+      <w:tr>
+        <w:trPr>
+          <w:cantSplit/>
+        </w:trPr>
+        <w:tc>
+          <w:tcPr>
+            <w:tcW w:type="dxa" w:w="2276"/>
+            <w:tcBorders>
+              <w:top w:val="single" w:color="BFBFBF" w:sz="4"/>
+              <w:left w:val="single" w:color="BFBFBF" w:sz="4"/>
+              <w:bottom w:val="single" w:color="BFBFBF" w:sz="4"/>
+              <w:right w:val="single" w:color="BFBFBF" w:sz="4"/>
+            </w:tcBorders>
+            <w:tcMar>
+              <w:top w:type="dxa" w:w="60"/>
+              <w:left w:type="dxa" w:w="100"/>
+              <w:bottom w:type="dxa" w:w="60"/>
+              <w:right w:type="dxa" w:w="100"/>
+            </w:tcMar>
+            <w:vAlign w:val="top"/>
+          </w:tcPr>
+          <w:p>
+            <w:pPr>
+              <w:spacing w:after="0" w:line="252"/>
+              <w:jc w:val="left"/>
+            </w:pPr>
+            <w:r>
+              <w:rPr>
+                <w:sz w:val="17"/>
+                <w:szCs w:val="17"/>
+              </w:rPr>
+              <w:t xml:space="preserve">Verdadero negativo (VN)</w:t>
+            </w:r>
+          </w:p>
+        </w:tc>
+        <w:tc>
+          <w:tcPr>
+            <w:tcW w:type="dxa" w:w="1177"/>
+            <w:tcBorders>
+              <w:top w:val="single" w:color="BFBFBF" w:sz="4"/>
+              <w:left w:val="single" w:color="BFBFBF" w:sz="4"/>
+              <w:bottom w:val="single" w:color="BFBFBF" w:sz="4"/>
+              <w:right w:val="single" w:color="BFBFBF" w:sz="4"/>
+            </w:tcBorders>
+            <w:tcMar>
+              <w:top w:type="dxa" w:w="60"/>
+              <w:left w:type="dxa" w:w="100"/>
+              <w:bottom w:type="dxa" w:w="60"/>
+              <w:right w:type="dxa" w:w="100"/>
+            </w:tcMar>
+            <w:vAlign w:val="top"/>
+          </w:tcPr>
+          <w:p>
+            <w:pPr>
+              <w:spacing w:after="0" w:line="252"/>
+              <w:jc w:val="left"/>
+            </w:pPr>
+            <w:r>
+              <w:rPr>
+                <w:sz w:val="17"/>
+                <w:szCs w:val="17"/>
+              </w:rPr>
+              <w:t xml:space="preserve">Sin recargo</w:t>
+            </w:r>
+          </w:p>
+        </w:tc>
+        <w:tc>
+          <w:tcPr>
+            <w:tcW w:type="dxa" w:w="1177"/>
+            <w:tcBorders>
+              <w:top w:val="single" w:color="BFBFBF" w:sz="4"/>
+              <w:left w:val="single" w:color="BFBFBF" w:sz="4"/>
+              <w:bottom w:val="single" w:color="BFBFBF" w:sz="4"/>
+              <w:right w:val="single" w:color="BFBFBF" w:sz="4"/>
+            </w:tcBorders>
+            <w:tcMar>
+              <w:top w:type="dxa" w:w="60"/>
+              <w:left w:type="dxa" w:w="100"/>
+              <w:bottom w:type="dxa" w:w="60"/>
+              <w:right w:type="dxa" w:w="100"/>
+            </w:tcMar>
+            <w:vAlign w:val="top"/>
+          </w:tcPr>
+          <w:p>
+            <w:pPr>
+              <w:spacing w:after="0" w:line="252"/>
+              <w:jc w:val="left"/>
+            </w:pPr>
+            <w:r>
+              <w:rPr>
+                <w:sz w:val="17"/>
+                <w:szCs w:val="17"/>
+              </w:rPr>
+              <w:t xml:space="preserve">Sin recargo</w:t>
+            </w:r>
+          </w:p>
+        </w:tc>
+        <w:tc>
+          <w:tcPr>
+            <w:tcW w:type="dxa" w:w="942"/>
+            <w:tcBorders>
+              <w:top w:val="single" w:color="BFBFBF" w:sz="4"/>
+              <w:left w:val="single" w:color="BFBFBF" w:sz="4"/>
+              <w:bottom w:val="single" w:color="BFBFBF" w:sz="4"/>
+              <w:right w:val="single" w:color="BFBFBF" w:sz="4"/>
+            </w:tcBorders>
+            <w:tcMar>
+              <w:top w:type="dxa" w:w="60"/>
+              <w:left w:type="dxa" w:w="100"/>
+              <w:bottom w:type="dxa" w:w="60"/>
+              <w:right w:type="dxa" w:w="100"/>
+            </w:tcMar>
+            <w:vAlign w:val="top"/>
+          </w:tcPr>
+          <w:p>
+            <w:pPr>
+              <w:spacing w:after="0" w:line="252"/>
+              <w:jc w:val="right"/>
+            </w:pPr>
+            <w:r>
+              <w:rPr>
+                <w:sz w:val="17"/>
+                <w:szCs w:val="17"/>
+              </w:rPr>
+              <w:t xml:space="preserve">34.590</w:t>
+            </w:r>
+          </w:p>
+        </w:tc>
+        <w:tc>
+          <w:tcPr>
+            <w:tcW w:type="dxa" w:w="3454"/>
+            <w:tcBorders>
+              <w:top w:val="single" w:color="BFBFBF" w:sz="4"/>
+              <w:left w:val="single" w:color="BFBFBF" w:sz="4"/>
+              <w:bottom w:val="single" w:color="BFBFBF" w:sz="4"/>
+              <w:right w:val="single" w:color="BFBFBF" w:sz="4"/>
+            </w:tcBorders>
+            <w:tcMar>
+              <w:top w:type="dxa" w:w="60"/>
+              <w:left w:type="dxa" w:w="100"/>
+              <w:bottom w:type="dxa" w:w="60"/>
+              <w:right w:type="dxa" w:w="100"/>
+            </w:tcMar>
+            <w:vAlign w:val="top"/>
+          </w:tcPr>
+          <w:p>
+            <w:pPr>
+              <w:spacing w:after="0" w:line="252"/>
+              <w:jc w:val="left"/>
+            </w:pPr>
+            <w:r>
+              <w:rPr>
+                <w:sz w:val="17"/>
+                <w:szCs w:val="17"/>
+              </w:rPr>
+              <w:t xml:space="preserve">Acierto: el modelo no avisa y no hay recargo.</w:t>
+            </w:r>
+          </w:p>
+        </w:tc>
+      </w:tr>
+      <w:tr>
+        <w:trPr>
+          <w:cantSplit/>
+        </w:trPr>
+        <w:tc>
+          <w:tcPr>
+            <w:tcW w:type="dxa" w:w="2276"/>
+            <w:tcBorders>
+              <w:top w:val="single" w:color="BFBFBF" w:sz="4"/>
+              <w:left w:val="single" w:color="BFBFBF" w:sz="4"/>
+              <w:bottom w:val="single" w:color="BFBFBF" w:sz="4"/>
+              <w:right w:val="single" w:color="BFBFBF" w:sz="4"/>
+            </w:tcBorders>
+            <w:tcMar>
+              <w:top w:type="dxa" w:w="60"/>
+              <w:left w:type="dxa" w:w="100"/>
+              <w:bottom w:type="dxa" w:w="60"/>
+              <w:right w:type="dxa" w:w="100"/>
+            </w:tcMar>
+            <w:vAlign w:val="top"/>
+          </w:tcPr>
+          <w:p>
+            <w:pPr>
+              <w:spacing w:after="0" w:line="252"/>
+              <w:jc w:val="left"/>
+            </w:pPr>
+            <w:r>
+              <w:rPr>
+                <w:sz w:val="17"/>
+                <w:szCs w:val="17"/>
+              </w:rPr>
+              <w:t xml:space="preserve">Falso positivo (FP) · error tipo I</w:t>
+            </w:r>
+          </w:p>
+        </w:tc>
+        <w:tc>
+          <w:tcPr>
+            <w:tcW w:type="dxa" w:w="1177"/>
+            <w:tcBorders>
+              <w:top w:val="single" w:color="BFBFBF" w:sz="4"/>
+              <w:left w:val="single" w:color="BFBFBF" w:sz="4"/>
+              <w:bottom w:val="single" w:color="BFBFBF" w:sz="4"/>
+              <w:right w:val="single" w:color="BFBFBF" w:sz="4"/>
+            </w:tcBorders>
+            <w:tcMar>
+              <w:top w:type="dxa" w:w="60"/>
+              <w:left w:type="dxa" w:w="100"/>
+              <w:bottom w:type="dxa" w:w="60"/>
+              <w:right w:type="dxa" w:w="100"/>
+            </w:tcMar>
+            <w:vAlign w:val="top"/>
+          </w:tcPr>
+          <w:p>
+            <w:pPr>
+              <w:spacing w:after="0" w:line="252"/>
+              <w:jc w:val="left"/>
+            </w:pPr>
+            <w:r>
+              <w:rPr>
+                <w:sz w:val="17"/>
+                <w:szCs w:val="17"/>
+              </w:rPr>
+              <w:t xml:space="preserve">Sin recargo</w:t>
+            </w:r>
+          </w:p>
+        </w:tc>
+        <w:tc>
+          <w:tcPr>
+            <w:tcW w:type="dxa" w:w="1177"/>
+            <w:tcBorders>
+              <w:top w:val="single" w:color="BFBFBF" w:sz="4"/>
+              <w:left w:val="single" w:color="BFBFBF" w:sz="4"/>
+              <w:bottom w:val="single" w:color="BFBFBF" w:sz="4"/>
+              <w:right w:val="single" w:color="BFBFBF" w:sz="4"/>
+            </w:tcBorders>
+            <w:tcMar>
+              <w:top w:type="dxa" w:w="60"/>
+              <w:left w:type="dxa" w:w="100"/>
+              <w:bottom w:type="dxa" w:w="60"/>
+              <w:right w:type="dxa" w:w="100"/>
+            </w:tcMar>
+            <w:vAlign w:val="top"/>
+          </w:tcPr>
+          <w:p>
+            <w:pPr>
+              <w:spacing w:after="0" w:line="252"/>
+              <w:jc w:val="left"/>
+            </w:pPr>
+            <w:r>
+              <w:rPr>
+                <w:sz w:val="17"/>
+                <w:szCs w:val="17"/>
+              </w:rPr>
+              <w:t xml:space="preserve">Con recargo</w:t>
+            </w:r>
+          </w:p>
+        </w:tc>
+        <w:tc>
+          <w:tcPr>
+            <w:tcW w:type="dxa" w:w="942"/>
+            <w:tcBorders>
+              <w:top w:val="single" w:color="BFBFBF" w:sz="4"/>
+              <w:left w:val="single" w:color="BFBFBF" w:sz="4"/>
+              <w:bottom w:val="single" w:color="BFBFBF" w:sz="4"/>
+              <w:right w:val="single" w:color="BFBFBF" w:sz="4"/>
+            </w:tcBorders>
+            <w:tcMar>
+              <w:top w:type="dxa" w:w="60"/>
+              <w:left w:type="dxa" w:w="100"/>
+              <w:bottom w:type="dxa" w:w="60"/>
+              <w:right w:type="dxa" w:w="100"/>
+            </w:tcMar>
+            <w:vAlign w:val="top"/>
+          </w:tcPr>
+          <w:p>
+            <w:pPr>
+              <w:spacing w:after="0" w:line="252"/>
+              <w:jc w:val="right"/>
+            </w:pPr>
+            <w:r>
+              <w:rPr>
+                <w:sz w:val="17"/>
+                <w:szCs w:val="17"/>
+              </w:rPr>
+              <w:t xml:space="preserve">19.877</w:t>
+            </w:r>
+          </w:p>
+        </w:tc>
+        <w:tc>
+          <w:tcPr>
+            <w:tcW w:type="dxa" w:w="3454"/>
+            <w:tcBorders>
+              <w:top w:val="single" w:color="BFBFBF" w:sz="4"/>
+              <w:left w:val="single" w:color="BFBFBF" w:sz="4"/>
+              <w:bottom w:val="single" w:color="BFBFBF" w:sz="4"/>
+              <w:right w:val="single" w:color="BFBFBF" w:sz="4"/>
+            </w:tcBorders>
+            <w:tcMar>
+              <w:top w:type="dxa" w:w="60"/>
+              <w:left w:type="dxa" w:w="100"/>
+              <w:bottom w:type="dxa" w:w="60"/>
+              <w:right w:type="dxa" w:w="100"/>
+            </w:tcMar>
+            <w:vAlign w:val="top"/>
+          </w:tcPr>
+          <w:p>
+            <w:pPr>
+              <w:spacing w:after="0" w:line="252"/>
+              <w:jc w:val="left"/>
+            </w:pPr>
+            <w:r>
+              <w:rPr>
+                <w:sz w:val="17"/>
+                <w:szCs w:val="17"/>
+              </w:rPr>
+              <w:t xml:space="preserve">Falsa alarma: el modelo avisa un recargo que no ocurre. El pasajero compara o espera sin necesidad.</w:t>
+            </w:r>
+          </w:p>
+        </w:tc>
+      </w:tr>
+      <w:tr>
+        <w:trPr>
+          <w:cantSplit/>
+        </w:trPr>
+        <w:tc>
+          <w:tcPr>
+            <w:tcW w:type="dxa" w:w="2276"/>
+            <w:tcBorders>
+              <w:top w:val="single" w:color="BFBFBF" w:sz="4"/>
+              <w:left w:val="single" w:color="BFBFBF" w:sz="4"/>
+              <w:bottom w:val="single" w:color="BFBFBF" w:sz="4"/>
+              <w:right w:val="single" w:color="BFBFBF" w:sz="4"/>
+            </w:tcBorders>
+            <w:tcMar>
+              <w:top w:type="dxa" w:w="60"/>
+              <w:left w:type="dxa" w:w="100"/>
+              <w:bottom w:type="dxa" w:w="60"/>
+              <w:right w:type="dxa" w:w="100"/>
+            </w:tcMar>
+            <w:vAlign w:val="top"/>
+          </w:tcPr>
+          <w:p>
+            <w:pPr>
+              <w:spacing w:after="0" w:line="252"/>
+              <w:jc w:val="left"/>
+            </w:pPr>
+            <w:r>
+              <w:rPr>
+                <w:sz w:val="17"/>
+                <w:szCs w:val="17"/>
+              </w:rPr>
+              <w:t xml:space="preserve">Falso negativo (FN) · error tipo II</w:t>
+            </w:r>
+          </w:p>
+        </w:tc>
+        <w:tc>
+          <w:tcPr>
+            <w:tcW w:type="dxa" w:w="1177"/>
+            <w:tcBorders>
+              <w:top w:val="single" w:color="BFBFBF" w:sz="4"/>
+              <w:left w:val="single" w:color="BFBFBF" w:sz="4"/>
+              <w:bottom w:val="single" w:color="BFBFBF" w:sz="4"/>
+              <w:right w:val="single" w:color="BFBFBF" w:sz="4"/>
+            </w:tcBorders>
+            <w:tcMar>
+              <w:top w:type="dxa" w:w="60"/>
+              <w:left w:type="dxa" w:w="100"/>
+              <w:bottom w:type="dxa" w:w="60"/>
+              <w:right w:type="dxa" w:w="100"/>
+            </w:tcMar>
+            <w:vAlign w:val="top"/>
+          </w:tcPr>
+          <w:p>
+            <w:pPr>
+              <w:spacing w:after="0" w:line="252"/>
+              <w:jc w:val="left"/>
+            </w:pPr>
+            <w:r>
+              <w:rPr>
+                <w:sz w:val="17"/>
+                <w:szCs w:val="17"/>
+              </w:rPr>
+              <w:t xml:space="preserve">Con recargo</w:t>
+            </w:r>
+          </w:p>
+        </w:tc>
+        <w:tc>
+          <w:tcPr>
+            <w:tcW w:type="dxa" w:w="1177"/>
+            <w:tcBorders>
+              <w:top w:val="single" w:color="BFBFBF" w:sz="4"/>
+              <w:left w:val="single" w:color="BFBFBF" w:sz="4"/>
+              <w:bottom w:val="single" w:color="BFBFBF" w:sz="4"/>
+              <w:right w:val="single" w:color="BFBFBF" w:sz="4"/>
+            </w:tcBorders>
+            <w:tcMar>
+              <w:top w:type="dxa" w:w="60"/>
+              <w:left w:type="dxa" w:w="100"/>
+              <w:bottom w:type="dxa" w:w="60"/>
+              <w:right w:type="dxa" w:w="100"/>
+            </w:tcMar>
+            <w:vAlign w:val="top"/>
+          </w:tcPr>
+          <w:p>
+            <w:pPr>
+              <w:spacing w:after="0" w:line="252"/>
+              <w:jc w:val="left"/>
+            </w:pPr>
+            <w:r>
+              <w:rPr>
+                <w:sz w:val="17"/>
+                <w:szCs w:val="17"/>
+              </w:rPr>
+              <w:t xml:space="preserve">Sin recargo</w:t>
+            </w:r>
+          </w:p>
+        </w:tc>
+        <w:tc>
+          <w:tcPr>
+            <w:tcW w:type="dxa" w:w="942"/>
+            <w:tcBorders>
+              <w:top w:val="single" w:color="BFBFBF" w:sz="4"/>
+              <w:left w:val="single" w:color="BFBFBF" w:sz="4"/>
+              <w:bottom w:val="single" w:color="BFBFBF" w:sz="4"/>
+              <w:right w:val="single" w:color="BFBFBF" w:sz="4"/>
+            </w:tcBorders>
+            <w:tcMar>
+              <w:top w:type="dxa" w:w="60"/>
+              <w:left w:type="dxa" w:w="100"/>
+              <w:bottom w:type="dxa" w:w="60"/>
+              <w:right w:type="dxa" w:w="100"/>
+            </w:tcMar>
+            <w:vAlign w:val="top"/>
+          </w:tcPr>
+          <w:p>
+            <w:pPr>
+              <w:spacing w:after="0" w:line="252"/>
+              <w:jc w:val="right"/>
+            </w:pPr>
+            <w:r>
+              <w:rPr>
+                <w:sz w:val="17"/>
+                <w:szCs w:val="17"/>
+              </w:rPr>
+              <w:t xml:space="preserve">1.937</w:t>
+            </w:r>
+          </w:p>
+        </w:tc>
+        <w:tc>
+          <w:tcPr>
+            <w:tcW w:type="dxa" w:w="3454"/>
+            <w:tcBorders>
+              <w:top w:val="single" w:color="BFBFBF" w:sz="4"/>
+              <w:left w:val="single" w:color="BFBFBF" w:sz="4"/>
+              <w:bottom w:val="single" w:color="BFBFBF" w:sz="4"/>
+              <w:right w:val="single" w:color="BFBFBF" w:sz="4"/>
+            </w:tcBorders>
+            <w:tcMar>
+              <w:top w:type="dxa" w:w="60"/>
+              <w:left w:type="dxa" w:w="100"/>
+              <w:bottom w:type="dxa" w:w="60"/>
+              <w:right w:type="dxa" w:w="100"/>
+            </w:tcMar>
+            <w:vAlign w:val="top"/>
+          </w:tcPr>
+          <w:p>
+            <w:pPr>
+              <w:spacing w:after="0" w:line="252"/>
+              <w:jc w:val="left"/>
+            </w:pPr>
+            <w:r>
+              <w:rPr>
+                <w:sz w:val="17"/>
+                <w:szCs w:val="17"/>
+              </w:rPr>
+              <w:t xml:space="preserve">Recargo no detectado: el pasajero paga el recargo sin haber sido avisado.</w:t>
+            </w:r>
+          </w:p>
+        </w:tc>
+      </w:tr>
+      <w:tr>
+        <w:trPr>
+          <w:cantSplit/>
+        </w:trPr>
+        <w:tc>
+          <w:tcPr>
+            <w:tcW w:type="dxa" w:w="2276"/>
+            <w:tcBorders>
+              <w:top w:val="single" w:color="BFBFBF" w:sz="4"/>
+              <w:left w:val="single" w:color="BFBFBF" w:sz="4"/>
+              <w:bottom w:val="single" w:color="BFBFBF" w:sz="4"/>
+              <w:right w:val="single" w:color="BFBFBF" w:sz="4"/>
+            </w:tcBorders>
+            <w:tcMar>
+              <w:top w:type="dxa" w:w="60"/>
+              <w:left w:type="dxa" w:w="100"/>
+              <w:bottom w:type="dxa" w:w="60"/>
+              <w:right w:type="dxa" w:w="100"/>
+            </w:tcMar>
+            <w:vAlign w:val="top"/>
+          </w:tcPr>
+          <w:p>
+            <w:pPr>
+              <w:spacing w:after="0" w:line="252"/>
+              <w:jc w:val="left"/>
+            </w:pPr>
+            <w:r>
+              <w:rPr>
+                <w:sz w:val="17"/>
+                <w:szCs w:val="17"/>
+              </w:rPr>
+              <w:t xml:space="preserve">Verdadero positivo (VP)</w:t>
+            </w:r>
+          </w:p>
+        </w:tc>
+        <w:tc>
+          <w:tcPr>
+            <w:tcW w:type="dxa" w:w="1177"/>
+            <w:tcBorders>
+              <w:top w:val="single" w:color="BFBFBF" w:sz="4"/>
+              <w:left w:val="single" w:color="BFBFBF" w:sz="4"/>
+              <w:bottom w:val="single" w:color="BFBFBF" w:sz="4"/>
+              <w:right w:val="single" w:color="BFBFBF" w:sz="4"/>
+            </w:tcBorders>
+            <w:tcMar>
+              <w:top w:type="dxa" w:w="60"/>
+              <w:left w:type="dxa" w:w="100"/>
+              <w:bottom w:type="dxa" w:w="60"/>
+              <w:right w:type="dxa" w:w="100"/>
+            </w:tcMar>
+            <w:vAlign w:val="top"/>
+          </w:tcPr>
+          <w:p>
+            <w:pPr>
+              <w:spacing w:after="0" w:line="252"/>
+              <w:jc w:val="left"/>
+            </w:pPr>
+            <w:r>
+              <w:rPr>
+                <w:sz w:val="17"/>
+                <w:szCs w:val="17"/>
+              </w:rPr>
+              <w:t xml:space="preserve">Con recargo</w:t>
+            </w:r>
+          </w:p>
+        </w:tc>
+        <w:tc>
+          <w:tcPr>
+            <w:tcW w:type="dxa" w:w="1177"/>
+            <w:tcBorders>
+              <w:top w:val="single" w:color="BFBFBF" w:sz="4"/>
+              <w:left w:val="single" w:color="BFBFBF" w:sz="4"/>
+              <w:bottom w:val="single" w:color="BFBFBF" w:sz="4"/>
+              <w:right w:val="single" w:color="BFBFBF" w:sz="4"/>
+            </w:tcBorders>
+            <w:tcMar>
+              <w:top w:type="dxa" w:w="60"/>
+              <w:left w:type="dxa" w:w="100"/>
+              <w:bottom w:type="dxa" w:w="60"/>
+              <w:right w:type="dxa" w:w="100"/>
+            </w:tcMar>
+            <w:vAlign w:val="top"/>
+          </w:tcPr>
+          <w:p>
+            <w:pPr>
+              <w:spacing w:after="0" w:line="252"/>
+              <w:jc w:val="left"/>
+            </w:pPr>
+            <w:r>
+              <w:rPr>
+                <w:sz w:val="17"/>
+                <w:szCs w:val="17"/>
+              </w:rPr>
+              <w:t xml:space="preserve">Con recargo</w:t>
+            </w:r>
+          </w:p>
+        </w:tc>
+        <w:tc>
+          <w:tcPr>
+            <w:tcW w:type="dxa" w:w="942"/>
+            <w:tcBorders>
+              <w:top w:val="single" w:color="BFBFBF" w:sz="4"/>
+              <w:left w:val="single" w:color="BFBFBF" w:sz="4"/>
+              <w:bottom w:val="single" w:color="BFBFBF" w:sz="4"/>
+              <w:right w:val="single" w:color="BFBFBF" w:sz="4"/>
+            </w:tcBorders>
+            <w:tcMar>
+              <w:top w:type="dxa" w:w="60"/>
+              <w:left w:type="dxa" w:w="100"/>
+              <w:bottom w:type="dxa" w:w="60"/>
+              <w:right w:type="dxa" w:w="100"/>
+            </w:tcMar>
+            <w:vAlign w:val="top"/>
+          </w:tcPr>
+          <w:p>
+            <w:pPr>
+              <w:spacing w:after="0" w:line="252"/>
+              <w:jc w:val="right"/>
+            </w:pPr>
+            <w:r>
+              <w:rPr>
+                <w:sz w:val="17"/>
+                <w:szCs w:val="17"/>
+              </w:rPr>
+              <w:t xml:space="preserve">2.991</w:t>
+            </w:r>
+          </w:p>
+        </w:tc>
+        <w:tc>
+          <w:tcPr>
+            <w:tcW w:type="dxa" w:w="3454"/>
+            <w:tcBorders>
+              <w:top w:val="single" w:color="BFBFBF" w:sz="4"/>
+              <w:left w:val="single" w:color="BFBFBF" w:sz="4"/>
+              <w:bottom w:val="single" w:color="BFBFBF" w:sz="4"/>
+              <w:right w:val="single" w:color="BFBFBF" w:sz="4"/>
+            </w:tcBorders>
+            <w:tcMar>
+              <w:top w:type="dxa" w:w="60"/>
+              <w:left w:type="dxa" w:w="100"/>
+              <w:bottom w:type="dxa" w:w="60"/>
+              <w:right w:type="dxa" w:w="100"/>
+            </w:tcMar>
+            <w:vAlign w:val="top"/>
+          </w:tcPr>
+          <w:p>
+            <w:pPr>
+              <w:spacing w:after="0" w:line="252"/>
+              <w:jc w:val="left"/>
+            </w:pPr>
+            <w:r>
+              <w:rPr>
+                <w:sz w:val="17"/>
+                <w:szCs w:val="17"/>
+              </w:rPr>
+              <w:t xml:space="preserve">Recargo anticipado correctamente.</w:t>
+            </w:r>
+          </w:p>
+        </w:tc>
+      </w:tr>
+    </w:tbl>
+    <w:p>
+      <w:pPr>
+        <w:spacing w:after="160"/>
+      </w:pPr>
+    </w:p>
+    <w:p>
+      <w:pPr>
+        <w:spacing w:after="120" w:before="0" w:line="276"/>
+        <w:jc w:val="both"/>
+      </w:pPr>
+      <w:r>
+        <w:rPr>
+          <w:b/>
+          <w:bCs/>
+        </w:rPr>
+        <w:t xml:space="preserve">Las métricas salen de estas cuatro casillas:</w:t>
+      </w:r>
+      <w:r>
+        <w:t xml:space="preserve"> exactitud = (VP + VN) / total = (2.991 + 34.590) / 59.395 = </w:t>
+      </w:r>
+      <w:r>
+        <w:rPr>
+          <w:b/>
+          <w:bCs/>
+        </w:rPr>
+        <w:t xml:space="preserve">63,3%</w:t>
+      </w:r>
+      <w:r>
+        <w:t xml:space="preserve">; precisión = VP / (VP + FP) = 2.991 / 22.868 = </w:t>
+      </w:r>
+      <w:r>
+        <w:rPr>
+          <w:b/>
+          <w:bCs/>
+        </w:rPr>
+        <w:t xml:space="preserve">13,1%</w:t>
+      </w:r>
+      <w:r>
+        <w:t xml:space="preserve">; recall = VP / (VP + FN) = 2.991 / 4.928 = </w:t>
+      </w:r>
+      <w:r>
+        <w:rPr>
+          <w:b/>
+          <w:bCs/>
+        </w:rPr>
+        <w:t xml:space="preserve">60,7%</w:t>
+      </w:r>
+      <w:r>
+        <w:t xml:space="preserve">; especificidad = VN / (VN + FP) = </w:t>
+      </w:r>
+      <w:r>
+        <w:rPr>
+          <w:b/>
+          <w:bCs/>
+        </w:rPr>
+        <w:t xml:space="preserve">63,5%</w:t>
+      </w:r>
+      <w:r>
+        <w:t xml:space="preserve">; y la exactitud balanceada es el promedio entre recall y especificidad (</w:t>
+      </w:r>
+      <w:r>
+        <w:rPr>
+          <w:b/>
+          <w:bCs/>
+        </w:rPr>
+        <w:t xml:space="preserve">62,1%</w:t>
+      </w:r>
+      <w:r>
+        <w:t xml:space="preserve">).</w:t>
+      </w:r>
+    </w:p>
+    <w:p>
+      <w:pPr>
+        <w:spacing w:after="120" w:before="0" w:line="276"/>
+        <w:jc w:val="both"/>
+      </w:pPr>
+      <w:r>
+        <w:rPr>
+          <w:b/>
+          <w:bCs/>
+        </w:rPr>
+        <w:t xml:space="preserve">Qué error pesa más.</w:t>
+      </w:r>
+      <w:r>
+        <w:t xml:space="preserve"> Para el pasajero, un falso negativo cuesta dinero (con recargo el viaje sale en promedio un 46% más caro, Entrega 2), mientras que un falso positivo solo le hace perder unos minutos comparando con Uber. Por eso el umbral prioriza detectar recargos (recall alto) aunque aumenten las falsas alarmas. Que los falsos positivos sean muchos en números absolutos (19.877) se explica por el desbalance: hay 54.467 cotizaciones sin recargo y solo 4.928 con recargo.</w:t>
       </w:r>
     </w:p>
     <w:p>

</xml_diff>

<commit_message>
feat(sprint-3): reemplazar K-Means de rutas por familias tarifarias de productos
- K-Means sobre tarifa base y precio por milla de los 12 productos (estimados sin recargo con el entrenamiento)
- Codo y silueta coinciden en k=3 (silueta 0,68): economico, intermedio y premium
- Cada producto de Uber cae en la misma familia que su equivalente de Lyft; explica por que los viajes cortos son caros por milla (H4)
- H6 pasa a confirmada; informe, Colab, PDF, LEEME y README actualizados
- EXPLICACION_KMEANS_PRODUCTOS.md reemplaza a la explicacion de rutas

Co-Authored-By: Claude Opus 5.5 <noreply@anthropic.com>
</commit_message>
<xml_diff>
--- a/Contenido Entrega 3 mejoras/1_Informe/Entrega3_Grupo11.docx
+++ b/Contenido Entrega 3 mejoras/1_Informe/Entrega3_Grupo11.docx
@@ -895,7 +895,7 @@
           <w:sz w:val="22"/>
           <w:szCs w:val="22"/>
         </w:rPr>
-        <w:t xml:space="preserve">6. Análisis complementario: perfiles de rutas (K-Means)</w:t>
+        <w:t xml:space="preserve">6. Análisis complementario: familias tarifarias (K-Means)</w:t>
       </w:r>
     </w:p>
     <w:p>
@@ -1053,7 +1053,7 @@
         <w:t xml:space="preserve">validación</w:t>
       </w:r>
       <w:r>
-        <w:t xml:space="preserve">, sin mirar el período de prueba. Como análisis complementario agrupamos las rutas con K-Means.</w:t>
+        <w:t xml:space="preserve">, sin mirar el período de prueba. Como análisis complementario agrupamos los productos según su tarifa con K-Means.</w:t>
       </w:r>
     </w:p>
     <w:p>
@@ -5010,7 +5010,7 @@
                 <w:sz w:val="17"/>
                 <w:szCs w:val="17"/>
               </w:rPr>
-              <w:t xml:space="preserve">rutas</w:t>
+              <w:t xml:space="preserve">productos</w:t>
             </w:r>
           </w:p>
         </w:tc>
@@ -5041,7 +5041,7 @@
                 <w:sz w:val="17"/>
                 <w:szCs w:val="17"/>
               </w:rPr>
-              <w:t xml:space="preserve">No supervisado: agrupa las rutas sin variable objetivo (objetivo específico de la Entrega 1).</w:t>
+              <w:t xml:space="preserve">No supervisado: agrupa los productos según su tarifa sin variable objetivo (objetivo específico de la Entrega 1).</w:t>
             </w:r>
           </w:p>
         </w:tc>
@@ -5072,7 +5072,7 @@
                 <w:sz w:val="17"/>
                 <w:szCs w:val="17"/>
               </w:rPr>
-              <w:t xml:space="preserve">Perfiles de rutas reconocibles.</w:t>
+              <w:t xml:space="preserve">Familias de tarifa reconocibles.</w:t>
             </w:r>
           </w:p>
         </w:tc>
@@ -25396,7 +25396,7 @@
         <w:spacing w:after="120" w:before="280"/>
       </w:pPr>
       <w:r>
-        <w:t xml:space="preserve">6. Análisis complementario: perfiles de rutas (K-Means)</w:t>
+        <w:t xml:space="preserve">6. Análisis complementario: familias tarifarias (K-Means)</w:t>
       </w:r>
     </w:p>
     <w:p>
@@ -25405,17 +25405,17 @@
         <w:jc w:val="both"/>
       </w:pPr>
       <w:r>
-        <w:t xml:space="preserve">La Entrega 1 planteó identificar segmentos de viajes con comportamiento tarifario similar. Lo abordamos con aprendizaje no supervisado sobre las </w:t>
+        <w:t xml:space="preserve">La Entrega 1 planteó identificar segmentos con comportamiento tarifario similar. Lo abordamos con aprendizaje no supervisado sobre los </w:t>
       </w:r>
       <w:r>
         <w:rPr>
           <w:b/>
           <w:bCs/>
         </w:rPr>
-        <w:t xml:space="preserve">72 rutas</w:t>
-      </w:r>
-      <w:r>
-        <w:t xml:space="preserve"> (pares origen–destino).</w:t>
+        <w:t xml:space="preserve">12 productos</w:t>
+      </w:r>
+      <w:r>
+        <w:t xml:space="preserve"> de Uber y Lyft: ¿se pueden agrupar según cómo arman su precio?</w:t>
       </w:r>
     </w:p>
     <w:p>
@@ -25431,27 +25431,2582 @@
         <w:t xml:space="preserve">Variables.</w:t>
       </w:r>
       <w:r>
-        <w:t xml:space="preserve"> Agrupamos con dos variables estandarizadas: la </w:t>
+        <w:t xml:space="preserve"> Para cada producto ajustamos una recta precio = tarifa base + precio por milla × distancia, con los viajes </w:t>
       </w:r>
       <w:r>
         <w:rPr>
           <w:b/>
           <w:bCs/>
         </w:rPr>
-        <w:t xml:space="preserve">distancia media</w:t>
-      </w:r>
-      <w:r>
-        <w:t xml:space="preserve"> de la ruta y su </w:t>
+        <w:t xml:space="preserve">sin recargo</w:t>
+      </w:r>
+      <w:r>
+        <w:t xml:space="preserve"> del período de entrenamiento (así no se mezcla el efecto del surge ni se usa la prueba). Cada producto queda descripto por dos números: su </w:t>
       </w:r>
       <w:r>
         <w:rPr>
           <w:b/>
           <w:bCs/>
         </w:rPr>
-        <w:t xml:space="preserve">tasa de recargo</w:t>
-      </w:r>
-      <w:r>
-        <w:t xml:space="preserve"> en Lyft. No usamos el precio por milla para agrupar porque está casi determinado por la distancia (correlación -0,98 en escala log, por la tarifa base): duplicaría la distancia. Lo usamos para describir los grupos.</w:t>
+        <w:t xml:space="preserve">tarifa base</w:t>
+      </w:r>
+      <w:r>
+        <w:t xml:space="preserve"> (lo que cuesta subir al auto) y su </w:t>
+      </w:r>
+      <w:r>
+        <w:rPr>
+          <w:b/>
+          <w:bCs/>
+        </w:rPr>
+        <w:t xml:space="preserve">precio por milla</w:t>
+      </w:r>
+      <w:r>
+        <w:t xml:space="preserve">. Se estandarizaron antes de agrupar, porque K-Means usa distancias.</w:t>
+      </w:r>
+    </w:p>
+    <w:tbl>
+      <w:tblPr>
+        <w:tblW w:type="dxa" w:w="9026"/>
+        <w:tblBorders>
+          <w:top w:val="single" w:color="auto" w:sz="4"/>
+          <w:left w:val="single" w:color="auto" w:sz="4"/>
+          <w:bottom w:val="single" w:color="auto" w:sz="4"/>
+          <w:right w:val="single" w:color="auto" w:sz="4"/>
+          <w:insideH w:val="single" w:color="auto" w:sz="4"/>
+          <w:insideV w:val="single" w:color="auto" w:sz="4"/>
+        </w:tblBorders>
+        <w:tblLayout w:type="fixed"/>
+      </w:tblPr>
+      <w:tblGrid>
+        <w:gridCol w:w="1969"/>
+        <w:gridCol w:w="1313"/>
+        <w:gridCol w:w="1477"/>
+        <w:gridCol w:w="1477"/>
+        <w:gridCol w:w="1313"/>
+        <w:gridCol w:w="1477"/>
+      </w:tblGrid>
+      <w:tr>
+        <w:trPr>
+          <w:cantSplit/>
+          <w:tblHeader/>
+        </w:trPr>
+        <w:tc>
+          <w:tcPr>
+            <w:tcW w:type="dxa" w:w="1969"/>
+            <w:tcBorders>
+              <w:top w:val="single" w:color="BFBFBF" w:sz="4"/>
+              <w:left w:val="single" w:color="BFBFBF" w:sz="4"/>
+              <w:bottom w:val="single" w:color="BFBFBF" w:sz="4"/>
+              <w:right w:val="single" w:color="BFBFBF" w:sz="4"/>
+            </w:tcBorders>
+            <w:shd w:fill="F2F2F2" w:color="auto" w:val="clear"/>
+            <w:tcMar>
+              <w:top w:type="dxa" w:w="60"/>
+              <w:left w:type="dxa" w:w="100"/>
+              <w:bottom w:type="dxa" w:w="60"/>
+              <w:right w:type="dxa" w:w="100"/>
+            </w:tcMar>
+            <w:vAlign w:val="top"/>
+          </w:tcPr>
+          <w:p>
+            <w:pPr>
+              <w:spacing w:after="0" w:line="252"/>
+              <w:jc w:val="left"/>
+            </w:pPr>
+            <w:r>
+              <w:rPr>
+                <w:b/>
+                <w:bCs/>
+                <w:sz w:val="17"/>
+                <w:szCs w:val="17"/>
+              </w:rPr>
+              <w:t xml:space="preserve">Producto</w:t>
+            </w:r>
+          </w:p>
+        </w:tc>
+        <w:tc>
+          <w:tcPr>
+            <w:tcW w:type="dxa" w:w="1313"/>
+            <w:tcBorders>
+              <w:top w:val="single" w:color="BFBFBF" w:sz="4"/>
+              <w:left w:val="single" w:color="BFBFBF" w:sz="4"/>
+              <w:bottom w:val="single" w:color="BFBFBF" w:sz="4"/>
+              <w:right w:val="single" w:color="BFBFBF" w:sz="4"/>
+            </w:tcBorders>
+            <w:shd w:fill="F2F2F2" w:color="auto" w:val="clear"/>
+            <w:tcMar>
+              <w:top w:type="dxa" w:w="60"/>
+              <w:left w:type="dxa" w:w="100"/>
+              <w:bottom w:type="dxa" w:w="60"/>
+              <w:right w:type="dxa" w:w="100"/>
+            </w:tcMar>
+            <w:vAlign w:val="top"/>
+          </w:tcPr>
+          <w:p>
+            <w:pPr>
+              <w:spacing w:after="0" w:line="252"/>
+              <w:jc w:val="left"/>
+            </w:pPr>
+            <w:r>
+              <w:rPr>
+                <w:b/>
+                <w:bCs/>
+                <w:sz w:val="17"/>
+                <w:szCs w:val="17"/>
+              </w:rPr>
+              <w:t xml:space="preserve">Plataforma</w:t>
+            </w:r>
+          </w:p>
+        </w:tc>
+        <w:tc>
+          <w:tcPr>
+            <w:tcW w:type="dxa" w:w="1477"/>
+            <w:tcBorders>
+              <w:top w:val="single" w:color="BFBFBF" w:sz="4"/>
+              <w:left w:val="single" w:color="BFBFBF" w:sz="4"/>
+              <w:bottom w:val="single" w:color="BFBFBF" w:sz="4"/>
+              <w:right w:val="single" w:color="BFBFBF" w:sz="4"/>
+            </w:tcBorders>
+            <w:shd w:fill="F2F2F2" w:color="auto" w:val="clear"/>
+            <w:tcMar>
+              <w:top w:type="dxa" w:w="60"/>
+              <w:left w:type="dxa" w:w="100"/>
+              <w:bottom w:type="dxa" w:w="60"/>
+              <w:right w:type="dxa" w:w="100"/>
+            </w:tcMar>
+            <w:vAlign w:val="top"/>
+          </w:tcPr>
+          <w:p>
+            <w:pPr>
+              <w:spacing w:after="0" w:line="252"/>
+              <w:jc w:val="right"/>
+            </w:pPr>
+            <w:r>
+              <w:rPr>
+                <w:b/>
+                <w:bCs/>
+                <w:sz w:val="17"/>
+                <w:szCs w:val="17"/>
+              </w:rPr>
+              <w:t xml:space="preserve">Tarifa base (USD)</w:t>
+            </w:r>
+          </w:p>
+        </w:tc>
+        <w:tc>
+          <w:tcPr>
+            <w:tcW w:type="dxa" w:w="1477"/>
+            <w:tcBorders>
+              <w:top w:val="single" w:color="BFBFBF" w:sz="4"/>
+              <w:left w:val="single" w:color="BFBFBF" w:sz="4"/>
+              <w:bottom w:val="single" w:color="BFBFBF" w:sz="4"/>
+              <w:right w:val="single" w:color="BFBFBF" w:sz="4"/>
+            </w:tcBorders>
+            <w:shd w:fill="F2F2F2" w:color="auto" w:val="clear"/>
+            <w:tcMar>
+              <w:top w:type="dxa" w:w="60"/>
+              <w:left w:type="dxa" w:w="100"/>
+              <w:bottom w:type="dxa" w:w="60"/>
+              <w:right w:type="dxa" w:w="100"/>
+            </w:tcMar>
+            <w:vAlign w:val="top"/>
+          </w:tcPr>
+          <w:p>
+            <w:pPr>
+              <w:spacing w:after="0" w:line="252"/>
+              <w:jc w:val="right"/>
+            </w:pPr>
+            <w:r>
+              <w:rPr>
+                <w:b/>
+                <w:bCs/>
+                <w:sz w:val="17"/>
+                <w:szCs w:val="17"/>
+              </w:rPr>
+              <w:t xml:space="preserve">Por milla (USD)</w:t>
+            </w:r>
+          </w:p>
+        </w:tc>
+        <w:tc>
+          <w:tcPr>
+            <w:tcW w:type="dxa" w:w="1313"/>
+            <w:tcBorders>
+              <w:top w:val="single" w:color="BFBFBF" w:sz="4"/>
+              <w:left w:val="single" w:color="BFBFBF" w:sz="4"/>
+              <w:bottom w:val="single" w:color="BFBFBF" w:sz="4"/>
+              <w:right w:val="single" w:color="BFBFBF" w:sz="4"/>
+            </w:tcBorders>
+            <w:shd w:fill="F2F2F2" w:color="auto" w:val="clear"/>
+            <w:tcMar>
+              <w:top w:type="dxa" w:w="60"/>
+              <w:left w:type="dxa" w:w="100"/>
+              <w:bottom w:type="dxa" w:w="60"/>
+              <w:right w:type="dxa" w:w="100"/>
+            </w:tcMar>
+            <w:vAlign w:val="top"/>
+          </w:tcPr>
+          <w:p>
+            <w:pPr>
+              <w:spacing w:after="0" w:line="252"/>
+              <w:jc w:val="right"/>
+            </w:pPr>
+            <w:r>
+              <w:rPr>
+                <w:b/>
+                <w:bCs/>
+                <w:sz w:val="17"/>
+                <w:szCs w:val="17"/>
+              </w:rPr>
+              <w:t xml:space="preserve">R² de la recta</w:t>
+            </w:r>
+          </w:p>
+        </w:tc>
+        <w:tc>
+          <w:tcPr>
+            <w:tcW w:type="dxa" w:w="1477"/>
+            <w:tcBorders>
+              <w:top w:val="single" w:color="BFBFBF" w:sz="4"/>
+              <w:left w:val="single" w:color="BFBFBF" w:sz="4"/>
+              <w:bottom w:val="single" w:color="BFBFBF" w:sz="4"/>
+              <w:right w:val="single" w:color="BFBFBF" w:sz="4"/>
+            </w:tcBorders>
+            <w:shd w:fill="F2F2F2" w:color="auto" w:val="clear"/>
+            <w:tcMar>
+              <w:top w:type="dxa" w:w="60"/>
+              <w:left w:type="dxa" w:w="100"/>
+              <w:bottom w:type="dxa" w:w="60"/>
+              <w:right w:type="dxa" w:w="100"/>
+            </w:tcMar>
+            <w:vAlign w:val="top"/>
+          </w:tcPr>
+          <w:p>
+            <w:pPr>
+              <w:spacing w:after="0" w:line="252"/>
+              <w:jc w:val="left"/>
+            </w:pPr>
+            <w:r>
+              <w:rPr>
+                <w:b/>
+                <w:bCs/>
+                <w:sz w:val="17"/>
+                <w:szCs w:val="17"/>
+              </w:rPr>
+              <w:t xml:space="preserve">Grupo</w:t>
+            </w:r>
+          </w:p>
+        </w:tc>
+      </w:tr>
+      <w:tr>
+        <w:trPr>
+          <w:cantSplit/>
+        </w:trPr>
+        <w:tc>
+          <w:tcPr>
+            <w:tcW w:type="dxa" w:w="1969"/>
+            <w:tcBorders>
+              <w:top w:val="single" w:color="BFBFBF" w:sz="4"/>
+              <w:left w:val="single" w:color="BFBFBF" w:sz="4"/>
+              <w:bottom w:val="single" w:color="BFBFBF" w:sz="4"/>
+              <w:right w:val="single" w:color="BFBFBF" w:sz="4"/>
+            </w:tcBorders>
+            <w:tcMar>
+              <w:top w:type="dxa" w:w="60"/>
+              <w:left w:type="dxa" w:w="100"/>
+              <w:bottom w:type="dxa" w:w="60"/>
+              <w:right w:type="dxa" w:w="100"/>
+            </w:tcMar>
+            <w:vAlign w:val="top"/>
+          </w:tcPr>
+          <w:p>
+            <w:pPr>
+              <w:spacing w:after="0" w:line="252"/>
+              <w:jc w:val="left"/>
+            </w:pPr>
+            <w:r>
+              <w:rPr>
+                <w:sz w:val="17"/>
+                <w:szCs w:val="17"/>
+              </w:rPr>
+              <w:t xml:space="preserve">Shared</w:t>
+            </w:r>
+          </w:p>
+        </w:tc>
+        <w:tc>
+          <w:tcPr>
+            <w:tcW w:type="dxa" w:w="1313"/>
+            <w:tcBorders>
+              <w:top w:val="single" w:color="BFBFBF" w:sz="4"/>
+              <w:left w:val="single" w:color="BFBFBF" w:sz="4"/>
+              <w:bottom w:val="single" w:color="BFBFBF" w:sz="4"/>
+              <w:right w:val="single" w:color="BFBFBF" w:sz="4"/>
+            </w:tcBorders>
+            <w:tcMar>
+              <w:top w:type="dxa" w:w="60"/>
+              <w:left w:type="dxa" w:w="100"/>
+              <w:bottom w:type="dxa" w:w="60"/>
+              <w:right w:type="dxa" w:w="100"/>
+            </w:tcMar>
+            <w:vAlign w:val="top"/>
+          </w:tcPr>
+          <w:p>
+            <w:pPr>
+              <w:spacing w:after="0" w:line="252"/>
+              <w:jc w:val="left"/>
+            </w:pPr>
+            <w:r>
+              <w:rPr>
+                <w:sz w:val="17"/>
+                <w:szCs w:val="17"/>
+              </w:rPr>
+              <w:t xml:space="preserve">Lyft</w:t>
+            </w:r>
+          </w:p>
+        </w:tc>
+        <w:tc>
+          <w:tcPr>
+            <w:tcW w:type="dxa" w:w="1477"/>
+            <w:tcBorders>
+              <w:top w:val="single" w:color="BFBFBF" w:sz="4"/>
+              <w:left w:val="single" w:color="BFBFBF" w:sz="4"/>
+              <w:bottom w:val="single" w:color="BFBFBF" w:sz="4"/>
+              <w:right w:val="single" w:color="BFBFBF" w:sz="4"/>
+            </w:tcBorders>
+            <w:tcMar>
+              <w:top w:type="dxa" w:w="60"/>
+              <w:left w:type="dxa" w:w="100"/>
+              <w:bottom w:type="dxa" w:w="60"/>
+              <w:right w:type="dxa" w:w="100"/>
+            </w:tcMar>
+            <w:vAlign w:val="top"/>
+          </w:tcPr>
+          <w:p>
+            <w:pPr>
+              <w:spacing w:after="0" w:line="252"/>
+              <w:jc w:val="right"/>
+            </w:pPr>
+            <w:r>
+              <w:rPr>
+                <w:sz w:val="17"/>
+                <w:szCs w:val="17"/>
+              </w:rPr>
+              <w:t xml:space="preserve">3,30</w:t>
+            </w:r>
+          </w:p>
+        </w:tc>
+        <w:tc>
+          <w:tcPr>
+            <w:tcW w:type="dxa" w:w="1477"/>
+            <w:tcBorders>
+              <w:top w:val="single" w:color="BFBFBF" w:sz="4"/>
+              <w:left w:val="single" w:color="BFBFBF" w:sz="4"/>
+              <w:bottom w:val="single" w:color="BFBFBF" w:sz="4"/>
+              <w:right w:val="single" w:color="BFBFBF" w:sz="4"/>
+            </w:tcBorders>
+            <w:tcMar>
+              <w:top w:type="dxa" w:w="60"/>
+              <w:left w:type="dxa" w:w="100"/>
+              <w:bottom w:type="dxa" w:w="60"/>
+              <w:right w:type="dxa" w:w="100"/>
+            </w:tcMar>
+            <w:vAlign w:val="top"/>
+          </w:tcPr>
+          <w:p>
+            <w:pPr>
+              <w:spacing w:after="0" w:line="252"/>
+              <w:jc w:val="right"/>
+            </w:pPr>
+            <w:r>
+              <w:rPr>
+                <w:sz w:val="17"/>
+                <w:szCs w:val="17"/>
+              </w:rPr>
+              <w:t xml:space="preserve">1,25</w:t>
+            </w:r>
+          </w:p>
+        </w:tc>
+        <w:tc>
+          <w:tcPr>
+            <w:tcW w:type="dxa" w:w="1313"/>
+            <w:tcBorders>
+              <w:top w:val="single" w:color="BFBFBF" w:sz="4"/>
+              <w:left w:val="single" w:color="BFBFBF" w:sz="4"/>
+              <w:bottom w:val="single" w:color="BFBFBF" w:sz="4"/>
+              <w:right w:val="single" w:color="BFBFBF" w:sz="4"/>
+            </w:tcBorders>
+            <w:tcMar>
+              <w:top w:type="dxa" w:w="60"/>
+              <w:left w:type="dxa" w:w="100"/>
+              <w:bottom w:type="dxa" w:w="60"/>
+              <w:right w:type="dxa" w:w="100"/>
+            </w:tcMar>
+            <w:vAlign w:val="top"/>
+          </w:tcPr>
+          <w:p>
+            <w:pPr>
+              <w:spacing w:after="0" w:line="252"/>
+              <w:jc w:val="right"/>
+            </w:pPr>
+            <w:r>
+              <w:rPr>
+                <w:sz w:val="17"/>
+                <w:szCs w:val="17"/>
+              </w:rPr>
+              <w:t xml:space="preserve">0,41</w:t>
+            </w:r>
+          </w:p>
+        </w:tc>
+        <w:tc>
+          <w:tcPr>
+            <w:tcW w:type="dxa" w:w="1477"/>
+            <w:tcBorders>
+              <w:top w:val="single" w:color="BFBFBF" w:sz="4"/>
+              <w:left w:val="single" w:color="BFBFBF" w:sz="4"/>
+              <w:bottom w:val="single" w:color="BFBFBF" w:sz="4"/>
+              <w:right w:val="single" w:color="BFBFBF" w:sz="4"/>
+            </w:tcBorders>
+            <w:tcMar>
+              <w:top w:type="dxa" w:w="60"/>
+              <w:left w:type="dxa" w:w="100"/>
+              <w:bottom w:type="dxa" w:w="60"/>
+              <w:right w:type="dxa" w:w="100"/>
+            </w:tcMar>
+            <w:vAlign w:val="top"/>
+          </w:tcPr>
+          <w:p>
+            <w:pPr>
+              <w:spacing w:after="0" w:line="252"/>
+              <w:jc w:val="left"/>
+            </w:pPr>
+            <w:r>
+              <w:rPr>
+                <w:sz w:val="17"/>
+                <w:szCs w:val="17"/>
+              </w:rPr>
+              <w:t xml:space="preserve">Económico</w:t>
+            </w:r>
+          </w:p>
+        </w:tc>
+      </w:tr>
+      <w:tr>
+        <w:trPr>
+          <w:cantSplit/>
+        </w:trPr>
+        <w:tc>
+          <w:tcPr>
+            <w:tcW w:type="dxa" w:w="1969"/>
+            <w:tcBorders>
+              <w:top w:val="single" w:color="BFBFBF" w:sz="4"/>
+              <w:left w:val="single" w:color="BFBFBF" w:sz="4"/>
+              <w:bottom w:val="single" w:color="BFBFBF" w:sz="4"/>
+              <w:right w:val="single" w:color="BFBFBF" w:sz="4"/>
+            </w:tcBorders>
+            <w:tcMar>
+              <w:top w:type="dxa" w:w="60"/>
+              <w:left w:type="dxa" w:w="100"/>
+              <w:bottom w:type="dxa" w:w="60"/>
+              <w:right w:type="dxa" w:w="100"/>
+            </w:tcMar>
+            <w:vAlign w:val="top"/>
+          </w:tcPr>
+          <w:p>
+            <w:pPr>
+              <w:spacing w:after="0" w:line="252"/>
+              <w:jc w:val="left"/>
+            </w:pPr>
+            <w:r>
+              <w:rPr>
+                <w:sz w:val="17"/>
+                <w:szCs w:val="17"/>
+              </w:rPr>
+              <w:t xml:space="preserve">Lyft</w:t>
+            </w:r>
+          </w:p>
+        </w:tc>
+        <w:tc>
+          <w:tcPr>
+            <w:tcW w:type="dxa" w:w="1313"/>
+            <w:tcBorders>
+              <w:top w:val="single" w:color="BFBFBF" w:sz="4"/>
+              <w:left w:val="single" w:color="BFBFBF" w:sz="4"/>
+              <w:bottom w:val="single" w:color="BFBFBF" w:sz="4"/>
+              <w:right w:val="single" w:color="BFBFBF" w:sz="4"/>
+            </w:tcBorders>
+            <w:tcMar>
+              <w:top w:type="dxa" w:w="60"/>
+              <w:left w:type="dxa" w:w="100"/>
+              <w:bottom w:type="dxa" w:w="60"/>
+              <w:right w:type="dxa" w:w="100"/>
+            </w:tcMar>
+            <w:vAlign w:val="top"/>
+          </w:tcPr>
+          <w:p>
+            <w:pPr>
+              <w:spacing w:after="0" w:line="252"/>
+              <w:jc w:val="left"/>
+            </w:pPr>
+            <w:r>
+              <w:rPr>
+                <w:sz w:val="17"/>
+                <w:szCs w:val="17"/>
+              </w:rPr>
+              <w:t xml:space="preserve">Lyft</w:t>
+            </w:r>
+          </w:p>
+        </w:tc>
+        <w:tc>
+          <w:tcPr>
+            <w:tcW w:type="dxa" w:w="1477"/>
+            <w:tcBorders>
+              <w:top w:val="single" w:color="BFBFBF" w:sz="4"/>
+              <w:left w:val="single" w:color="BFBFBF" w:sz="4"/>
+              <w:bottom w:val="single" w:color="BFBFBF" w:sz="4"/>
+              <w:right w:val="single" w:color="BFBFBF" w:sz="4"/>
+            </w:tcBorders>
+            <w:tcMar>
+              <w:top w:type="dxa" w:w="60"/>
+              <w:left w:type="dxa" w:w="100"/>
+              <w:bottom w:type="dxa" w:w="60"/>
+              <w:right w:type="dxa" w:w="100"/>
+            </w:tcMar>
+            <w:vAlign w:val="top"/>
+          </w:tcPr>
+          <w:p>
+            <w:pPr>
+              <w:spacing w:after="0" w:line="252"/>
+              <w:jc w:val="right"/>
+            </w:pPr>
+            <w:r>
+              <w:rPr>
+                <w:sz w:val="17"/>
+                <w:szCs w:val="17"/>
+              </w:rPr>
+              <w:t xml:space="preserve">5,59</w:t>
+            </w:r>
+          </w:p>
+        </w:tc>
+        <w:tc>
+          <w:tcPr>
+            <w:tcW w:type="dxa" w:w="1477"/>
+            <w:tcBorders>
+              <w:top w:val="single" w:color="BFBFBF" w:sz="4"/>
+              <w:left w:val="single" w:color="BFBFBF" w:sz="4"/>
+              <w:bottom w:val="single" w:color="BFBFBF" w:sz="4"/>
+              <w:right w:val="single" w:color="BFBFBF" w:sz="4"/>
+            </w:tcBorders>
+            <w:tcMar>
+              <w:top w:type="dxa" w:w="60"/>
+              <w:left w:type="dxa" w:w="100"/>
+              <w:bottom w:type="dxa" w:w="60"/>
+              <w:right w:type="dxa" w:w="100"/>
+            </w:tcMar>
+            <w:vAlign w:val="top"/>
+          </w:tcPr>
+          <w:p>
+            <w:pPr>
+              <w:spacing w:after="0" w:line="252"/>
+              <w:jc w:val="right"/>
+            </w:pPr>
+            <w:r>
+              <w:rPr>
+                <w:sz w:val="17"/>
+                <w:szCs w:val="17"/>
+              </w:rPr>
+              <w:t xml:space="preserve">1,70</w:t>
+            </w:r>
+          </w:p>
+        </w:tc>
+        <w:tc>
+          <w:tcPr>
+            <w:tcW w:type="dxa" w:w="1313"/>
+            <w:tcBorders>
+              <w:top w:val="single" w:color="BFBFBF" w:sz="4"/>
+              <w:left w:val="single" w:color="BFBFBF" w:sz="4"/>
+              <w:bottom w:val="single" w:color="BFBFBF" w:sz="4"/>
+              <w:right w:val="single" w:color="BFBFBF" w:sz="4"/>
+            </w:tcBorders>
+            <w:tcMar>
+              <w:top w:type="dxa" w:w="60"/>
+              <w:left w:type="dxa" w:w="100"/>
+              <w:bottom w:type="dxa" w:w="60"/>
+              <w:right w:type="dxa" w:w="100"/>
+            </w:tcMar>
+            <w:vAlign w:val="top"/>
+          </w:tcPr>
+          <w:p>
+            <w:pPr>
+              <w:spacing w:after="0" w:line="252"/>
+              <w:jc w:val="right"/>
+            </w:pPr>
+            <w:r>
+              <w:rPr>
+                <w:sz w:val="17"/>
+                <w:szCs w:val="17"/>
+              </w:rPr>
+              <w:t xml:space="preserve">0,81</w:t>
+            </w:r>
+          </w:p>
+        </w:tc>
+        <w:tc>
+          <w:tcPr>
+            <w:tcW w:type="dxa" w:w="1477"/>
+            <w:tcBorders>
+              <w:top w:val="single" w:color="BFBFBF" w:sz="4"/>
+              <w:left w:val="single" w:color="BFBFBF" w:sz="4"/>
+              <w:bottom w:val="single" w:color="BFBFBF" w:sz="4"/>
+              <w:right w:val="single" w:color="BFBFBF" w:sz="4"/>
+            </w:tcBorders>
+            <w:tcMar>
+              <w:top w:type="dxa" w:w="60"/>
+              <w:left w:type="dxa" w:w="100"/>
+              <w:bottom w:type="dxa" w:w="60"/>
+              <w:right w:type="dxa" w:w="100"/>
+            </w:tcMar>
+            <w:vAlign w:val="top"/>
+          </w:tcPr>
+          <w:p>
+            <w:pPr>
+              <w:spacing w:after="0" w:line="252"/>
+              <w:jc w:val="left"/>
+            </w:pPr>
+            <w:r>
+              <w:rPr>
+                <w:sz w:val="17"/>
+                <w:szCs w:val="17"/>
+              </w:rPr>
+              <w:t xml:space="preserve">Económico</w:t>
+            </w:r>
+          </w:p>
+        </w:tc>
+      </w:tr>
+      <w:tr>
+        <w:trPr>
+          <w:cantSplit/>
+        </w:trPr>
+        <w:tc>
+          <w:tcPr>
+            <w:tcW w:type="dxa" w:w="1969"/>
+            <w:tcBorders>
+              <w:top w:val="single" w:color="BFBFBF" w:sz="4"/>
+              <w:left w:val="single" w:color="BFBFBF" w:sz="4"/>
+              <w:bottom w:val="single" w:color="BFBFBF" w:sz="4"/>
+              <w:right w:val="single" w:color="BFBFBF" w:sz="4"/>
+            </w:tcBorders>
+            <w:tcMar>
+              <w:top w:type="dxa" w:w="60"/>
+              <w:left w:type="dxa" w:w="100"/>
+              <w:bottom w:type="dxa" w:w="60"/>
+              <w:right w:type="dxa" w:w="100"/>
+            </w:tcMar>
+            <w:vAlign w:val="top"/>
+          </w:tcPr>
+          <w:p>
+            <w:pPr>
+              <w:spacing w:after="0" w:line="252"/>
+              <w:jc w:val="left"/>
+            </w:pPr>
+            <w:r>
+              <w:rPr>
+                <w:sz w:val="17"/>
+                <w:szCs w:val="17"/>
+              </w:rPr>
+              <w:t xml:space="preserve">UberPool</w:t>
+            </w:r>
+          </w:p>
+        </w:tc>
+        <w:tc>
+          <w:tcPr>
+            <w:tcW w:type="dxa" w:w="1313"/>
+            <w:tcBorders>
+              <w:top w:val="single" w:color="BFBFBF" w:sz="4"/>
+              <w:left w:val="single" w:color="BFBFBF" w:sz="4"/>
+              <w:bottom w:val="single" w:color="BFBFBF" w:sz="4"/>
+              <w:right w:val="single" w:color="BFBFBF" w:sz="4"/>
+            </w:tcBorders>
+            <w:tcMar>
+              <w:top w:type="dxa" w:w="60"/>
+              <w:left w:type="dxa" w:w="100"/>
+              <w:bottom w:type="dxa" w:w="60"/>
+              <w:right w:type="dxa" w:w="100"/>
+            </w:tcMar>
+            <w:vAlign w:val="top"/>
+          </w:tcPr>
+          <w:p>
+            <w:pPr>
+              <w:spacing w:after="0" w:line="252"/>
+              <w:jc w:val="left"/>
+            </w:pPr>
+            <w:r>
+              <w:rPr>
+                <w:sz w:val="17"/>
+                <w:szCs w:val="17"/>
+              </w:rPr>
+              <w:t xml:space="preserve">Uber</w:t>
+            </w:r>
+          </w:p>
+        </w:tc>
+        <w:tc>
+          <w:tcPr>
+            <w:tcW w:type="dxa" w:w="1477"/>
+            <w:tcBorders>
+              <w:top w:val="single" w:color="BFBFBF" w:sz="4"/>
+              <w:left w:val="single" w:color="BFBFBF" w:sz="4"/>
+              <w:bottom w:val="single" w:color="BFBFBF" w:sz="4"/>
+              <w:right w:val="single" w:color="BFBFBF" w:sz="4"/>
+            </w:tcBorders>
+            <w:tcMar>
+              <w:top w:type="dxa" w:w="60"/>
+              <w:left w:type="dxa" w:w="100"/>
+              <w:bottom w:type="dxa" w:w="60"/>
+              <w:right w:type="dxa" w:w="100"/>
+            </w:tcMar>
+            <w:vAlign w:val="top"/>
+          </w:tcPr>
+          <w:p>
+            <w:pPr>
+              <w:spacing w:after="0" w:line="252"/>
+              <w:jc w:val="right"/>
+            </w:pPr>
+            <w:r>
+              <w:rPr>
+                <w:sz w:val="17"/>
+                <w:szCs w:val="17"/>
+              </w:rPr>
+              <w:t xml:space="preserve">6,13</w:t>
+            </w:r>
+          </w:p>
+        </w:tc>
+        <w:tc>
+          <w:tcPr>
+            <w:tcW w:type="dxa" w:w="1477"/>
+            <w:tcBorders>
+              <w:top w:val="single" w:color="BFBFBF" w:sz="4"/>
+              <w:left w:val="single" w:color="BFBFBF" w:sz="4"/>
+              <w:bottom w:val="single" w:color="BFBFBF" w:sz="4"/>
+              <w:right w:val="single" w:color="BFBFBF" w:sz="4"/>
+            </w:tcBorders>
+            <w:tcMar>
+              <w:top w:type="dxa" w:w="60"/>
+              <w:left w:type="dxa" w:w="100"/>
+              <w:bottom w:type="dxa" w:w="60"/>
+              <w:right w:type="dxa" w:w="100"/>
+            </w:tcMar>
+            <w:vAlign w:val="top"/>
+          </w:tcPr>
+          <w:p>
+            <w:pPr>
+              <w:spacing w:after="0" w:line="252"/>
+              <w:jc w:val="right"/>
+            </w:pPr>
+            <w:r>
+              <w:rPr>
+                <w:sz w:val="17"/>
+                <w:szCs w:val="17"/>
+              </w:rPr>
+              <w:t xml:space="preserve">1,20</w:t>
+            </w:r>
+          </w:p>
+        </w:tc>
+        <w:tc>
+          <w:tcPr>
+            <w:tcW w:type="dxa" w:w="1313"/>
+            <w:tcBorders>
+              <w:top w:val="single" w:color="BFBFBF" w:sz="4"/>
+              <w:left w:val="single" w:color="BFBFBF" w:sz="4"/>
+              <w:bottom w:val="single" w:color="BFBFBF" w:sz="4"/>
+              <w:right w:val="single" w:color="BFBFBF" w:sz="4"/>
+            </w:tcBorders>
+            <w:tcMar>
+              <w:top w:type="dxa" w:w="60"/>
+              <w:left w:type="dxa" w:w="100"/>
+              <w:bottom w:type="dxa" w:w="60"/>
+              <w:right w:type="dxa" w:w="100"/>
+            </w:tcMar>
+            <w:vAlign w:val="top"/>
+          </w:tcPr>
+          <w:p>
+            <w:pPr>
+              <w:spacing w:after="0" w:line="252"/>
+              <w:jc w:val="right"/>
+            </w:pPr>
+            <w:r>
+              <w:rPr>
+                <w:sz w:val="17"/>
+                <w:szCs w:val="17"/>
+              </w:rPr>
+              <w:t xml:space="preserve">0,45</w:t>
+            </w:r>
+          </w:p>
+        </w:tc>
+        <w:tc>
+          <w:tcPr>
+            <w:tcW w:type="dxa" w:w="1477"/>
+            <w:tcBorders>
+              <w:top w:val="single" w:color="BFBFBF" w:sz="4"/>
+              <w:left w:val="single" w:color="BFBFBF" w:sz="4"/>
+              <w:bottom w:val="single" w:color="BFBFBF" w:sz="4"/>
+              <w:right w:val="single" w:color="BFBFBF" w:sz="4"/>
+            </w:tcBorders>
+            <w:tcMar>
+              <w:top w:type="dxa" w:w="60"/>
+              <w:left w:type="dxa" w:w="100"/>
+              <w:bottom w:type="dxa" w:w="60"/>
+              <w:right w:type="dxa" w:w="100"/>
+            </w:tcMar>
+            <w:vAlign w:val="top"/>
+          </w:tcPr>
+          <w:p>
+            <w:pPr>
+              <w:spacing w:after="0" w:line="252"/>
+              <w:jc w:val="left"/>
+            </w:pPr>
+            <w:r>
+              <w:rPr>
+                <w:sz w:val="17"/>
+                <w:szCs w:val="17"/>
+              </w:rPr>
+              <w:t xml:space="preserve">Económico</w:t>
+            </w:r>
+          </w:p>
+        </w:tc>
+      </w:tr>
+      <w:tr>
+        <w:trPr>
+          <w:cantSplit/>
+        </w:trPr>
+        <w:tc>
+          <w:tcPr>
+            <w:tcW w:type="dxa" w:w="1969"/>
+            <w:tcBorders>
+              <w:top w:val="single" w:color="BFBFBF" w:sz="4"/>
+              <w:left w:val="single" w:color="BFBFBF" w:sz="4"/>
+              <w:bottom w:val="single" w:color="BFBFBF" w:sz="4"/>
+              <w:right w:val="single" w:color="BFBFBF" w:sz="4"/>
+            </w:tcBorders>
+            <w:tcMar>
+              <w:top w:type="dxa" w:w="60"/>
+              <w:left w:type="dxa" w:w="100"/>
+              <w:bottom w:type="dxa" w:w="60"/>
+              <w:right w:type="dxa" w:w="100"/>
+            </w:tcMar>
+            <w:vAlign w:val="top"/>
+          </w:tcPr>
+          <w:p>
+            <w:pPr>
+              <w:spacing w:after="0" w:line="252"/>
+              <w:jc w:val="left"/>
+            </w:pPr>
+            <w:r>
+              <w:rPr>
+                <w:sz w:val="17"/>
+                <w:szCs w:val="17"/>
+              </w:rPr>
+              <w:t xml:space="preserve">WAV</w:t>
+            </w:r>
+          </w:p>
+        </w:tc>
+        <w:tc>
+          <w:tcPr>
+            <w:tcW w:type="dxa" w:w="1313"/>
+            <w:tcBorders>
+              <w:top w:val="single" w:color="BFBFBF" w:sz="4"/>
+              <w:left w:val="single" w:color="BFBFBF" w:sz="4"/>
+              <w:bottom w:val="single" w:color="BFBFBF" w:sz="4"/>
+              <w:right w:val="single" w:color="BFBFBF" w:sz="4"/>
+            </w:tcBorders>
+            <w:tcMar>
+              <w:top w:type="dxa" w:w="60"/>
+              <w:left w:type="dxa" w:w="100"/>
+              <w:bottom w:type="dxa" w:w="60"/>
+              <w:right w:type="dxa" w:w="100"/>
+            </w:tcMar>
+            <w:vAlign w:val="top"/>
+          </w:tcPr>
+          <w:p>
+            <w:pPr>
+              <w:spacing w:after="0" w:line="252"/>
+              <w:jc w:val="left"/>
+            </w:pPr>
+            <w:r>
+              <w:rPr>
+                <w:sz w:val="17"/>
+                <w:szCs w:val="17"/>
+              </w:rPr>
+              <w:t xml:space="preserve">Uber</w:t>
+            </w:r>
+          </w:p>
+        </w:tc>
+        <w:tc>
+          <w:tcPr>
+            <w:tcW w:type="dxa" w:w="1477"/>
+            <w:tcBorders>
+              <w:top w:val="single" w:color="BFBFBF" w:sz="4"/>
+              <w:left w:val="single" w:color="BFBFBF" w:sz="4"/>
+              <w:bottom w:val="single" w:color="BFBFBF" w:sz="4"/>
+              <w:right w:val="single" w:color="BFBFBF" w:sz="4"/>
+            </w:tcBorders>
+            <w:tcMar>
+              <w:top w:type="dxa" w:w="60"/>
+              <w:left w:type="dxa" w:w="100"/>
+              <w:bottom w:type="dxa" w:w="60"/>
+              <w:right w:type="dxa" w:w="100"/>
+            </w:tcMar>
+            <w:vAlign w:val="top"/>
+          </w:tcPr>
+          <w:p>
+            <w:pPr>
+              <w:spacing w:after="0" w:line="252"/>
+              <w:jc w:val="right"/>
+            </w:pPr>
+            <w:r>
+              <w:rPr>
+                <w:sz w:val="17"/>
+                <w:szCs w:val="17"/>
+              </w:rPr>
+              <w:t xml:space="preserve">6,39</w:t>
+            </w:r>
+          </w:p>
+        </w:tc>
+        <w:tc>
+          <w:tcPr>
+            <w:tcW w:type="dxa" w:w="1477"/>
+            <w:tcBorders>
+              <w:top w:val="single" w:color="BFBFBF" w:sz="4"/>
+              <w:left w:val="single" w:color="BFBFBF" w:sz="4"/>
+              <w:bottom w:val="single" w:color="BFBFBF" w:sz="4"/>
+              <w:right w:val="single" w:color="BFBFBF" w:sz="4"/>
+            </w:tcBorders>
+            <w:tcMar>
+              <w:top w:type="dxa" w:w="60"/>
+              <w:left w:type="dxa" w:w="100"/>
+              <w:bottom w:type="dxa" w:w="60"/>
+              <w:right w:type="dxa" w:w="100"/>
+            </w:tcMar>
+            <w:vAlign w:val="top"/>
+          </w:tcPr>
+          <w:p>
+            <w:pPr>
+              <w:spacing w:after="0" w:line="252"/>
+              <w:jc w:val="right"/>
+            </w:pPr>
+            <w:r>
+              <w:rPr>
+                <w:sz w:val="17"/>
+                <w:szCs w:val="17"/>
+              </w:rPr>
+              <w:t xml:space="preserve">1,54</w:t>
+            </w:r>
+          </w:p>
+        </w:tc>
+        <w:tc>
+          <w:tcPr>
+            <w:tcW w:type="dxa" w:w="1313"/>
+            <w:tcBorders>
+              <w:top w:val="single" w:color="BFBFBF" w:sz="4"/>
+              <w:left w:val="single" w:color="BFBFBF" w:sz="4"/>
+              <w:bottom w:val="single" w:color="BFBFBF" w:sz="4"/>
+              <w:right w:val="single" w:color="BFBFBF" w:sz="4"/>
+            </w:tcBorders>
+            <w:tcMar>
+              <w:top w:type="dxa" w:w="60"/>
+              <w:left w:type="dxa" w:w="100"/>
+              <w:bottom w:type="dxa" w:w="60"/>
+              <w:right w:type="dxa" w:w="100"/>
+            </w:tcMar>
+            <w:vAlign w:val="top"/>
+          </w:tcPr>
+          <w:p>
+            <w:pPr>
+              <w:spacing w:after="0" w:line="252"/>
+              <w:jc w:val="right"/>
+            </w:pPr>
+            <w:r>
+              <w:rPr>
+                <w:sz w:val="17"/>
+                <w:szCs w:val="17"/>
+              </w:rPr>
+              <w:t xml:space="preserve">0,54</w:t>
+            </w:r>
+          </w:p>
+        </w:tc>
+        <w:tc>
+          <w:tcPr>
+            <w:tcW w:type="dxa" w:w="1477"/>
+            <w:tcBorders>
+              <w:top w:val="single" w:color="BFBFBF" w:sz="4"/>
+              <w:left w:val="single" w:color="BFBFBF" w:sz="4"/>
+              <w:bottom w:val="single" w:color="BFBFBF" w:sz="4"/>
+              <w:right w:val="single" w:color="BFBFBF" w:sz="4"/>
+            </w:tcBorders>
+            <w:tcMar>
+              <w:top w:type="dxa" w:w="60"/>
+              <w:left w:type="dxa" w:w="100"/>
+              <w:bottom w:type="dxa" w:w="60"/>
+              <w:right w:type="dxa" w:w="100"/>
+            </w:tcMar>
+            <w:vAlign w:val="top"/>
+          </w:tcPr>
+          <w:p>
+            <w:pPr>
+              <w:spacing w:after="0" w:line="252"/>
+              <w:jc w:val="left"/>
+            </w:pPr>
+            <w:r>
+              <w:rPr>
+                <w:sz w:val="17"/>
+                <w:szCs w:val="17"/>
+              </w:rPr>
+              <w:t xml:space="preserve">Económico</w:t>
+            </w:r>
+          </w:p>
+        </w:tc>
+      </w:tr>
+      <w:tr>
+        <w:trPr>
+          <w:cantSplit/>
+        </w:trPr>
+        <w:tc>
+          <w:tcPr>
+            <w:tcW w:type="dxa" w:w="1969"/>
+            <w:tcBorders>
+              <w:top w:val="single" w:color="BFBFBF" w:sz="4"/>
+              <w:left w:val="single" w:color="BFBFBF" w:sz="4"/>
+              <w:bottom w:val="single" w:color="BFBFBF" w:sz="4"/>
+              <w:right w:val="single" w:color="BFBFBF" w:sz="4"/>
+            </w:tcBorders>
+            <w:tcMar>
+              <w:top w:type="dxa" w:w="60"/>
+              <w:left w:type="dxa" w:w="100"/>
+              <w:bottom w:type="dxa" w:w="60"/>
+              <w:right w:type="dxa" w:w="100"/>
+            </w:tcMar>
+            <w:vAlign w:val="top"/>
+          </w:tcPr>
+          <w:p>
+            <w:pPr>
+              <w:spacing w:after="0" w:line="252"/>
+              <w:jc w:val="left"/>
+            </w:pPr>
+            <w:r>
+              <w:rPr>
+                <w:sz w:val="17"/>
+                <w:szCs w:val="17"/>
+              </w:rPr>
+              <w:t xml:space="preserve">UberX</w:t>
+            </w:r>
+          </w:p>
+        </w:tc>
+        <w:tc>
+          <w:tcPr>
+            <w:tcW w:type="dxa" w:w="1313"/>
+            <w:tcBorders>
+              <w:top w:val="single" w:color="BFBFBF" w:sz="4"/>
+              <w:left w:val="single" w:color="BFBFBF" w:sz="4"/>
+              <w:bottom w:val="single" w:color="BFBFBF" w:sz="4"/>
+              <w:right w:val="single" w:color="BFBFBF" w:sz="4"/>
+            </w:tcBorders>
+            <w:tcMar>
+              <w:top w:type="dxa" w:w="60"/>
+              <w:left w:type="dxa" w:w="100"/>
+              <w:bottom w:type="dxa" w:w="60"/>
+              <w:right w:type="dxa" w:w="100"/>
+            </w:tcMar>
+            <w:vAlign w:val="top"/>
+          </w:tcPr>
+          <w:p>
+            <w:pPr>
+              <w:spacing w:after="0" w:line="252"/>
+              <w:jc w:val="left"/>
+            </w:pPr>
+            <w:r>
+              <w:rPr>
+                <w:sz w:val="17"/>
+                <w:szCs w:val="17"/>
+              </w:rPr>
+              <w:t xml:space="preserve">Uber</w:t>
+            </w:r>
+          </w:p>
+        </w:tc>
+        <w:tc>
+          <w:tcPr>
+            <w:tcW w:type="dxa" w:w="1477"/>
+            <w:tcBorders>
+              <w:top w:val="single" w:color="BFBFBF" w:sz="4"/>
+              <w:left w:val="single" w:color="BFBFBF" w:sz="4"/>
+              <w:bottom w:val="single" w:color="BFBFBF" w:sz="4"/>
+              <w:right w:val="single" w:color="BFBFBF" w:sz="4"/>
+            </w:tcBorders>
+            <w:tcMar>
+              <w:top w:type="dxa" w:w="60"/>
+              <w:left w:type="dxa" w:w="100"/>
+              <w:bottom w:type="dxa" w:w="60"/>
+              <w:right w:type="dxa" w:w="100"/>
+            </w:tcMar>
+            <w:vAlign w:val="top"/>
+          </w:tcPr>
+          <w:p>
+            <w:pPr>
+              <w:spacing w:after="0" w:line="252"/>
+              <w:jc w:val="right"/>
+            </w:pPr>
+            <w:r>
+              <w:rPr>
+                <w:sz w:val="17"/>
+                <w:szCs w:val="17"/>
+              </w:rPr>
+              <w:t xml:space="preserve">6,40</w:t>
+            </w:r>
+          </w:p>
+        </w:tc>
+        <w:tc>
+          <w:tcPr>
+            <w:tcW w:type="dxa" w:w="1477"/>
+            <w:tcBorders>
+              <w:top w:val="single" w:color="BFBFBF" w:sz="4"/>
+              <w:left w:val="single" w:color="BFBFBF" w:sz="4"/>
+              <w:bottom w:val="single" w:color="BFBFBF" w:sz="4"/>
+              <w:right w:val="single" w:color="BFBFBF" w:sz="4"/>
+            </w:tcBorders>
+            <w:tcMar>
+              <w:top w:type="dxa" w:w="60"/>
+              <w:left w:type="dxa" w:w="100"/>
+              <w:bottom w:type="dxa" w:w="60"/>
+              <w:right w:type="dxa" w:w="100"/>
+            </w:tcMar>
+            <w:vAlign w:val="top"/>
+          </w:tcPr>
+          <w:p>
+            <w:pPr>
+              <w:spacing w:after="0" w:line="252"/>
+              <w:jc w:val="right"/>
+            </w:pPr>
+            <w:r>
+              <w:rPr>
+                <w:sz w:val="17"/>
+                <w:szCs w:val="17"/>
+              </w:rPr>
+              <w:t xml:space="preserve">1,53</w:t>
+            </w:r>
+          </w:p>
+        </w:tc>
+        <w:tc>
+          <w:tcPr>
+            <w:tcW w:type="dxa" w:w="1313"/>
+            <w:tcBorders>
+              <w:top w:val="single" w:color="BFBFBF" w:sz="4"/>
+              <w:left w:val="single" w:color="BFBFBF" w:sz="4"/>
+              <w:bottom w:val="single" w:color="BFBFBF" w:sz="4"/>
+              <w:right w:val="single" w:color="BFBFBF" w:sz="4"/>
+            </w:tcBorders>
+            <w:tcMar>
+              <w:top w:type="dxa" w:w="60"/>
+              <w:left w:type="dxa" w:w="100"/>
+              <w:bottom w:type="dxa" w:w="60"/>
+              <w:right w:type="dxa" w:w="100"/>
+            </w:tcMar>
+            <w:vAlign w:val="top"/>
+          </w:tcPr>
+          <w:p>
+            <w:pPr>
+              <w:spacing w:after="0" w:line="252"/>
+              <w:jc w:val="right"/>
+            </w:pPr>
+            <w:r>
+              <w:rPr>
+                <w:sz w:val="17"/>
+                <w:szCs w:val="17"/>
+              </w:rPr>
+              <w:t xml:space="preserve">0,54</w:t>
+            </w:r>
+          </w:p>
+        </w:tc>
+        <w:tc>
+          <w:tcPr>
+            <w:tcW w:type="dxa" w:w="1477"/>
+            <w:tcBorders>
+              <w:top w:val="single" w:color="BFBFBF" w:sz="4"/>
+              <w:left w:val="single" w:color="BFBFBF" w:sz="4"/>
+              <w:bottom w:val="single" w:color="BFBFBF" w:sz="4"/>
+              <w:right w:val="single" w:color="BFBFBF" w:sz="4"/>
+            </w:tcBorders>
+            <w:tcMar>
+              <w:top w:type="dxa" w:w="60"/>
+              <w:left w:type="dxa" w:w="100"/>
+              <w:bottom w:type="dxa" w:w="60"/>
+              <w:right w:type="dxa" w:w="100"/>
+            </w:tcMar>
+            <w:vAlign w:val="top"/>
+          </w:tcPr>
+          <w:p>
+            <w:pPr>
+              <w:spacing w:after="0" w:line="252"/>
+              <w:jc w:val="left"/>
+            </w:pPr>
+            <w:r>
+              <w:rPr>
+                <w:sz w:val="17"/>
+                <w:szCs w:val="17"/>
+              </w:rPr>
+              <w:t xml:space="preserve">Económico</w:t>
+            </w:r>
+          </w:p>
+        </w:tc>
+      </w:tr>
+      <w:tr>
+        <w:trPr>
+          <w:cantSplit/>
+        </w:trPr>
+        <w:tc>
+          <w:tcPr>
+            <w:tcW w:type="dxa" w:w="1969"/>
+            <w:tcBorders>
+              <w:top w:val="single" w:color="BFBFBF" w:sz="4"/>
+              <w:left w:val="single" w:color="BFBFBF" w:sz="4"/>
+              <w:bottom w:val="single" w:color="BFBFBF" w:sz="4"/>
+              <w:right w:val="single" w:color="BFBFBF" w:sz="4"/>
+            </w:tcBorders>
+            <w:tcMar>
+              <w:top w:type="dxa" w:w="60"/>
+              <w:left w:type="dxa" w:w="100"/>
+              <w:bottom w:type="dxa" w:w="60"/>
+              <w:right w:type="dxa" w:w="100"/>
+            </w:tcMar>
+            <w:vAlign w:val="top"/>
+          </w:tcPr>
+          <w:p>
+            <w:pPr>
+              <w:spacing w:after="0" w:line="252"/>
+              <w:jc w:val="left"/>
+            </w:pPr>
+            <w:r>
+              <w:rPr>
+                <w:sz w:val="17"/>
+                <w:szCs w:val="17"/>
+              </w:rPr>
+              <w:t xml:space="preserve">Lyft XL</w:t>
+            </w:r>
+          </w:p>
+        </w:tc>
+        <w:tc>
+          <w:tcPr>
+            <w:tcW w:type="dxa" w:w="1313"/>
+            <w:tcBorders>
+              <w:top w:val="single" w:color="BFBFBF" w:sz="4"/>
+              <w:left w:val="single" w:color="BFBFBF" w:sz="4"/>
+              <w:bottom w:val="single" w:color="BFBFBF" w:sz="4"/>
+              <w:right w:val="single" w:color="BFBFBF" w:sz="4"/>
+            </w:tcBorders>
+            <w:tcMar>
+              <w:top w:type="dxa" w:w="60"/>
+              <w:left w:type="dxa" w:w="100"/>
+              <w:bottom w:type="dxa" w:w="60"/>
+              <w:right w:type="dxa" w:w="100"/>
+            </w:tcMar>
+            <w:vAlign w:val="top"/>
+          </w:tcPr>
+          <w:p>
+            <w:pPr>
+              <w:spacing w:after="0" w:line="252"/>
+              <w:jc w:val="left"/>
+            </w:pPr>
+            <w:r>
+              <w:rPr>
+                <w:sz w:val="17"/>
+                <w:szCs w:val="17"/>
+              </w:rPr>
+              <w:t xml:space="preserve">Lyft</w:t>
+            </w:r>
+          </w:p>
+        </w:tc>
+        <w:tc>
+          <w:tcPr>
+            <w:tcW w:type="dxa" w:w="1477"/>
+            <w:tcBorders>
+              <w:top w:val="single" w:color="BFBFBF" w:sz="4"/>
+              <w:left w:val="single" w:color="BFBFBF" w:sz="4"/>
+              <w:bottom w:val="single" w:color="BFBFBF" w:sz="4"/>
+              <w:right w:val="single" w:color="BFBFBF" w:sz="4"/>
+            </w:tcBorders>
+            <w:tcMar>
+              <w:top w:type="dxa" w:w="60"/>
+              <w:left w:type="dxa" w:w="100"/>
+              <w:bottom w:type="dxa" w:w="60"/>
+              <w:right w:type="dxa" w:w="100"/>
+            </w:tcMar>
+            <w:vAlign w:val="top"/>
+          </w:tcPr>
+          <w:p>
+            <w:pPr>
+              <w:spacing w:after="0" w:line="252"/>
+              <w:jc w:val="right"/>
+            </w:pPr>
+            <w:r>
+              <w:rPr>
+                <w:sz w:val="17"/>
+                <w:szCs w:val="17"/>
+              </w:rPr>
+              <w:t xml:space="preserve">7,79</w:t>
+            </w:r>
+          </w:p>
+        </w:tc>
+        <w:tc>
+          <w:tcPr>
+            <w:tcW w:type="dxa" w:w="1477"/>
+            <w:tcBorders>
+              <w:top w:val="single" w:color="BFBFBF" w:sz="4"/>
+              <w:left w:val="single" w:color="BFBFBF" w:sz="4"/>
+              <w:bottom w:val="single" w:color="BFBFBF" w:sz="4"/>
+              <w:right w:val="single" w:color="BFBFBF" w:sz="4"/>
+            </w:tcBorders>
+            <w:tcMar>
+              <w:top w:type="dxa" w:w="60"/>
+              <w:left w:type="dxa" w:w="100"/>
+              <w:bottom w:type="dxa" w:w="60"/>
+              <w:right w:type="dxa" w:w="100"/>
+            </w:tcMar>
+            <w:vAlign w:val="top"/>
+          </w:tcPr>
+          <w:p>
+            <w:pPr>
+              <w:spacing w:after="0" w:line="252"/>
+              <w:jc w:val="right"/>
+            </w:pPr>
+            <w:r>
+              <w:rPr>
+                <w:sz w:val="17"/>
+                <w:szCs w:val="17"/>
+              </w:rPr>
+              <w:t xml:space="preserve">3,19</w:t>
+            </w:r>
+          </w:p>
+        </w:tc>
+        <w:tc>
+          <w:tcPr>
+            <w:tcW w:type="dxa" w:w="1313"/>
+            <w:tcBorders>
+              <w:top w:val="single" w:color="BFBFBF" w:sz="4"/>
+              <w:left w:val="single" w:color="BFBFBF" w:sz="4"/>
+              <w:bottom w:val="single" w:color="BFBFBF" w:sz="4"/>
+              <w:right w:val="single" w:color="BFBFBF" w:sz="4"/>
+            </w:tcBorders>
+            <w:tcMar>
+              <w:top w:type="dxa" w:w="60"/>
+              <w:left w:type="dxa" w:w="100"/>
+              <w:bottom w:type="dxa" w:w="60"/>
+              <w:right w:type="dxa" w:w="100"/>
+            </w:tcMar>
+            <w:vAlign w:val="top"/>
+          </w:tcPr>
+          <w:p>
+            <w:pPr>
+              <w:spacing w:after="0" w:line="252"/>
+              <w:jc w:val="right"/>
+            </w:pPr>
+            <w:r>
+              <w:rPr>
+                <w:sz w:val="17"/>
+                <w:szCs w:val="17"/>
+              </w:rPr>
+              <w:t xml:space="preserve">0,86</w:t>
+            </w:r>
+          </w:p>
+        </w:tc>
+        <w:tc>
+          <w:tcPr>
+            <w:tcW w:type="dxa" w:w="1477"/>
+            <w:tcBorders>
+              <w:top w:val="single" w:color="BFBFBF" w:sz="4"/>
+              <w:left w:val="single" w:color="BFBFBF" w:sz="4"/>
+              <w:bottom w:val="single" w:color="BFBFBF" w:sz="4"/>
+              <w:right w:val="single" w:color="BFBFBF" w:sz="4"/>
+            </w:tcBorders>
+            <w:tcMar>
+              <w:top w:type="dxa" w:w="60"/>
+              <w:left w:type="dxa" w:w="100"/>
+              <w:bottom w:type="dxa" w:w="60"/>
+              <w:right w:type="dxa" w:w="100"/>
+            </w:tcMar>
+            <w:vAlign w:val="top"/>
+          </w:tcPr>
+          <w:p>
+            <w:pPr>
+              <w:spacing w:after="0" w:line="252"/>
+              <w:jc w:val="left"/>
+            </w:pPr>
+            <w:r>
+              <w:rPr>
+                <w:sz w:val="17"/>
+                <w:szCs w:val="17"/>
+              </w:rPr>
+              <w:t xml:space="preserve">Intermedio</w:t>
+            </w:r>
+          </w:p>
+        </w:tc>
+      </w:tr>
+      <w:tr>
+        <w:trPr>
+          <w:cantSplit/>
+        </w:trPr>
+        <w:tc>
+          <w:tcPr>
+            <w:tcW w:type="dxa" w:w="1969"/>
+            <w:tcBorders>
+              <w:top w:val="single" w:color="BFBFBF" w:sz="4"/>
+              <w:left w:val="single" w:color="BFBFBF" w:sz="4"/>
+              <w:bottom w:val="single" w:color="BFBFBF" w:sz="4"/>
+              <w:right w:val="single" w:color="BFBFBF" w:sz="4"/>
+            </w:tcBorders>
+            <w:tcMar>
+              <w:top w:type="dxa" w:w="60"/>
+              <w:left w:type="dxa" w:w="100"/>
+              <w:bottom w:type="dxa" w:w="60"/>
+              <w:right w:type="dxa" w:w="100"/>
+            </w:tcMar>
+            <w:vAlign w:val="top"/>
+          </w:tcPr>
+          <w:p>
+            <w:pPr>
+              <w:spacing w:after="0" w:line="252"/>
+              <w:jc w:val="left"/>
+            </w:pPr>
+            <w:r>
+              <w:rPr>
+                <w:sz w:val="17"/>
+                <w:szCs w:val="17"/>
+              </w:rPr>
+              <w:t xml:space="preserve">Lux</w:t>
+            </w:r>
+          </w:p>
+        </w:tc>
+        <w:tc>
+          <w:tcPr>
+            <w:tcW w:type="dxa" w:w="1313"/>
+            <w:tcBorders>
+              <w:top w:val="single" w:color="BFBFBF" w:sz="4"/>
+              <w:left w:val="single" w:color="BFBFBF" w:sz="4"/>
+              <w:bottom w:val="single" w:color="BFBFBF" w:sz="4"/>
+              <w:right w:val="single" w:color="BFBFBF" w:sz="4"/>
+            </w:tcBorders>
+            <w:tcMar>
+              <w:top w:type="dxa" w:w="60"/>
+              <w:left w:type="dxa" w:w="100"/>
+              <w:bottom w:type="dxa" w:w="60"/>
+              <w:right w:type="dxa" w:w="100"/>
+            </w:tcMar>
+            <w:vAlign w:val="top"/>
+          </w:tcPr>
+          <w:p>
+            <w:pPr>
+              <w:spacing w:after="0" w:line="252"/>
+              <w:jc w:val="left"/>
+            </w:pPr>
+            <w:r>
+              <w:rPr>
+                <w:sz w:val="17"/>
+                <w:szCs w:val="17"/>
+              </w:rPr>
+              <w:t xml:space="preserve">Lyft</w:t>
+            </w:r>
+          </w:p>
+        </w:tc>
+        <w:tc>
+          <w:tcPr>
+            <w:tcW w:type="dxa" w:w="1477"/>
+            <w:tcBorders>
+              <w:top w:val="single" w:color="BFBFBF" w:sz="4"/>
+              <w:left w:val="single" w:color="BFBFBF" w:sz="4"/>
+              <w:bottom w:val="single" w:color="BFBFBF" w:sz="4"/>
+              <w:right w:val="single" w:color="BFBFBF" w:sz="4"/>
+            </w:tcBorders>
+            <w:tcMar>
+              <w:top w:type="dxa" w:w="60"/>
+              <w:left w:type="dxa" w:w="100"/>
+              <w:bottom w:type="dxa" w:w="60"/>
+              <w:right w:type="dxa" w:w="100"/>
+            </w:tcMar>
+            <w:vAlign w:val="top"/>
+          </w:tcPr>
+          <w:p>
+            <w:pPr>
+              <w:spacing w:after="0" w:line="252"/>
+              <w:jc w:val="right"/>
+            </w:pPr>
+            <w:r>
+              <w:rPr>
+                <w:sz w:val="17"/>
+                <w:szCs w:val="17"/>
+              </w:rPr>
+              <w:t xml:space="preserve">8,76</w:t>
+            </w:r>
+          </w:p>
+        </w:tc>
+        <w:tc>
+          <w:tcPr>
+            <w:tcW w:type="dxa" w:w="1477"/>
+            <w:tcBorders>
+              <w:top w:val="single" w:color="BFBFBF" w:sz="4"/>
+              <w:left w:val="single" w:color="BFBFBF" w:sz="4"/>
+              <w:bottom w:val="single" w:color="BFBFBF" w:sz="4"/>
+              <w:right w:val="single" w:color="BFBFBF" w:sz="4"/>
+            </w:tcBorders>
+            <w:tcMar>
+              <w:top w:type="dxa" w:w="60"/>
+              <w:left w:type="dxa" w:w="100"/>
+              <w:bottom w:type="dxa" w:w="60"/>
+              <w:right w:type="dxa" w:w="100"/>
+            </w:tcMar>
+            <w:vAlign w:val="top"/>
+          </w:tcPr>
+          <w:p>
+            <w:pPr>
+              <w:spacing w:after="0" w:line="252"/>
+              <w:jc w:val="right"/>
+            </w:pPr>
+            <w:r>
+              <w:rPr>
+                <w:sz w:val="17"/>
+                <w:szCs w:val="17"/>
+              </w:rPr>
+              <w:t xml:space="preserve">3,84</w:t>
+            </w:r>
+          </w:p>
+        </w:tc>
+        <w:tc>
+          <w:tcPr>
+            <w:tcW w:type="dxa" w:w="1313"/>
+            <w:tcBorders>
+              <w:top w:val="single" w:color="BFBFBF" w:sz="4"/>
+              <w:left w:val="single" w:color="BFBFBF" w:sz="4"/>
+              <w:bottom w:val="single" w:color="BFBFBF" w:sz="4"/>
+              <w:right w:val="single" w:color="BFBFBF" w:sz="4"/>
+            </w:tcBorders>
+            <w:tcMar>
+              <w:top w:type="dxa" w:w="60"/>
+              <w:left w:type="dxa" w:w="100"/>
+              <w:bottom w:type="dxa" w:w="60"/>
+              <w:right w:type="dxa" w:w="100"/>
+            </w:tcMar>
+            <w:vAlign w:val="top"/>
+          </w:tcPr>
+          <w:p>
+            <w:pPr>
+              <w:spacing w:after="0" w:line="252"/>
+              <w:jc w:val="right"/>
+            </w:pPr>
+            <w:r>
+              <w:rPr>
+                <w:sz w:val="17"/>
+                <w:szCs w:val="17"/>
+              </w:rPr>
+              <w:t xml:space="preserve">0,89</w:t>
+            </w:r>
+          </w:p>
+        </w:tc>
+        <w:tc>
+          <w:tcPr>
+            <w:tcW w:type="dxa" w:w="1477"/>
+            <w:tcBorders>
+              <w:top w:val="single" w:color="BFBFBF" w:sz="4"/>
+              <w:left w:val="single" w:color="BFBFBF" w:sz="4"/>
+              <w:bottom w:val="single" w:color="BFBFBF" w:sz="4"/>
+              <w:right w:val="single" w:color="BFBFBF" w:sz="4"/>
+            </w:tcBorders>
+            <w:tcMar>
+              <w:top w:type="dxa" w:w="60"/>
+              <w:left w:type="dxa" w:w="100"/>
+              <w:bottom w:type="dxa" w:w="60"/>
+              <w:right w:type="dxa" w:w="100"/>
+            </w:tcMar>
+            <w:vAlign w:val="top"/>
+          </w:tcPr>
+          <w:p>
+            <w:pPr>
+              <w:spacing w:after="0" w:line="252"/>
+              <w:jc w:val="left"/>
+            </w:pPr>
+            <w:r>
+              <w:rPr>
+                <w:sz w:val="17"/>
+                <w:szCs w:val="17"/>
+              </w:rPr>
+              <w:t xml:space="preserve">Intermedio</w:t>
+            </w:r>
+          </w:p>
+        </w:tc>
+      </w:tr>
+      <w:tr>
+        <w:trPr>
+          <w:cantSplit/>
+        </w:trPr>
+        <w:tc>
+          <w:tcPr>
+            <w:tcW w:type="dxa" w:w="1969"/>
+            <w:tcBorders>
+              <w:top w:val="single" w:color="BFBFBF" w:sz="4"/>
+              <w:left w:val="single" w:color="BFBFBF" w:sz="4"/>
+              <w:bottom w:val="single" w:color="BFBFBF" w:sz="4"/>
+              <w:right w:val="single" w:color="BFBFBF" w:sz="4"/>
+            </w:tcBorders>
+            <w:tcMar>
+              <w:top w:type="dxa" w:w="60"/>
+              <w:left w:type="dxa" w:w="100"/>
+              <w:bottom w:type="dxa" w:w="60"/>
+              <w:right w:type="dxa" w:w="100"/>
+            </w:tcMar>
+            <w:vAlign w:val="top"/>
+          </w:tcPr>
+          <w:p>
+            <w:pPr>
+              <w:spacing w:after="0" w:line="252"/>
+              <w:jc w:val="left"/>
+            </w:pPr>
+            <w:r>
+              <w:rPr>
+                <w:sz w:val="17"/>
+                <w:szCs w:val="17"/>
+              </w:rPr>
+              <w:t xml:space="preserve">UberXL</w:t>
+            </w:r>
+          </w:p>
+        </w:tc>
+        <w:tc>
+          <w:tcPr>
+            <w:tcW w:type="dxa" w:w="1313"/>
+            <w:tcBorders>
+              <w:top w:val="single" w:color="BFBFBF" w:sz="4"/>
+              <w:left w:val="single" w:color="BFBFBF" w:sz="4"/>
+              <w:bottom w:val="single" w:color="BFBFBF" w:sz="4"/>
+              <w:right w:val="single" w:color="BFBFBF" w:sz="4"/>
+            </w:tcBorders>
+            <w:tcMar>
+              <w:top w:type="dxa" w:w="60"/>
+              <w:left w:type="dxa" w:w="100"/>
+              <w:bottom w:type="dxa" w:w="60"/>
+              <w:right w:type="dxa" w:w="100"/>
+            </w:tcMar>
+            <w:vAlign w:val="top"/>
+          </w:tcPr>
+          <w:p>
+            <w:pPr>
+              <w:spacing w:after="0" w:line="252"/>
+              <w:jc w:val="left"/>
+            </w:pPr>
+            <w:r>
+              <w:rPr>
+                <w:sz w:val="17"/>
+                <w:szCs w:val="17"/>
+              </w:rPr>
+              <w:t xml:space="preserve">Uber</w:t>
+            </w:r>
+          </w:p>
+        </w:tc>
+        <w:tc>
+          <w:tcPr>
+            <w:tcW w:type="dxa" w:w="1477"/>
+            <w:tcBorders>
+              <w:top w:val="single" w:color="BFBFBF" w:sz="4"/>
+              <w:left w:val="single" w:color="BFBFBF" w:sz="4"/>
+              <w:bottom w:val="single" w:color="BFBFBF" w:sz="4"/>
+              <w:right w:val="single" w:color="BFBFBF" w:sz="4"/>
+            </w:tcBorders>
+            <w:tcMar>
+              <w:top w:type="dxa" w:w="60"/>
+              <w:left w:type="dxa" w:w="100"/>
+              <w:bottom w:type="dxa" w:w="60"/>
+              <w:right w:type="dxa" w:w="100"/>
+            </w:tcMar>
+            <w:vAlign w:val="top"/>
+          </w:tcPr>
+          <w:p>
+            <w:pPr>
+              <w:spacing w:after="0" w:line="252"/>
+              <w:jc w:val="right"/>
+            </w:pPr>
+            <w:r>
+              <w:rPr>
+                <w:sz w:val="17"/>
+                <w:szCs w:val="17"/>
+              </w:rPr>
+              <w:t xml:space="preserve">9,07</w:t>
+            </w:r>
+          </w:p>
+        </w:tc>
+        <w:tc>
+          <w:tcPr>
+            <w:tcW w:type="dxa" w:w="1477"/>
+            <w:tcBorders>
+              <w:top w:val="single" w:color="BFBFBF" w:sz="4"/>
+              <w:left w:val="single" w:color="BFBFBF" w:sz="4"/>
+              <w:bottom w:val="single" w:color="BFBFBF" w:sz="4"/>
+              <w:right w:val="single" w:color="BFBFBF" w:sz="4"/>
+            </w:tcBorders>
+            <w:tcMar>
+              <w:top w:type="dxa" w:w="60"/>
+              <w:left w:type="dxa" w:w="100"/>
+              <w:bottom w:type="dxa" w:w="60"/>
+              <w:right w:type="dxa" w:w="100"/>
+            </w:tcMar>
+            <w:vAlign w:val="top"/>
+          </w:tcPr>
+          <w:p>
+            <w:pPr>
+              <w:spacing w:after="0" w:line="252"/>
+              <w:jc w:val="right"/>
+            </w:pPr>
+            <w:r>
+              <w:rPr>
+                <w:sz w:val="17"/>
+                <w:szCs w:val="17"/>
+              </w:rPr>
+              <w:t xml:space="preserve">3,01</w:t>
+            </w:r>
+          </w:p>
+        </w:tc>
+        <w:tc>
+          <w:tcPr>
+            <w:tcW w:type="dxa" w:w="1313"/>
+            <w:tcBorders>
+              <w:top w:val="single" w:color="BFBFBF" w:sz="4"/>
+              <w:left w:val="single" w:color="BFBFBF" w:sz="4"/>
+              <w:bottom w:val="single" w:color="BFBFBF" w:sz="4"/>
+              <w:right w:val="single" w:color="BFBFBF" w:sz="4"/>
+            </w:tcBorders>
+            <w:tcMar>
+              <w:top w:type="dxa" w:w="60"/>
+              <w:left w:type="dxa" w:w="100"/>
+              <w:bottom w:type="dxa" w:w="60"/>
+              <w:right w:type="dxa" w:w="100"/>
+            </w:tcMar>
+            <w:vAlign w:val="top"/>
+          </w:tcPr>
+          <w:p>
+            <w:pPr>
+              <w:spacing w:after="0" w:line="252"/>
+              <w:jc w:val="right"/>
+            </w:pPr>
+            <w:r>
+              <w:rPr>
+                <w:sz w:val="17"/>
+                <w:szCs w:val="17"/>
+              </w:rPr>
+              <w:t xml:space="preserve">0,62</w:t>
+            </w:r>
+          </w:p>
+        </w:tc>
+        <w:tc>
+          <w:tcPr>
+            <w:tcW w:type="dxa" w:w="1477"/>
+            <w:tcBorders>
+              <w:top w:val="single" w:color="BFBFBF" w:sz="4"/>
+              <w:left w:val="single" w:color="BFBFBF" w:sz="4"/>
+              <w:bottom w:val="single" w:color="BFBFBF" w:sz="4"/>
+              <w:right w:val="single" w:color="BFBFBF" w:sz="4"/>
+            </w:tcBorders>
+            <w:tcMar>
+              <w:top w:type="dxa" w:w="60"/>
+              <w:left w:type="dxa" w:w="100"/>
+              <w:bottom w:type="dxa" w:w="60"/>
+              <w:right w:type="dxa" w:w="100"/>
+            </w:tcMar>
+            <w:vAlign w:val="top"/>
+          </w:tcPr>
+          <w:p>
+            <w:pPr>
+              <w:spacing w:after="0" w:line="252"/>
+              <w:jc w:val="left"/>
+            </w:pPr>
+            <w:r>
+              <w:rPr>
+                <w:sz w:val="17"/>
+                <w:szCs w:val="17"/>
+              </w:rPr>
+              <w:t xml:space="preserve">Intermedio</w:t>
+            </w:r>
+          </w:p>
+        </w:tc>
+      </w:tr>
+      <w:tr>
+        <w:trPr>
+          <w:cantSplit/>
+        </w:trPr>
+        <w:tc>
+          <w:tcPr>
+            <w:tcW w:type="dxa" w:w="1969"/>
+            <w:tcBorders>
+              <w:top w:val="single" w:color="BFBFBF" w:sz="4"/>
+              <w:left w:val="single" w:color="BFBFBF" w:sz="4"/>
+              <w:bottom w:val="single" w:color="BFBFBF" w:sz="4"/>
+              <w:right w:val="single" w:color="BFBFBF" w:sz="4"/>
+            </w:tcBorders>
+            <w:tcMar>
+              <w:top w:type="dxa" w:w="60"/>
+              <w:left w:type="dxa" w:w="100"/>
+              <w:bottom w:type="dxa" w:w="60"/>
+              <w:right w:type="dxa" w:w="100"/>
+            </w:tcMar>
+            <w:vAlign w:val="top"/>
+          </w:tcPr>
+          <w:p>
+            <w:pPr>
+              <w:spacing w:after="0" w:line="252"/>
+              <w:jc w:val="left"/>
+            </w:pPr>
+            <w:r>
+              <w:rPr>
+                <w:sz w:val="17"/>
+                <w:szCs w:val="17"/>
+              </w:rPr>
+              <w:t xml:space="preserve">Black</w:t>
+            </w:r>
+          </w:p>
+        </w:tc>
+        <w:tc>
+          <w:tcPr>
+            <w:tcW w:type="dxa" w:w="1313"/>
+            <w:tcBorders>
+              <w:top w:val="single" w:color="BFBFBF" w:sz="4"/>
+              <w:left w:val="single" w:color="BFBFBF" w:sz="4"/>
+              <w:bottom w:val="single" w:color="BFBFBF" w:sz="4"/>
+              <w:right w:val="single" w:color="BFBFBF" w:sz="4"/>
+            </w:tcBorders>
+            <w:tcMar>
+              <w:top w:type="dxa" w:w="60"/>
+              <w:left w:type="dxa" w:w="100"/>
+              <w:bottom w:type="dxa" w:w="60"/>
+              <w:right w:type="dxa" w:w="100"/>
+            </w:tcMar>
+            <w:vAlign w:val="top"/>
+          </w:tcPr>
+          <w:p>
+            <w:pPr>
+              <w:spacing w:after="0" w:line="252"/>
+              <w:jc w:val="left"/>
+            </w:pPr>
+            <w:r>
+              <w:rPr>
+                <w:sz w:val="17"/>
+                <w:szCs w:val="17"/>
+              </w:rPr>
+              <w:t xml:space="preserve">Uber</w:t>
+            </w:r>
+          </w:p>
+        </w:tc>
+        <w:tc>
+          <w:tcPr>
+            <w:tcW w:type="dxa" w:w="1477"/>
+            <w:tcBorders>
+              <w:top w:val="single" w:color="BFBFBF" w:sz="4"/>
+              <w:left w:val="single" w:color="BFBFBF" w:sz="4"/>
+              <w:bottom w:val="single" w:color="BFBFBF" w:sz="4"/>
+              <w:right w:val="single" w:color="BFBFBF" w:sz="4"/>
+            </w:tcBorders>
+            <w:tcMar>
+              <w:top w:type="dxa" w:w="60"/>
+              <w:left w:type="dxa" w:w="100"/>
+              <w:bottom w:type="dxa" w:w="60"/>
+              <w:right w:type="dxa" w:w="100"/>
+            </w:tcMar>
+            <w:vAlign w:val="top"/>
+          </w:tcPr>
+          <w:p>
+            <w:pPr>
+              <w:spacing w:after="0" w:line="252"/>
+              <w:jc w:val="right"/>
+            </w:pPr>
+            <w:r>
+              <w:rPr>
+                <w:sz w:val="17"/>
+                <w:szCs w:val="17"/>
+              </w:rPr>
+              <w:t xml:space="preserve">12,11</w:t>
+            </w:r>
+          </w:p>
+        </w:tc>
+        <w:tc>
+          <w:tcPr>
+            <w:tcW w:type="dxa" w:w="1477"/>
+            <w:tcBorders>
+              <w:top w:val="single" w:color="BFBFBF" w:sz="4"/>
+              <w:left w:val="single" w:color="BFBFBF" w:sz="4"/>
+              <w:bottom w:val="single" w:color="BFBFBF" w:sz="4"/>
+              <w:right w:val="single" w:color="BFBFBF" w:sz="4"/>
+            </w:tcBorders>
+            <w:tcMar>
+              <w:top w:type="dxa" w:w="60"/>
+              <w:left w:type="dxa" w:w="100"/>
+              <w:bottom w:type="dxa" w:w="60"/>
+              <w:right w:type="dxa" w:w="100"/>
+            </w:tcMar>
+            <w:vAlign w:val="top"/>
+          </w:tcPr>
+          <w:p>
+            <w:pPr>
+              <w:spacing w:after="0" w:line="252"/>
+              <w:jc w:val="right"/>
+            </w:pPr>
+            <w:r>
+              <w:rPr>
+                <w:sz w:val="17"/>
+                <w:szCs w:val="17"/>
+              </w:rPr>
+              <w:t xml:space="preserve">3,84</w:t>
+            </w:r>
+          </w:p>
+        </w:tc>
+        <w:tc>
+          <w:tcPr>
+            <w:tcW w:type="dxa" w:w="1313"/>
+            <w:tcBorders>
+              <w:top w:val="single" w:color="BFBFBF" w:sz="4"/>
+              <w:left w:val="single" w:color="BFBFBF" w:sz="4"/>
+              <w:bottom w:val="single" w:color="BFBFBF" w:sz="4"/>
+              <w:right w:val="single" w:color="BFBFBF" w:sz="4"/>
+            </w:tcBorders>
+            <w:tcMar>
+              <w:top w:type="dxa" w:w="60"/>
+              <w:left w:type="dxa" w:w="100"/>
+              <w:bottom w:type="dxa" w:w="60"/>
+              <w:right w:type="dxa" w:w="100"/>
+            </w:tcMar>
+            <w:vAlign w:val="top"/>
+          </w:tcPr>
+          <w:p>
+            <w:pPr>
+              <w:spacing w:after="0" w:line="252"/>
+              <w:jc w:val="right"/>
+            </w:pPr>
+            <w:r>
+              <w:rPr>
+                <w:sz w:val="17"/>
+                <w:szCs w:val="17"/>
+              </w:rPr>
+              <w:t xml:space="preserve">0,83</w:t>
+            </w:r>
+          </w:p>
+        </w:tc>
+        <w:tc>
+          <w:tcPr>
+            <w:tcW w:type="dxa" w:w="1477"/>
+            <w:tcBorders>
+              <w:top w:val="single" w:color="BFBFBF" w:sz="4"/>
+              <w:left w:val="single" w:color="BFBFBF" w:sz="4"/>
+              <w:bottom w:val="single" w:color="BFBFBF" w:sz="4"/>
+              <w:right w:val="single" w:color="BFBFBF" w:sz="4"/>
+            </w:tcBorders>
+            <w:tcMar>
+              <w:top w:type="dxa" w:w="60"/>
+              <w:left w:type="dxa" w:w="100"/>
+              <w:bottom w:type="dxa" w:w="60"/>
+              <w:right w:type="dxa" w:w="100"/>
+            </w:tcMar>
+            <w:vAlign w:val="top"/>
+          </w:tcPr>
+          <w:p>
+            <w:pPr>
+              <w:spacing w:after="0" w:line="252"/>
+              <w:jc w:val="left"/>
+            </w:pPr>
+            <w:r>
+              <w:rPr>
+                <w:sz w:val="17"/>
+                <w:szCs w:val="17"/>
+              </w:rPr>
+              <w:t xml:space="preserve">Intermedio</w:t>
+            </w:r>
+          </w:p>
+        </w:tc>
+      </w:tr>
+      <w:tr>
+        <w:trPr>
+          <w:cantSplit/>
+        </w:trPr>
+        <w:tc>
+          <w:tcPr>
+            <w:tcW w:type="dxa" w:w="1969"/>
+            <w:tcBorders>
+              <w:top w:val="single" w:color="BFBFBF" w:sz="4"/>
+              <w:left w:val="single" w:color="BFBFBF" w:sz="4"/>
+              <w:bottom w:val="single" w:color="BFBFBF" w:sz="4"/>
+              <w:right w:val="single" w:color="BFBFBF" w:sz="4"/>
+            </w:tcBorders>
+            <w:tcMar>
+              <w:top w:type="dxa" w:w="60"/>
+              <w:left w:type="dxa" w:w="100"/>
+              <w:bottom w:type="dxa" w:w="60"/>
+              <w:right w:type="dxa" w:w="100"/>
+            </w:tcMar>
+            <w:vAlign w:val="top"/>
+          </w:tcPr>
+          <w:p>
+            <w:pPr>
+              <w:spacing w:after="0" w:line="252"/>
+              <w:jc w:val="left"/>
+            </w:pPr>
+            <w:r>
+              <w:rPr>
+                <w:sz w:val="17"/>
+                <w:szCs w:val="17"/>
+              </w:rPr>
+              <w:t xml:space="preserve">Lux Black</w:t>
+            </w:r>
+          </w:p>
+        </w:tc>
+        <w:tc>
+          <w:tcPr>
+            <w:tcW w:type="dxa" w:w="1313"/>
+            <w:tcBorders>
+              <w:top w:val="single" w:color="BFBFBF" w:sz="4"/>
+              <w:left w:val="single" w:color="BFBFBF" w:sz="4"/>
+              <w:bottom w:val="single" w:color="BFBFBF" w:sz="4"/>
+              <w:right w:val="single" w:color="BFBFBF" w:sz="4"/>
+            </w:tcBorders>
+            <w:tcMar>
+              <w:top w:type="dxa" w:w="60"/>
+              <w:left w:type="dxa" w:w="100"/>
+              <w:bottom w:type="dxa" w:w="60"/>
+              <w:right w:type="dxa" w:w="100"/>
+            </w:tcMar>
+            <w:vAlign w:val="top"/>
+          </w:tcPr>
+          <w:p>
+            <w:pPr>
+              <w:spacing w:after="0" w:line="252"/>
+              <w:jc w:val="left"/>
+            </w:pPr>
+            <w:r>
+              <w:rPr>
+                <w:sz w:val="17"/>
+                <w:szCs w:val="17"/>
+              </w:rPr>
+              <w:t xml:space="preserve">Lyft</w:t>
+            </w:r>
+          </w:p>
+        </w:tc>
+        <w:tc>
+          <w:tcPr>
+            <w:tcW w:type="dxa" w:w="1477"/>
+            <w:tcBorders>
+              <w:top w:val="single" w:color="BFBFBF" w:sz="4"/>
+              <w:left w:val="single" w:color="BFBFBF" w:sz="4"/>
+              <w:bottom w:val="single" w:color="BFBFBF" w:sz="4"/>
+              <w:right w:val="single" w:color="BFBFBF" w:sz="4"/>
+            </w:tcBorders>
+            <w:tcMar>
+              <w:top w:type="dxa" w:w="60"/>
+              <w:left w:type="dxa" w:w="100"/>
+              <w:bottom w:type="dxa" w:w="60"/>
+              <w:right w:type="dxa" w:w="100"/>
+            </w:tcMar>
+            <w:vAlign w:val="top"/>
+          </w:tcPr>
+          <w:p>
+            <w:pPr>
+              <w:spacing w:after="0" w:line="252"/>
+              <w:jc w:val="right"/>
+            </w:pPr>
+            <w:r>
+              <w:rPr>
+                <w:sz w:val="17"/>
+                <w:szCs w:val="17"/>
+              </w:rPr>
+              <w:t xml:space="preserve">12,31</w:t>
+            </w:r>
+          </w:p>
+        </w:tc>
+        <w:tc>
+          <w:tcPr>
+            <w:tcW w:type="dxa" w:w="1477"/>
+            <w:tcBorders>
+              <w:top w:val="single" w:color="BFBFBF" w:sz="4"/>
+              <w:left w:val="single" w:color="BFBFBF" w:sz="4"/>
+              <w:bottom w:val="single" w:color="BFBFBF" w:sz="4"/>
+              <w:right w:val="single" w:color="BFBFBF" w:sz="4"/>
+            </w:tcBorders>
+            <w:tcMar>
+              <w:top w:type="dxa" w:w="60"/>
+              <w:left w:type="dxa" w:w="100"/>
+              <w:bottom w:type="dxa" w:w="60"/>
+              <w:right w:type="dxa" w:w="100"/>
+            </w:tcMar>
+            <w:vAlign w:val="top"/>
+          </w:tcPr>
+          <w:p>
+            <w:pPr>
+              <w:spacing w:after="0" w:line="252"/>
+              <w:jc w:val="right"/>
+            </w:pPr>
+            <w:r>
+              <w:rPr>
+                <w:sz w:val="17"/>
+                <w:szCs w:val="17"/>
+              </w:rPr>
+              <w:t xml:space="preserve">4,54</w:t>
+            </w:r>
+          </w:p>
+        </w:tc>
+        <w:tc>
+          <w:tcPr>
+            <w:tcW w:type="dxa" w:w="1313"/>
+            <w:tcBorders>
+              <w:top w:val="single" w:color="BFBFBF" w:sz="4"/>
+              <w:left w:val="single" w:color="BFBFBF" w:sz="4"/>
+              <w:bottom w:val="single" w:color="BFBFBF" w:sz="4"/>
+              <w:right w:val="single" w:color="BFBFBF" w:sz="4"/>
+            </w:tcBorders>
+            <w:tcMar>
+              <w:top w:type="dxa" w:w="60"/>
+              <w:left w:type="dxa" w:w="100"/>
+              <w:bottom w:type="dxa" w:w="60"/>
+              <w:right w:type="dxa" w:w="100"/>
+            </w:tcMar>
+            <w:vAlign w:val="top"/>
+          </w:tcPr>
+          <w:p>
+            <w:pPr>
+              <w:spacing w:after="0" w:line="252"/>
+              <w:jc w:val="right"/>
+            </w:pPr>
+            <w:r>
+              <w:rPr>
+                <w:sz w:val="17"/>
+                <w:szCs w:val="17"/>
+              </w:rPr>
+              <w:t xml:space="preserve">0,89</w:t>
+            </w:r>
+          </w:p>
+        </w:tc>
+        <w:tc>
+          <w:tcPr>
+            <w:tcW w:type="dxa" w:w="1477"/>
+            <w:tcBorders>
+              <w:top w:val="single" w:color="BFBFBF" w:sz="4"/>
+              <w:left w:val="single" w:color="BFBFBF" w:sz="4"/>
+              <w:bottom w:val="single" w:color="BFBFBF" w:sz="4"/>
+              <w:right w:val="single" w:color="BFBFBF" w:sz="4"/>
+            </w:tcBorders>
+            <w:tcMar>
+              <w:top w:type="dxa" w:w="60"/>
+              <w:left w:type="dxa" w:w="100"/>
+              <w:bottom w:type="dxa" w:w="60"/>
+              <w:right w:type="dxa" w:w="100"/>
+            </w:tcMar>
+            <w:vAlign w:val="top"/>
+          </w:tcPr>
+          <w:p>
+            <w:pPr>
+              <w:spacing w:after="0" w:line="252"/>
+              <w:jc w:val="left"/>
+            </w:pPr>
+            <w:r>
+              <w:rPr>
+                <w:sz w:val="17"/>
+                <w:szCs w:val="17"/>
+              </w:rPr>
+              <w:t xml:space="preserve">Intermedio</w:t>
+            </w:r>
+          </w:p>
+        </w:tc>
+      </w:tr>
+      <w:tr>
+        <w:trPr>
+          <w:cantSplit/>
+        </w:trPr>
+        <w:tc>
+          <w:tcPr>
+            <w:tcW w:type="dxa" w:w="1969"/>
+            <w:tcBorders>
+              <w:top w:val="single" w:color="BFBFBF" w:sz="4"/>
+              <w:left w:val="single" w:color="BFBFBF" w:sz="4"/>
+              <w:bottom w:val="single" w:color="BFBFBF" w:sz="4"/>
+              <w:right w:val="single" w:color="BFBFBF" w:sz="4"/>
+            </w:tcBorders>
+            <w:tcMar>
+              <w:top w:type="dxa" w:w="60"/>
+              <w:left w:type="dxa" w:w="100"/>
+              <w:bottom w:type="dxa" w:w="60"/>
+              <w:right w:type="dxa" w:w="100"/>
+            </w:tcMar>
+            <w:vAlign w:val="top"/>
+          </w:tcPr>
+          <w:p>
+            <w:pPr>
+              <w:spacing w:after="0" w:line="252"/>
+              <w:jc w:val="left"/>
+            </w:pPr>
+            <w:r>
+              <w:rPr>
+                <w:sz w:val="17"/>
+                <w:szCs w:val="17"/>
+              </w:rPr>
+              <w:t xml:space="preserve">Lux Black XL</w:t>
+            </w:r>
+          </w:p>
+        </w:tc>
+        <w:tc>
+          <w:tcPr>
+            <w:tcW w:type="dxa" w:w="1313"/>
+            <w:tcBorders>
+              <w:top w:val="single" w:color="BFBFBF" w:sz="4"/>
+              <w:left w:val="single" w:color="BFBFBF" w:sz="4"/>
+              <w:bottom w:val="single" w:color="BFBFBF" w:sz="4"/>
+              <w:right w:val="single" w:color="BFBFBF" w:sz="4"/>
+            </w:tcBorders>
+            <w:tcMar>
+              <w:top w:type="dxa" w:w="60"/>
+              <w:left w:type="dxa" w:w="100"/>
+              <w:bottom w:type="dxa" w:w="60"/>
+              <w:right w:type="dxa" w:w="100"/>
+            </w:tcMar>
+            <w:vAlign w:val="top"/>
+          </w:tcPr>
+          <w:p>
+            <w:pPr>
+              <w:spacing w:after="0" w:line="252"/>
+              <w:jc w:val="left"/>
+            </w:pPr>
+            <w:r>
+              <w:rPr>
+                <w:sz w:val="17"/>
+                <w:szCs w:val="17"/>
+              </w:rPr>
+              <w:t xml:space="preserve">Lyft</w:t>
+            </w:r>
+          </w:p>
+        </w:tc>
+        <w:tc>
+          <w:tcPr>
+            <w:tcW w:type="dxa" w:w="1477"/>
+            <w:tcBorders>
+              <w:top w:val="single" w:color="BFBFBF" w:sz="4"/>
+              <w:left w:val="single" w:color="BFBFBF" w:sz="4"/>
+              <w:bottom w:val="single" w:color="BFBFBF" w:sz="4"/>
+              <w:right w:val="single" w:color="BFBFBF" w:sz="4"/>
+            </w:tcBorders>
+            <w:tcMar>
+              <w:top w:type="dxa" w:w="60"/>
+              <w:left w:type="dxa" w:w="100"/>
+              <w:bottom w:type="dxa" w:w="60"/>
+              <w:right w:type="dxa" w:w="100"/>
+            </w:tcMar>
+            <w:vAlign w:val="top"/>
+          </w:tcPr>
+          <w:p>
+            <w:pPr>
+              <w:spacing w:after="0" w:line="252"/>
+              <w:jc w:val="right"/>
+            </w:pPr>
+            <w:r>
+              <w:rPr>
+                <w:sz w:val="17"/>
+                <w:szCs w:val="17"/>
+              </w:rPr>
+              <w:t xml:space="preserve">21,89</w:t>
+            </w:r>
+          </w:p>
+        </w:tc>
+        <w:tc>
+          <w:tcPr>
+            <w:tcW w:type="dxa" w:w="1477"/>
+            <w:tcBorders>
+              <w:top w:val="single" w:color="BFBFBF" w:sz="4"/>
+              <w:left w:val="single" w:color="BFBFBF" w:sz="4"/>
+              <w:bottom w:val="single" w:color="BFBFBF" w:sz="4"/>
+              <w:right w:val="single" w:color="BFBFBF" w:sz="4"/>
+            </w:tcBorders>
+            <w:tcMar>
+              <w:top w:type="dxa" w:w="60"/>
+              <w:left w:type="dxa" w:w="100"/>
+              <w:bottom w:type="dxa" w:w="60"/>
+              <w:right w:type="dxa" w:w="100"/>
+            </w:tcMar>
+            <w:vAlign w:val="top"/>
+          </w:tcPr>
+          <w:p>
+            <w:pPr>
+              <w:spacing w:after="0" w:line="252"/>
+              <w:jc w:val="right"/>
+            </w:pPr>
+            <w:r>
+              <w:rPr>
+                <w:sz w:val="17"/>
+                <w:szCs w:val="17"/>
+              </w:rPr>
+              <w:t xml:space="preserve">4,24</w:t>
+            </w:r>
+          </w:p>
+        </w:tc>
+        <w:tc>
+          <w:tcPr>
+            <w:tcW w:type="dxa" w:w="1313"/>
+            <w:tcBorders>
+              <w:top w:val="single" w:color="BFBFBF" w:sz="4"/>
+              <w:left w:val="single" w:color="BFBFBF" w:sz="4"/>
+              <w:bottom w:val="single" w:color="BFBFBF" w:sz="4"/>
+              <w:right w:val="single" w:color="BFBFBF" w:sz="4"/>
+            </w:tcBorders>
+            <w:tcMar>
+              <w:top w:type="dxa" w:w="60"/>
+              <w:left w:type="dxa" w:w="100"/>
+              <w:bottom w:type="dxa" w:w="60"/>
+              <w:right w:type="dxa" w:w="100"/>
+            </w:tcMar>
+            <w:vAlign w:val="top"/>
+          </w:tcPr>
+          <w:p>
+            <w:pPr>
+              <w:spacing w:after="0" w:line="252"/>
+              <w:jc w:val="right"/>
+            </w:pPr>
+            <w:r>
+              <w:rPr>
+                <w:sz w:val="17"/>
+                <w:szCs w:val="17"/>
+              </w:rPr>
+              <w:t xml:space="preserve">0,82</w:t>
+            </w:r>
+          </w:p>
+        </w:tc>
+        <w:tc>
+          <w:tcPr>
+            <w:tcW w:type="dxa" w:w="1477"/>
+            <w:tcBorders>
+              <w:top w:val="single" w:color="BFBFBF" w:sz="4"/>
+              <w:left w:val="single" w:color="BFBFBF" w:sz="4"/>
+              <w:bottom w:val="single" w:color="BFBFBF" w:sz="4"/>
+              <w:right w:val="single" w:color="BFBFBF" w:sz="4"/>
+            </w:tcBorders>
+            <w:tcMar>
+              <w:top w:type="dxa" w:w="60"/>
+              <w:left w:type="dxa" w:w="100"/>
+              <w:bottom w:type="dxa" w:w="60"/>
+              <w:right w:type="dxa" w:w="100"/>
+            </w:tcMar>
+            <w:vAlign w:val="top"/>
+          </w:tcPr>
+          <w:p>
+            <w:pPr>
+              <w:spacing w:after="0" w:line="252"/>
+              <w:jc w:val="left"/>
+            </w:pPr>
+            <w:r>
+              <w:rPr>
+                <w:sz w:val="17"/>
+                <w:szCs w:val="17"/>
+              </w:rPr>
+              <w:t xml:space="preserve">Premium</w:t>
+            </w:r>
+          </w:p>
+        </w:tc>
+      </w:tr>
+      <w:tr>
+        <w:trPr>
+          <w:cantSplit/>
+        </w:trPr>
+        <w:tc>
+          <w:tcPr>
+            <w:tcW w:type="dxa" w:w="1969"/>
+            <w:tcBorders>
+              <w:top w:val="single" w:color="BFBFBF" w:sz="4"/>
+              <w:left w:val="single" w:color="BFBFBF" w:sz="4"/>
+              <w:bottom w:val="single" w:color="BFBFBF" w:sz="4"/>
+              <w:right w:val="single" w:color="BFBFBF" w:sz="4"/>
+            </w:tcBorders>
+            <w:tcMar>
+              <w:top w:type="dxa" w:w="60"/>
+              <w:left w:type="dxa" w:w="100"/>
+              <w:bottom w:type="dxa" w:w="60"/>
+              <w:right w:type="dxa" w:w="100"/>
+            </w:tcMar>
+            <w:vAlign w:val="top"/>
+          </w:tcPr>
+          <w:p>
+            <w:pPr>
+              <w:spacing w:after="0" w:line="252"/>
+              <w:jc w:val="left"/>
+            </w:pPr>
+            <w:r>
+              <w:rPr>
+                <w:sz w:val="17"/>
+                <w:szCs w:val="17"/>
+              </w:rPr>
+              <w:t xml:space="preserve">Black SUV</w:t>
+            </w:r>
+          </w:p>
+        </w:tc>
+        <w:tc>
+          <w:tcPr>
+            <w:tcW w:type="dxa" w:w="1313"/>
+            <w:tcBorders>
+              <w:top w:val="single" w:color="BFBFBF" w:sz="4"/>
+              <w:left w:val="single" w:color="BFBFBF" w:sz="4"/>
+              <w:bottom w:val="single" w:color="BFBFBF" w:sz="4"/>
+              <w:right w:val="single" w:color="BFBFBF" w:sz="4"/>
+            </w:tcBorders>
+            <w:tcMar>
+              <w:top w:type="dxa" w:w="60"/>
+              <w:left w:type="dxa" w:w="100"/>
+              <w:bottom w:type="dxa" w:w="60"/>
+              <w:right w:type="dxa" w:w="100"/>
+            </w:tcMar>
+            <w:vAlign w:val="top"/>
+          </w:tcPr>
+          <w:p>
+            <w:pPr>
+              <w:spacing w:after="0" w:line="252"/>
+              <w:jc w:val="left"/>
+            </w:pPr>
+            <w:r>
+              <w:rPr>
+                <w:sz w:val="17"/>
+                <w:szCs w:val="17"/>
+              </w:rPr>
+              <w:t xml:space="preserve">Uber</w:t>
+            </w:r>
+          </w:p>
+        </w:tc>
+        <w:tc>
+          <w:tcPr>
+            <w:tcW w:type="dxa" w:w="1477"/>
+            <w:tcBorders>
+              <w:top w:val="single" w:color="BFBFBF" w:sz="4"/>
+              <w:left w:val="single" w:color="BFBFBF" w:sz="4"/>
+              <w:bottom w:val="single" w:color="BFBFBF" w:sz="4"/>
+              <w:right w:val="single" w:color="BFBFBF" w:sz="4"/>
+            </w:tcBorders>
+            <w:tcMar>
+              <w:top w:type="dxa" w:w="60"/>
+              <w:left w:type="dxa" w:w="100"/>
+              <w:bottom w:type="dxa" w:w="60"/>
+              <w:right w:type="dxa" w:w="100"/>
+            </w:tcMar>
+            <w:vAlign w:val="top"/>
+          </w:tcPr>
+          <w:p>
+            <w:pPr>
+              <w:spacing w:after="0" w:line="252"/>
+              <w:jc w:val="right"/>
+            </w:pPr>
+            <w:r>
+              <w:rPr>
+                <w:sz w:val="17"/>
+                <w:szCs w:val="17"/>
+              </w:rPr>
+              <w:t xml:space="preserve">22,54</w:t>
+            </w:r>
+          </w:p>
+        </w:tc>
+        <w:tc>
+          <w:tcPr>
+            <w:tcW w:type="dxa" w:w="1477"/>
+            <w:tcBorders>
+              <w:top w:val="single" w:color="BFBFBF" w:sz="4"/>
+              <w:left w:val="single" w:color="BFBFBF" w:sz="4"/>
+              <w:bottom w:val="single" w:color="BFBFBF" w:sz="4"/>
+              <w:right w:val="single" w:color="BFBFBF" w:sz="4"/>
+            </w:tcBorders>
+            <w:tcMar>
+              <w:top w:type="dxa" w:w="60"/>
+              <w:left w:type="dxa" w:w="100"/>
+              <w:bottom w:type="dxa" w:w="60"/>
+              <w:right w:type="dxa" w:w="100"/>
+            </w:tcMar>
+            <w:vAlign w:val="top"/>
+          </w:tcPr>
+          <w:p>
+            <w:pPr>
+              <w:spacing w:after="0" w:line="252"/>
+              <w:jc w:val="right"/>
+            </w:pPr>
+            <w:r>
+              <w:rPr>
+                <w:sz w:val="17"/>
+                <w:szCs w:val="17"/>
+              </w:rPr>
+              <w:t xml:space="preserve">3,53</w:t>
+            </w:r>
+          </w:p>
+        </w:tc>
+        <w:tc>
+          <w:tcPr>
+            <w:tcW w:type="dxa" w:w="1313"/>
+            <w:tcBorders>
+              <w:top w:val="single" w:color="BFBFBF" w:sz="4"/>
+              <w:left w:val="single" w:color="BFBFBF" w:sz="4"/>
+              <w:bottom w:val="single" w:color="BFBFBF" w:sz="4"/>
+              <w:right w:val="single" w:color="BFBFBF" w:sz="4"/>
+            </w:tcBorders>
+            <w:tcMar>
+              <w:top w:type="dxa" w:w="60"/>
+              <w:left w:type="dxa" w:w="100"/>
+              <w:bottom w:type="dxa" w:w="60"/>
+              <w:right w:type="dxa" w:w="100"/>
+            </w:tcMar>
+            <w:vAlign w:val="top"/>
+          </w:tcPr>
+          <w:p>
+            <w:pPr>
+              <w:spacing w:after="0" w:line="252"/>
+              <w:jc w:val="right"/>
+            </w:pPr>
+            <w:r>
+              <w:rPr>
+                <w:sz w:val="17"/>
+                <w:szCs w:val="17"/>
+              </w:rPr>
+              <w:t xml:space="preserve">0,74</w:t>
+            </w:r>
+          </w:p>
+        </w:tc>
+        <w:tc>
+          <w:tcPr>
+            <w:tcW w:type="dxa" w:w="1477"/>
+            <w:tcBorders>
+              <w:top w:val="single" w:color="BFBFBF" w:sz="4"/>
+              <w:left w:val="single" w:color="BFBFBF" w:sz="4"/>
+              <w:bottom w:val="single" w:color="BFBFBF" w:sz="4"/>
+              <w:right w:val="single" w:color="BFBFBF" w:sz="4"/>
+            </w:tcBorders>
+            <w:tcMar>
+              <w:top w:type="dxa" w:w="60"/>
+              <w:left w:type="dxa" w:w="100"/>
+              <w:bottom w:type="dxa" w:w="60"/>
+              <w:right w:type="dxa" w:w="100"/>
+            </w:tcMar>
+            <w:vAlign w:val="top"/>
+          </w:tcPr>
+          <w:p>
+            <w:pPr>
+              <w:spacing w:after="0" w:line="252"/>
+              <w:jc w:val="left"/>
+            </w:pPr>
+            <w:r>
+              <w:rPr>
+                <w:sz w:val="17"/>
+                <w:szCs w:val="17"/>
+              </w:rPr>
+              <w:t xml:space="preserve">Premium</w:t>
+            </w:r>
+          </w:p>
+        </w:tc>
+      </w:tr>
+    </w:tbl>
+    <w:p>
+      <w:pPr>
+        <w:spacing w:after="160"/>
+      </w:pPr>
+    </w:p>
+    <w:p>
+      <w:pPr>
+        <w:spacing w:after="160" w:before="0"/>
+        <w:jc w:val="left"/>
+      </w:pPr>
+      <w:r>
+        <w:rPr>
+          <w:i/>
+          <w:iCs/>
+          <w:color w:val="595959"/>
+          <w:sz w:val="17"/>
+          <w:szCs w:val="17"/>
+        </w:rPr>
+        <w:t xml:space="preserve">Estimado con las cotizaciones sin recargo del entrenamiento. El R² indica qué tan bien la recta describe el precio de cada producto (entre 0,41 y 0,89).</w:t>
       </w:r>
     </w:p>
     <w:p>
@@ -25463,7 +28018,7 @@
       <w:r>
         <w:drawing>
           <wp:inline distT="0" distB="0" distL="0" distR="0">
-            <wp:extent cx="5724525" cy="1819275"/>
+            <wp:extent cx="5724525" cy="1800225"/>
             <wp:effectExtent t="0" r="0" b="0" l="0"/>
             <wp:docPr id="11" name="" descr="" title=""/>
             <wp:cNvGraphicFramePr>
@@ -25488,7 +28043,7 @@
                   <pic:spPr bwMode="auto">
                     <a:xfrm>
                       <a:off x="0" y="0"/>
-                      <a:ext cx="5724525" cy="1819275"/>
+                      <a:ext cx="5724525" cy="1800225"/>
                     </a:xfrm>
                     <a:prstGeom prst="rect">
                       <a:avLst/>
@@ -25526,7 +28081,7 @@
           <w:sz w:val="18"/>
           <w:szCs w:val="18"/>
         </w:rPr>
-        <w:t xml:space="preserve">Método del codo, coeficiente de silueta y rutas agrupadas por K-Means.</w:t>
+        <w:t xml:space="preserve">Método del codo, coeficiente de silueta y los 12 productos agrupados por K-Means según su tarifa base y su precio por milla.</w:t>
       </w:r>
     </w:p>
     <w:p>
@@ -25542,27 +28097,17 @@
         <w:t xml:space="preserve">Cantidad de grupos.</w:t>
       </w:r>
       <w:r>
-        <w:t xml:space="preserve"> Probamos k de 2 a 8 (n_init = 20). El codo no muestra un quiebre claro y la silueta es casi plana (entre 0,44 y 0,46): </w:t>
+        <w:t xml:space="preserve"> Probamos k de 2 a 6 (n_init = 50). La silueta tiene un máximo claro en </w:t>
       </w:r>
       <w:r>
         <w:rPr>
           <w:b/>
           <w:bCs/>
         </w:rPr>
-        <w:t xml:space="preserve">no hay un k claramente mejor</w:t>
-      </w:r>
-      <w:r>
-        <w:t xml:space="preserve">, las rutas forman más un continuo que grupos separados. Por eso elegimos </w:t>
-      </w:r>
-      <w:r>
-        <w:rPr>
-          <w:b/>
-          <w:bCs/>
-        </w:rPr>
-        <w:t xml:space="preserve">k = 4 por interpretabilidad</w:t>
-      </w:r>
-      <w:r>
-        <w:t xml:space="preserve"> (silueta 0,45, prácticamente igual al máximo): combina el largo del viaje con el nivel de recargo. Leemos los grupos como una descripción útil, no como categorías naturales.</w:t>
+        <w:t xml:space="preserve">k = 3</w:t>
+      </w:r>
+      <w:r>
+        <w:t xml:space="preserve"> (0,68; con k = 2 da 0,57 y con k = 4, 0,61), y en el codo la inercia deja de bajar fuerte a partir de ahí. Una silueta de 0,68 indica grupos bien separados.</w:t>
       </w:r>
     </w:p>
     <w:tbl>
@@ -25579,13 +28124,10 @@
         <w:tblLayout w:type="fixed"/>
       </w:tblPr>
       <w:tblGrid>
-        <w:gridCol w:w="674"/>
-        <w:gridCol w:w="1751"/>
-        <w:gridCol w:w="674"/>
-        <w:gridCol w:w="1010"/>
-        <w:gridCol w:w="1145"/>
-        <w:gridCol w:w="943"/>
-        <w:gridCol w:w="2829"/>
+        <w:gridCol w:w="1533"/>
+        <w:gridCol w:w="4428"/>
+        <w:gridCol w:w="1533"/>
+        <w:gridCol w:w="1532"/>
       </w:tblGrid>
       <w:tr>
         <w:trPr>
@@ -25594,7 +28136,7 @@
         </w:trPr>
         <w:tc>
           <w:tcPr>
-            <w:tcW w:type="dxa" w:w="674"/>
+            <w:tcW w:type="dxa" w:w="1533"/>
             <w:tcBorders>
               <w:top w:val="single" w:color="BFBFBF" w:sz="4"/>
               <w:left w:val="single" w:color="BFBFBF" w:sz="4"/>
@@ -25619,16 +28161,16 @@
               <w:rPr>
                 <w:b/>
                 <w:bCs/>
-                <w:sz w:val="16"/>
-                <w:szCs w:val="16"/>
-              </w:rPr>
-              <w:t xml:space="preserve">Grupo</w:t>
-            </w:r>
-          </w:p>
-        </w:tc>
-        <w:tc>
-          <w:tcPr>
-            <w:tcW w:type="dxa" w:w="1751"/>
+                <w:sz w:val="17"/>
+                <w:szCs w:val="17"/>
+              </w:rPr>
+              <w:t xml:space="preserve">Familia</w:t>
+            </w:r>
+          </w:p>
+        </w:tc>
+        <w:tc>
+          <w:tcPr>
+            <w:tcW w:type="dxa" w:w="4428"/>
             <w:tcBorders>
               <w:top w:val="single" w:color="BFBFBF" w:sz="4"/>
               <w:left w:val="single" w:color="BFBFBF" w:sz="4"/>
@@ -25653,16 +28195,16 @@
               <w:rPr>
                 <w:b/>
                 <w:bCs/>
-                <w:sz w:val="16"/>
-                <w:szCs w:val="16"/>
-              </w:rPr>
-              <w:t xml:space="preserve">Perfil</w:t>
-            </w:r>
-          </w:p>
-        </w:tc>
-        <w:tc>
-          <w:tcPr>
-            <w:tcW w:type="dxa" w:w="674"/>
+                <w:sz w:val="17"/>
+                <w:szCs w:val="17"/>
+              </w:rPr>
+              <w:t xml:space="preserve">Productos</w:t>
+            </w:r>
+          </w:p>
+        </w:tc>
+        <w:tc>
+          <w:tcPr>
+            <w:tcW w:type="dxa" w:w="1533"/>
             <w:tcBorders>
               <w:top w:val="single" w:color="BFBFBF" w:sz="4"/>
               <w:left w:val="single" w:color="BFBFBF" w:sz="4"/>
@@ -25687,16 +28229,16 @@
               <w:rPr>
                 <w:b/>
                 <w:bCs/>
-                <w:sz w:val="16"/>
-                <w:szCs w:val="16"/>
-              </w:rPr>
-              <w:t xml:space="preserve">Rutas</w:t>
-            </w:r>
-          </w:p>
-        </w:tc>
-        <w:tc>
-          <w:tcPr>
-            <w:tcW w:type="dxa" w:w="1010"/>
+                <w:sz w:val="17"/>
+                <w:szCs w:val="17"/>
+              </w:rPr>
+              <w:t xml:space="preserve">Tarifa base (USD)</w:t>
+            </w:r>
+          </w:p>
+        </w:tc>
+        <w:tc>
+          <w:tcPr>
+            <w:tcW w:type="dxa" w:w="1532"/>
             <w:tcBorders>
               <w:top w:val="single" w:color="BFBFBF" w:sz="4"/>
               <w:left w:val="single" w:color="BFBFBF" w:sz="4"/>
@@ -25721,112 +28263,10 @@
               <w:rPr>
                 <w:b/>
                 <w:bCs/>
-                <w:sz w:val="16"/>
-                <w:szCs w:val="16"/>
-              </w:rPr>
-              <w:t xml:space="preserve">Distancia media</w:t>
-            </w:r>
-          </w:p>
-        </w:tc>
-        <w:tc>
-          <w:tcPr>
-            <w:tcW w:type="dxa" w:w="1145"/>
-            <w:tcBorders>
-              <w:top w:val="single" w:color="BFBFBF" w:sz="4"/>
-              <w:left w:val="single" w:color="BFBFBF" w:sz="4"/>
-              <w:bottom w:val="single" w:color="BFBFBF" w:sz="4"/>
-              <w:right w:val="single" w:color="BFBFBF" w:sz="4"/>
-            </w:tcBorders>
-            <w:shd w:fill="F2F2F2" w:color="auto" w:val="clear"/>
-            <w:tcMar>
-              <w:top w:type="dxa" w:w="60"/>
-              <w:left w:type="dxa" w:w="100"/>
-              <w:bottom w:type="dxa" w:w="60"/>
-              <w:right w:type="dxa" w:w="100"/>
-            </w:tcMar>
-            <w:vAlign w:val="top"/>
-          </w:tcPr>
-          <w:p>
-            <w:pPr>
-              <w:spacing w:after="0" w:line="252"/>
-              <w:jc w:val="right"/>
-            </w:pPr>
-            <w:r>
-              <w:rPr>
-                <w:b/>
-                <w:bCs/>
-                <w:sz w:val="16"/>
-                <w:szCs w:val="16"/>
-              </w:rPr>
-              <w:t xml:space="preserve">Precio por milla (Estándar)</w:t>
-            </w:r>
-          </w:p>
-        </w:tc>
-        <w:tc>
-          <w:tcPr>
-            <w:tcW w:type="dxa" w:w="943"/>
-            <w:tcBorders>
-              <w:top w:val="single" w:color="BFBFBF" w:sz="4"/>
-              <w:left w:val="single" w:color="BFBFBF" w:sz="4"/>
-              <w:bottom w:val="single" w:color="BFBFBF" w:sz="4"/>
-              <w:right w:val="single" w:color="BFBFBF" w:sz="4"/>
-            </w:tcBorders>
-            <w:shd w:fill="F2F2F2" w:color="auto" w:val="clear"/>
-            <w:tcMar>
-              <w:top w:type="dxa" w:w="60"/>
-              <w:left w:type="dxa" w:w="100"/>
-              <w:bottom w:type="dxa" w:w="60"/>
-              <w:right w:type="dxa" w:w="100"/>
-            </w:tcMar>
-            <w:vAlign w:val="top"/>
-          </w:tcPr>
-          <w:p>
-            <w:pPr>
-              <w:spacing w:after="0" w:line="252"/>
-              <w:jc w:val="right"/>
-            </w:pPr>
-            <w:r>
-              <w:rPr>
-                <w:b/>
-                <w:bCs/>
-                <w:sz w:val="16"/>
-                <w:szCs w:val="16"/>
-              </w:rPr>
-              <w:t xml:space="preserve">Tasa de recargo</w:t>
-            </w:r>
-          </w:p>
-        </w:tc>
-        <w:tc>
-          <w:tcPr>
-            <w:tcW w:type="dxa" w:w="2829"/>
-            <w:tcBorders>
-              <w:top w:val="single" w:color="BFBFBF" w:sz="4"/>
-              <w:left w:val="single" w:color="BFBFBF" w:sz="4"/>
-              <w:bottom w:val="single" w:color="BFBFBF" w:sz="4"/>
-              <w:right w:val="single" w:color="BFBFBF" w:sz="4"/>
-            </w:tcBorders>
-            <w:shd w:fill="F2F2F2" w:color="auto" w:val="clear"/>
-            <w:tcMar>
-              <w:top w:type="dxa" w:w="60"/>
-              <w:left w:type="dxa" w:w="100"/>
-              <w:bottom w:type="dxa" w:w="60"/>
-              <w:right w:type="dxa" w:w="100"/>
-            </w:tcMar>
-            <w:vAlign w:val="top"/>
-          </w:tcPr>
-          <w:p>
-            <w:pPr>
-              <w:spacing w:after="0" w:line="252"/>
-              <w:jc w:val="left"/>
-            </w:pPr>
-            <w:r>
-              <w:rPr>
-                <w:b/>
-                <w:bCs/>
-                <w:sz w:val="16"/>
-                <w:szCs w:val="16"/>
-              </w:rPr>
-              <w:t xml:space="preserve">Ejemplos</w:t>
+                <w:sz w:val="17"/>
+                <w:szCs w:val="17"/>
+              </w:rPr>
+              <w:t xml:space="preserve">Por milla (USD)</w:t>
             </w:r>
           </w:p>
         </w:tc>
@@ -25837,231 +28277,125 @@
         </w:trPr>
         <w:tc>
           <w:tcPr>
-            <w:tcW w:type="dxa" w:w="674"/>
-            <w:tcBorders>
-              <w:top w:val="single" w:color="BFBFBF" w:sz="4"/>
-              <w:left w:val="single" w:color="BFBFBF" w:sz="4"/>
-              <w:bottom w:val="single" w:color="BFBFBF" w:sz="4"/>
-              <w:right w:val="single" w:color="BFBFBF" w:sz="4"/>
-            </w:tcBorders>
-            <w:tcMar>
-              <w:top w:type="dxa" w:w="60"/>
-              <w:left w:type="dxa" w:w="100"/>
-              <w:bottom w:type="dxa" w:w="60"/>
-              <w:right w:type="dxa" w:w="100"/>
-            </w:tcMar>
-            <w:vAlign w:val="top"/>
-          </w:tcPr>
-          <w:p>
-            <w:pPr>
-              <w:spacing w:after="0" w:line="252"/>
-              <w:jc w:val="left"/>
-            </w:pPr>
-            <w:r>
-              <w:rPr>
-                <w:sz w:val="16"/>
-                <w:szCs w:val="16"/>
-              </w:rPr>
-              <w:t xml:space="preserve">1</w:t>
-            </w:r>
-          </w:p>
-        </w:tc>
-        <w:tc>
-          <w:tcPr>
-            <w:tcW w:type="dxa" w:w="1751"/>
-            <w:tcBorders>
-              <w:top w:val="single" w:color="BFBFBF" w:sz="4"/>
-              <w:left w:val="single" w:color="BFBFBF" w:sz="4"/>
-              <w:bottom w:val="single" w:color="BFBFBF" w:sz="4"/>
-              <w:right w:val="single" w:color="BFBFBF" w:sz="4"/>
-            </w:tcBorders>
-            <w:tcMar>
-              <w:top w:type="dxa" w:w="60"/>
-              <w:left w:type="dxa" w:w="100"/>
-              <w:bottom w:type="dxa" w:w="60"/>
-              <w:right w:type="dxa" w:w="100"/>
-            </w:tcMar>
-            <w:vAlign w:val="top"/>
-          </w:tcPr>
-          <w:p>
-            <w:pPr>
-              <w:spacing w:after="0" w:line="252"/>
-              <w:jc w:val="left"/>
-            </w:pPr>
-            <w:r>
-              <w:rPr>
-                <w:sz w:val="16"/>
-                <w:szCs w:val="16"/>
-              </w:rPr>
-              <w:t xml:space="preserve">Cortas, poco recargo</w:t>
-            </w:r>
-          </w:p>
-        </w:tc>
-        <w:tc>
-          <w:tcPr>
-            <w:tcW w:type="dxa" w:w="674"/>
-            <w:tcBorders>
-              <w:top w:val="single" w:color="BFBFBF" w:sz="4"/>
-              <w:left w:val="single" w:color="BFBFBF" w:sz="4"/>
-              <w:bottom w:val="single" w:color="BFBFBF" w:sz="4"/>
-              <w:right w:val="single" w:color="BFBFBF" w:sz="4"/>
-            </w:tcBorders>
-            <w:tcMar>
-              <w:top w:type="dxa" w:w="60"/>
-              <w:left w:type="dxa" w:w="100"/>
-              <w:bottom w:type="dxa" w:w="60"/>
-              <w:right w:type="dxa" w:w="100"/>
-            </w:tcMar>
-            <w:vAlign w:val="top"/>
-          </w:tcPr>
-          <w:p>
-            <w:pPr>
-              <w:spacing w:after="0" w:line="252"/>
-              <w:jc w:val="right"/>
-            </w:pPr>
-            <w:r>
-              <w:rPr>
-                <w:sz w:val="16"/>
-                <w:szCs w:val="16"/>
-              </w:rPr>
-              <w:t xml:space="preserve">18</w:t>
-            </w:r>
-          </w:p>
-        </w:tc>
-        <w:tc>
-          <w:tcPr>
-            <w:tcW w:type="dxa" w:w="1010"/>
-            <w:tcBorders>
-              <w:top w:val="single" w:color="BFBFBF" w:sz="4"/>
-              <w:left w:val="single" w:color="BFBFBF" w:sz="4"/>
-              <w:bottom w:val="single" w:color="BFBFBF" w:sz="4"/>
-              <w:right w:val="single" w:color="BFBFBF" w:sz="4"/>
-            </w:tcBorders>
-            <w:tcMar>
-              <w:top w:type="dxa" w:w="60"/>
-              <w:left w:type="dxa" w:w="100"/>
-              <w:bottom w:type="dxa" w:w="60"/>
-              <w:right w:type="dxa" w:w="100"/>
-            </w:tcMar>
-            <w:vAlign w:val="top"/>
-          </w:tcPr>
-          <w:p>
-            <w:pPr>
-              <w:spacing w:after="0" w:line="252"/>
-              <w:jc w:val="right"/>
-            </w:pPr>
-            <w:r>
-              <w:rPr>
-                <w:sz w:val="16"/>
-                <w:szCs w:val="16"/>
-              </w:rPr>
-              <w:t xml:space="preserve">0,98 mi</w:t>
-            </w:r>
-          </w:p>
-        </w:tc>
-        <w:tc>
-          <w:tcPr>
-            <w:tcW w:type="dxa" w:w="1145"/>
-            <w:tcBorders>
-              <w:top w:val="single" w:color="BFBFBF" w:sz="4"/>
-              <w:left w:val="single" w:color="BFBFBF" w:sz="4"/>
-              <w:bottom w:val="single" w:color="BFBFBF" w:sz="4"/>
-              <w:right w:val="single" w:color="BFBFBF" w:sz="4"/>
-            </w:tcBorders>
-            <w:tcMar>
-              <w:top w:type="dxa" w:w="60"/>
-              <w:left w:type="dxa" w:w="100"/>
-              <w:bottom w:type="dxa" w:w="60"/>
-              <w:right w:type="dxa" w:w="100"/>
-            </w:tcMar>
-            <w:vAlign w:val="top"/>
-          </w:tcPr>
-          <w:p>
-            <w:pPr>
-              <w:spacing w:after="0" w:line="252"/>
-              <w:jc w:val="right"/>
-            </w:pPr>
-            <w:r>
-              <w:rPr>
-                <w:sz w:val="16"/>
-                <w:szCs w:val="16"/>
-              </w:rPr>
-              <w:t xml:space="preserve">USD 8,81</w:t>
-            </w:r>
-          </w:p>
-        </w:tc>
-        <w:tc>
-          <w:tcPr>
-            <w:tcW w:type="dxa" w:w="943"/>
-            <w:tcBorders>
-              <w:top w:val="single" w:color="BFBFBF" w:sz="4"/>
-              <w:left w:val="single" w:color="BFBFBF" w:sz="4"/>
-              <w:bottom w:val="single" w:color="BFBFBF" w:sz="4"/>
-              <w:right w:val="single" w:color="BFBFBF" w:sz="4"/>
-            </w:tcBorders>
-            <w:tcMar>
-              <w:top w:type="dxa" w:w="60"/>
-              <w:left w:type="dxa" w:w="100"/>
-              <w:bottom w:type="dxa" w:w="60"/>
-              <w:right w:type="dxa" w:w="100"/>
-            </w:tcMar>
-            <w:vAlign w:val="top"/>
-          </w:tcPr>
-          <w:p>
-            <w:pPr>
-              <w:spacing w:after="0" w:line="252"/>
-              <w:jc w:val="right"/>
-            </w:pPr>
-            <w:r>
-              <w:rPr>
-                <w:sz w:val="16"/>
-                <w:szCs w:val="16"/>
-              </w:rPr>
-              <w:t xml:space="preserve">3,9%</w:t>
-            </w:r>
-          </w:p>
-        </w:tc>
-        <w:tc>
-          <w:tcPr>
-            <w:tcW w:type="dxa" w:w="2829"/>
-            <w:tcBorders>
-              <w:top w:val="single" w:color="BFBFBF" w:sz="4"/>
-              <w:left w:val="single" w:color="BFBFBF" w:sz="4"/>
-              <w:bottom w:val="single" w:color="BFBFBF" w:sz="4"/>
-              <w:right w:val="single" w:color="BFBFBF" w:sz="4"/>
-            </w:tcBorders>
-            <w:tcMar>
-              <w:top w:type="dxa" w:w="60"/>
-              <w:left w:type="dxa" w:w="100"/>
-              <w:bottom w:type="dxa" w:w="60"/>
-              <w:right w:type="dxa" w:w="100"/>
-            </w:tcMar>
-            <w:vAlign w:val="top"/>
-          </w:tcPr>
-          <w:p>
-            <w:pPr>
-              <w:spacing w:after="0" w:line="252"/>
-              <w:jc w:val="left"/>
-            </w:pPr>
-            <w:r>
-              <w:rPr>
-                <w:sz w:val="16"/>
-                <w:szCs w:val="16"/>
-              </w:rPr>
-              <w:t xml:space="preserve">South Station → Financial District</w:t>
-            </w:r>
-          </w:p>
-          <w:p>
-            <w:pPr>
-              <w:spacing w:after="0" w:line="252"/>
-              <w:jc w:val="left"/>
-            </w:pPr>
-            <w:r>
-              <w:rPr>
-                <w:sz w:val="16"/>
-                <w:szCs w:val="16"/>
-              </w:rPr>
-              <w:t xml:space="preserve">Beacon Hill → Haymarket Square</w:t>
+            <w:tcW w:type="dxa" w:w="1533"/>
+            <w:tcBorders>
+              <w:top w:val="single" w:color="BFBFBF" w:sz="4"/>
+              <w:left w:val="single" w:color="BFBFBF" w:sz="4"/>
+              <w:bottom w:val="single" w:color="BFBFBF" w:sz="4"/>
+              <w:right w:val="single" w:color="BFBFBF" w:sz="4"/>
+            </w:tcBorders>
+            <w:tcMar>
+              <w:top w:type="dxa" w:w="60"/>
+              <w:left w:type="dxa" w:w="100"/>
+              <w:bottom w:type="dxa" w:w="60"/>
+              <w:right w:type="dxa" w:w="100"/>
+            </w:tcMar>
+            <w:vAlign w:val="top"/>
+          </w:tcPr>
+          <w:p>
+            <w:pPr>
+              <w:spacing w:after="0" w:line="252"/>
+              <w:jc w:val="left"/>
+            </w:pPr>
+            <w:r>
+              <w:rPr>
+                <w:sz w:val="17"/>
+                <w:szCs w:val="17"/>
+              </w:rPr>
+              <w:t xml:space="preserve">Económico</w:t>
+            </w:r>
+          </w:p>
+        </w:tc>
+        <w:tc>
+          <w:tcPr>
+            <w:tcW w:type="dxa" w:w="4428"/>
+            <w:tcBorders>
+              <w:top w:val="single" w:color="BFBFBF" w:sz="4"/>
+              <w:left w:val="single" w:color="BFBFBF" w:sz="4"/>
+              <w:bottom w:val="single" w:color="BFBFBF" w:sz="4"/>
+              <w:right w:val="single" w:color="BFBFBF" w:sz="4"/>
+            </w:tcBorders>
+            <w:tcMar>
+              <w:top w:type="dxa" w:w="60"/>
+              <w:left w:type="dxa" w:w="100"/>
+              <w:bottom w:type="dxa" w:w="60"/>
+              <w:right w:type="dxa" w:w="100"/>
+            </w:tcMar>
+            <w:vAlign w:val="top"/>
+          </w:tcPr>
+          <w:p>
+            <w:pPr>
+              <w:spacing w:after="0" w:line="252"/>
+              <w:jc w:val="left"/>
+            </w:pPr>
+            <w:r>
+              <w:rPr>
+                <w:sz w:val="17"/>
+                <w:szCs w:val="17"/>
+              </w:rPr>
+              <w:t xml:space="preserve">Shared, Lyft, UberPool, WAV, UberX</w:t>
+            </w:r>
+          </w:p>
+        </w:tc>
+        <w:tc>
+          <w:tcPr>
+            <w:tcW w:type="dxa" w:w="1533"/>
+            <w:tcBorders>
+              <w:top w:val="single" w:color="BFBFBF" w:sz="4"/>
+              <w:left w:val="single" w:color="BFBFBF" w:sz="4"/>
+              <w:bottom w:val="single" w:color="BFBFBF" w:sz="4"/>
+              <w:right w:val="single" w:color="BFBFBF" w:sz="4"/>
+            </w:tcBorders>
+            <w:tcMar>
+              <w:top w:type="dxa" w:w="60"/>
+              <w:left w:type="dxa" w:w="100"/>
+              <w:bottom w:type="dxa" w:w="60"/>
+              <w:right w:type="dxa" w:w="100"/>
+            </w:tcMar>
+            <w:vAlign w:val="top"/>
+          </w:tcPr>
+          <w:p>
+            <w:pPr>
+              <w:spacing w:after="0" w:line="252"/>
+              <w:jc w:val="right"/>
+            </w:pPr>
+            <w:r>
+              <w:rPr>
+                <w:sz w:val="17"/>
+                <w:szCs w:val="17"/>
+              </w:rPr>
+              <w:t xml:space="preserve">3,3 a 6,4</w:t>
+            </w:r>
+          </w:p>
+        </w:tc>
+        <w:tc>
+          <w:tcPr>
+            <w:tcW w:type="dxa" w:w="1532"/>
+            <w:tcBorders>
+              <w:top w:val="single" w:color="BFBFBF" w:sz="4"/>
+              <w:left w:val="single" w:color="BFBFBF" w:sz="4"/>
+              <w:bottom w:val="single" w:color="BFBFBF" w:sz="4"/>
+              <w:right w:val="single" w:color="BFBFBF" w:sz="4"/>
+            </w:tcBorders>
+            <w:tcMar>
+              <w:top w:type="dxa" w:w="60"/>
+              <w:left w:type="dxa" w:w="100"/>
+              <w:bottom w:type="dxa" w:w="60"/>
+              <w:right w:type="dxa" w:w="100"/>
+            </w:tcMar>
+            <w:vAlign w:val="top"/>
+          </w:tcPr>
+          <w:p>
+            <w:pPr>
+              <w:spacing w:after="0" w:line="252"/>
+              <w:jc w:val="right"/>
+            </w:pPr>
+            <w:r>
+              <w:rPr>
+                <w:sz w:val="17"/>
+                <w:szCs w:val="17"/>
+              </w:rPr>
+              <w:t xml:space="preserve">1,20 a 1,70</w:t>
             </w:r>
           </w:p>
         </w:tc>
@@ -26072,231 +28406,125 @@
         </w:trPr>
         <w:tc>
           <w:tcPr>
-            <w:tcW w:type="dxa" w:w="674"/>
-            <w:tcBorders>
-              <w:top w:val="single" w:color="BFBFBF" w:sz="4"/>
-              <w:left w:val="single" w:color="BFBFBF" w:sz="4"/>
-              <w:bottom w:val="single" w:color="BFBFBF" w:sz="4"/>
-              <w:right w:val="single" w:color="BFBFBF" w:sz="4"/>
-            </w:tcBorders>
-            <w:tcMar>
-              <w:top w:type="dxa" w:w="60"/>
-              <w:left w:type="dxa" w:w="100"/>
-              <w:bottom w:type="dxa" w:w="60"/>
-              <w:right w:type="dxa" w:w="100"/>
-            </w:tcMar>
-            <w:vAlign w:val="top"/>
-          </w:tcPr>
-          <w:p>
-            <w:pPr>
-              <w:spacing w:after="0" w:line="252"/>
-              <w:jc w:val="left"/>
-            </w:pPr>
-            <w:r>
-              <w:rPr>
-                <w:sz w:val="16"/>
-                <w:szCs w:val="16"/>
-              </w:rPr>
-              <w:t xml:space="preserve">2</w:t>
-            </w:r>
-          </w:p>
-        </w:tc>
-        <w:tc>
-          <w:tcPr>
-            <w:tcW w:type="dxa" w:w="1751"/>
-            <w:tcBorders>
-              <w:top w:val="single" w:color="BFBFBF" w:sz="4"/>
-              <w:left w:val="single" w:color="BFBFBF" w:sz="4"/>
-              <w:bottom w:val="single" w:color="BFBFBF" w:sz="4"/>
-              <w:right w:val="single" w:color="BFBFBF" w:sz="4"/>
-            </w:tcBorders>
-            <w:tcMar>
-              <w:top w:type="dxa" w:w="60"/>
-              <w:left w:type="dxa" w:w="100"/>
-              <w:bottom w:type="dxa" w:w="60"/>
-              <w:right w:type="dxa" w:w="100"/>
-            </w:tcMar>
-            <w:vAlign w:val="top"/>
-          </w:tcPr>
-          <w:p>
-            <w:pPr>
-              <w:spacing w:after="0" w:line="252"/>
-              <w:jc w:val="left"/>
-            </w:pPr>
-            <w:r>
-              <w:rPr>
-                <w:sz w:val="16"/>
-                <w:szCs w:val="16"/>
-              </w:rPr>
-              <w:t xml:space="preserve">Medias, mucho recargo</w:t>
-            </w:r>
-          </w:p>
-        </w:tc>
-        <w:tc>
-          <w:tcPr>
-            <w:tcW w:type="dxa" w:w="674"/>
-            <w:tcBorders>
-              <w:top w:val="single" w:color="BFBFBF" w:sz="4"/>
-              <w:left w:val="single" w:color="BFBFBF" w:sz="4"/>
-              <w:bottom w:val="single" w:color="BFBFBF" w:sz="4"/>
-              <w:right w:val="single" w:color="BFBFBF" w:sz="4"/>
-            </w:tcBorders>
-            <w:tcMar>
-              <w:top w:type="dxa" w:w="60"/>
-              <w:left w:type="dxa" w:w="100"/>
-              <w:bottom w:type="dxa" w:w="60"/>
-              <w:right w:type="dxa" w:w="100"/>
-            </w:tcMar>
-            <w:vAlign w:val="top"/>
-          </w:tcPr>
-          <w:p>
-            <w:pPr>
-              <w:spacing w:after="0" w:line="252"/>
-              <w:jc w:val="right"/>
-            </w:pPr>
-            <w:r>
-              <w:rPr>
-                <w:sz w:val="16"/>
-                <w:szCs w:val="16"/>
-              </w:rPr>
-              <w:t xml:space="preserve">34</w:t>
-            </w:r>
-          </w:p>
-        </w:tc>
-        <w:tc>
-          <w:tcPr>
-            <w:tcW w:type="dxa" w:w="1010"/>
-            <w:tcBorders>
-              <w:top w:val="single" w:color="BFBFBF" w:sz="4"/>
-              <w:left w:val="single" w:color="BFBFBF" w:sz="4"/>
-              <w:bottom w:val="single" w:color="BFBFBF" w:sz="4"/>
-              <w:right w:val="single" w:color="BFBFBF" w:sz="4"/>
-            </w:tcBorders>
-            <w:tcMar>
-              <w:top w:type="dxa" w:w="60"/>
-              <w:left w:type="dxa" w:w="100"/>
-              <w:bottom w:type="dxa" w:w="60"/>
-              <w:right w:type="dxa" w:w="100"/>
-            </w:tcMar>
-            <w:vAlign w:val="top"/>
-          </w:tcPr>
-          <w:p>
-            <w:pPr>
-              <w:spacing w:after="0" w:line="252"/>
-              <w:jc w:val="right"/>
-            </w:pPr>
-            <w:r>
-              <w:rPr>
-                <w:sz w:val="16"/>
-                <w:szCs w:val="16"/>
-              </w:rPr>
-              <w:t xml:space="preserve">2,25 mi</w:t>
-            </w:r>
-          </w:p>
-        </w:tc>
-        <w:tc>
-          <w:tcPr>
-            <w:tcW w:type="dxa" w:w="1145"/>
-            <w:tcBorders>
-              <w:top w:val="single" w:color="BFBFBF" w:sz="4"/>
-              <w:left w:val="single" w:color="BFBFBF" w:sz="4"/>
-              <w:bottom w:val="single" w:color="BFBFBF" w:sz="4"/>
-              <w:right w:val="single" w:color="BFBFBF" w:sz="4"/>
-            </w:tcBorders>
-            <w:tcMar>
-              <w:top w:type="dxa" w:w="60"/>
-              <w:left w:type="dxa" w:w="100"/>
-              <w:bottom w:type="dxa" w:w="60"/>
-              <w:right w:type="dxa" w:w="100"/>
-            </w:tcMar>
-            <w:vAlign w:val="top"/>
-          </w:tcPr>
-          <w:p>
-            <w:pPr>
-              <w:spacing w:after="0" w:line="252"/>
-              <w:jc w:val="right"/>
-            </w:pPr>
-            <w:r>
-              <w:rPr>
-                <w:sz w:val="16"/>
-                <w:szCs w:val="16"/>
-              </w:rPr>
-              <w:t xml:space="preserve">USD 4,62</w:t>
-            </w:r>
-          </w:p>
-        </w:tc>
-        <w:tc>
-          <w:tcPr>
-            <w:tcW w:type="dxa" w:w="943"/>
-            <w:tcBorders>
-              <w:top w:val="single" w:color="BFBFBF" w:sz="4"/>
-              <w:left w:val="single" w:color="BFBFBF" w:sz="4"/>
-              <w:bottom w:val="single" w:color="BFBFBF" w:sz="4"/>
-              <w:right w:val="single" w:color="BFBFBF" w:sz="4"/>
-            </w:tcBorders>
-            <w:tcMar>
-              <w:top w:type="dxa" w:w="60"/>
-              <w:left w:type="dxa" w:w="100"/>
-              <w:bottom w:type="dxa" w:w="60"/>
-              <w:right w:type="dxa" w:w="100"/>
-            </w:tcMar>
-            <w:vAlign w:val="top"/>
-          </w:tcPr>
-          <w:p>
-            <w:pPr>
-              <w:spacing w:after="0" w:line="252"/>
-              <w:jc w:val="right"/>
-            </w:pPr>
-            <w:r>
-              <w:rPr>
-                <w:sz w:val="16"/>
-                <w:szCs w:val="16"/>
-              </w:rPr>
-              <w:t xml:space="preserve">11,7%</w:t>
-            </w:r>
-          </w:p>
-        </w:tc>
-        <w:tc>
-          <w:tcPr>
-            <w:tcW w:type="dxa" w:w="2829"/>
-            <w:tcBorders>
-              <w:top w:val="single" w:color="BFBFBF" w:sz="4"/>
-              <w:left w:val="single" w:color="BFBFBF" w:sz="4"/>
-              <w:bottom w:val="single" w:color="BFBFBF" w:sz="4"/>
-              <w:right w:val="single" w:color="BFBFBF" w:sz="4"/>
-            </w:tcBorders>
-            <w:tcMar>
-              <w:top w:type="dxa" w:w="60"/>
-              <w:left w:type="dxa" w:w="100"/>
-              <w:bottom w:type="dxa" w:w="60"/>
-              <w:right w:type="dxa" w:w="100"/>
-            </w:tcMar>
-            <w:vAlign w:val="top"/>
-          </w:tcPr>
-          <w:p>
-            <w:pPr>
-              <w:spacing w:after="0" w:line="252"/>
-              <w:jc w:val="left"/>
-            </w:pPr>
-            <w:r>
-              <w:rPr>
-                <w:sz w:val="16"/>
-                <w:szCs w:val="16"/>
-              </w:rPr>
-              <w:t xml:space="preserve">Back Bay → Boston University</w:t>
-            </w:r>
-          </w:p>
-          <w:p>
-            <w:pPr>
-              <w:spacing w:after="0" w:line="252"/>
-              <w:jc w:val="left"/>
-            </w:pPr>
-            <w:r>
-              <w:rPr>
-                <w:sz w:val="16"/>
-                <w:szCs w:val="16"/>
-              </w:rPr>
-              <w:t xml:space="preserve">Back Bay → Fenway</w:t>
+            <w:tcW w:type="dxa" w:w="1533"/>
+            <w:tcBorders>
+              <w:top w:val="single" w:color="BFBFBF" w:sz="4"/>
+              <w:left w:val="single" w:color="BFBFBF" w:sz="4"/>
+              <w:bottom w:val="single" w:color="BFBFBF" w:sz="4"/>
+              <w:right w:val="single" w:color="BFBFBF" w:sz="4"/>
+            </w:tcBorders>
+            <w:tcMar>
+              <w:top w:type="dxa" w:w="60"/>
+              <w:left w:type="dxa" w:w="100"/>
+              <w:bottom w:type="dxa" w:w="60"/>
+              <w:right w:type="dxa" w:w="100"/>
+            </w:tcMar>
+            <w:vAlign w:val="top"/>
+          </w:tcPr>
+          <w:p>
+            <w:pPr>
+              <w:spacing w:after="0" w:line="252"/>
+              <w:jc w:val="left"/>
+            </w:pPr>
+            <w:r>
+              <w:rPr>
+                <w:sz w:val="17"/>
+                <w:szCs w:val="17"/>
+              </w:rPr>
+              <w:t xml:space="preserve">Intermedio</w:t>
+            </w:r>
+          </w:p>
+        </w:tc>
+        <w:tc>
+          <w:tcPr>
+            <w:tcW w:type="dxa" w:w="4428"/>
+            <w:tcBorders>
+              <w:top w:val="single" w:color="BFBFBF" w:sz="4"/>
+              <w:left w:val="single" w:color="BFBFBF" w:sz="4"/>
+              <w:bottom w:val="single" w:color="BFBFBF" w:sz="4"/>
+              <w:right w:val="single" w:color="BFBFBF" w:sz="4"/>
+            </w:tcBorders>
+            <w:tcMar>
+              <w:top w:type="dxa" w:w="60"/>
+              <w:left w:type="dxa" w:w="100"/>
+              <w:bottom w:type="dxa" w:w="60"/>
+              <w:right w:type="dxa" w:w="100"/>
+            </w:tcMar>
+            <w:vAlign w:val="top"/>
+          </w:tcPr>
+          <w:p>
+            <w:pPr>
+              <w:spacing w:after="0" w:line="252"/>
+              <w:jc w:val="left"/>
+            </w:pPr>
+            <w:r>
+              <w:rPr>
+                <w:sz w:val="17"/>
+                <w:szCs w:val="17"/>
+              </w:rPr>
+              <w:t xml:space="preserve">Lyft XL, Lux, UberXL, Black, Lux Black</w:t>
+            </w:r>
+          </w:p>
+        </w:tc>
+        <w:tc>
+          <w:tcPr>
+            <w:tcW w:type="dxa" w:w="1533"/>
+            <w:tcBorders>
+              <w:top w:val="single" w:color="BFBFBF" w:sz="4"/>
+              <w:left w:val="single" w:color="BFBFBF" w:sz="4"/>
+              <w:bottom w:val="single" w:color="BFBFBF" w:sz="4"/>
+              <w:right w:val="single" w:color="BFBFBF" w:sz="4"/>
+            </w:tcBorders>
+            <w:tcMar>
+              <w:top w:type="dxa" w:w="60"/>
+              <w:left w:type="dxa" w:w="100"/>
+              <w:bottom w:type="dxa" w:w="60"/>
+              <w:right w:type="dxa" w:w="100"/>
+            </w:tcMar>
+            <w:vAlign w:val="top"/>
+          </w:tcPr>
+          <w:p>
+            <w:pPr>
+              <w:spacing w:after="0" w:line="252"/>
+              <w:jc w:val="right"/>
+            </w:pPr>
+            <w:r>
+              <w:rPr>
+                <w:sz w:val="17"/>
+                <w:szCs w:val="17"/>
+              </w:rPr>
+              <w:t xml:space="preserve">7,8 a 12,3</w:t>
+            </w:r>
+          </w:p>
+        </w:tc>
+        <w:tc>
+          <w:tcPr>
+            <w:tcW w:type="dxa" w:w="1532"/>
+            <w:tcBorders>
+              <w:top w:val="single" w:color="BFBFBF" w:sz="4"/>
+              <w:left w:val="single" w:color="BFBFBF" w:sz="4"/>
+              <w:bottom w:val="single" w:color="BFBFBF" w:sz="4"/>
+              <w:right w:val="single" w:color="BFBFBF" w:sz="4"/>
+            </w:tcBorders>
+            <w:tcMar>
+              <w:top w:type="dxa" w:w="60"/>
+              <w:left w:type="dxa" w:w="100"/>
+              <w:bottom w:type="dxa" w:w="60"/>
+              <w:right w:type="dxa" w:w="100"/>
+            </w:tcMar>
+            <w:vAlign w:val="top"/>
+          </w:tcPr>
+          <w:p>
+            <w:pPr>
+              <w:spacing w:after="0" w:line="252"/>
+              <w:jc w:val="right"/>
+            </w:pPr>
+            <w:r>
+              <w:rPr>
+                <w:sz w:val="17"/>
+                <w:szCs w:val="17"/>
+              </w:rPr>
+              <w:t xml:space="preserve">3,01 a 4,54</w:t>
             </w:r>
           </w:p>
         </w:tc>
@@ -26307,466 +28535,125 @@
         </w:trPr>
         <w:tc>
           <w:tcPr>
-            <w:tcW w:type="dxa" w:w="674"/>
-            <w:tcBorders>
-              <w:top w:val="single" w:color="BFBFBF" w:sz="4"/>
-              <w:left w:val="single" w:color="BFBFBF" w:sz="4"/>
-              <w:bottom w:val="single" w:color="BFBFBF" w:sz="4"/>
-              <w:right w:val="single" w:color="BFBFBF" w:sz="4"/>
-            </w:tcBorders>
-            <w:tcMar>
-              <w:top w:type="dxa" w:w="60"/>
-              <w:left w:type="dxa" w:w="100"/>
-              <w:bottom w:type="dxa" w:w="60"/>
-              <w:right w:type="dxa" w:w="100"/>
-            </w:tcMar>
-            <w:vAlign w:val="top"/>
-          </w:tcPr>
-          <w:p>
-            <w:pPr>
-              <w:spacing w:after="0" w:line="252"/>
-              <w:jc w:val="left"/>
-            </w:pPr>
-            <w:r>
-              <w:rPr>
-                <w:sz w:val="16"/>
-                <w:szCs w:val="16"/>
-              </w:rPr>
-              <w:t xml:space="preserve">3</w:t>
-            </w:r>
-          </w:p>
-        </w:tc>
-        <w:tc>
-          <w:tcPr>
-            <w:tcW w:type="dxa" w:w="1751"/>
-            <w:tcBorders>
-              <w:top w:val="single" w:color="BFBFBF" w:sz="4"/>
-              <w:left w:val="single" w:color="BFBFBF" w:sz="4"/>
-              <w:bottom w:val="single" w:color="BFBFBF" w:sz="4"/>
-              <w:right w:val="single" w:color="BFBFBF" w:sz="4"/>
-            </w:tcBorders>
-            <w:tcMar>
-              <w:top w:type="dxa" w:w="60"/>
-              <w:left w:type="dxa" w:w="100"/>
-              <w:bottom w:type="dxa" w:w="60"/>
-              <w:right w:type="dxa" w:w="100"/>
-            </w:tcMar>
-            <w:vAlign w:val="top"/>
-          </w:tcPr>
-          <w:p>
-            <w:pPr>
-              <w:spacing w:after="0" w:line="252"/>
-              <w:jc w:val="left"/>
-            </w:pPr>
-            <w:r>
-              <w:rPr>
-                <w:sz w:val="16"/>
-                <w:szCs w:val="16"/>
-              </w:rPr>
-              <w:t xml:space="preserve">Medias, poco recargo</w:t>
-            </w:r>
-          </w:p>
-        </w:tc>
-        <w:tc>
-          <w:tcPr>
-            <w:tcW w:type="dxa" w:w="674"/>
-            <w:tcBorders>
-              <w:top w:val="single" w:color="BFBFBF" w:sz="4"/>
-              <w:left w:val="single" w:color="BFBFBF" w:sz="4"/>
-              <w:bottom w:val="single" w:color="BFBFBF" w:sz="4"/>
-              <w:right w:val="single" w:color="BFBFBF" w:sz="4"/>
-            </w:tcBorders>
-            <w:tcMar>
-              <w:top w:type="dxa" w:w="60"/>
-              <w:left w:type="dxa" w:w="100"/>
-              <w:bottom w:type="dxa" w:w="60"/>
-              <w:right w:type="dxa" w:w="100"/>
-            </w:tcMar>
-            <w:vAlign w:val="top"/>
-          </w:tcPr>
-          <w:p>
-            <w:pPr>
-              <w:spacing w:after="0" w:line="252"/>
-              <w:jc w:val="right"/>
-            </w:pPr>
-            <w:r>
-              <w:rPr>
-                <w:sz w:val="16"/>
-                <w:szCs w:val="16"/>
-              </w:rPr>
-              <w:t xml:space="preserve">13</w:t>
-            </w:r>
-          </w:p>
-        </w:tc>
-        <w:tc>
-          <w:tcPr>
-            <w:tcW w:type="dxa" w:w="1010"/>
-            <w:tcBorders>
-              <w:top w:val="single" w:color="BFBFBF" w:sz="4"/>
-              <w:left w:val="single" w:color="BFBFBF" w:sz="4"/>
-              <w:bottom w:val="single" w:color="BFBFBF" w:sz="4"/>
-              <w:right w:val="single" w:color="BFBFBF" w:sz="4"/>
-            </w:tcBorders>
-            <w:tcMar>
-              <w:top w:type="dxa" w:w="60"/>
-              <w:left w:type="dxa" w:w="100"/>
-              <w:bottom w:type="dxa" w:w="60"/>
-              <w:right w:type="dxa" w:w="100"/>
-            </w:tcMar>
-            <w:vAlign w:val="top"/>
-          </w:tcPr>
-          <w:p>
-            <w:pPr>
-              <w:spacing w:after="0" w:line="252"/>
-              <w:jc w:val="right"/>
-            </w:pPr>
-            <w:r>
-              <w:rPr>
-                <w:sz w:val="16"/>
-                <w:szCs w:val="16"/>
-              </w:rPr>
-              <w:t xml:space="preserve">2,54 mi</w:t>
-            </w:r>
-          </w:p>
-        </w:tc>
-        <w:tc>
-          <w:tcPr>
-            <w:tcW w:type="dxa" w:w="1145"/>
-            <w:tcBorders>
-              <w:top w:val="single" w:color="BFBFBF" w:sz="4"/>
-              <w:left w:val="single" w:color="BFBFBF" w:sz="4"/>
-              <w:bottom w:val="single" w:color="BFBFBF" w:sz="4"/>
-              <w:right w:val="single" w:color="BFBFBF" w:sz="4"/>
-            </w:tcBorders>
-            <w:tcMar>
-              <w:top w:type="dxa" w:w="60"/>
-              <w:left w:type="dxa" w:w="100"/>
-              <w:bottom w:type="dxa" w:w="60"/>
-              <w:right w:type="dxa" w:w="100"/>
-            </w:tcMar>
-            <w:vAlign w:val="top"/>
-          </w:tcPr>
-          <w:p>
-            <w:pPr>
-              <w:spacing w:after="0" w:line="252"/>
-              <w:jc w:val="right"/>
-            </w:pPr>
-            <w:r>
-              <w:rPr>
-                <w:sz w:val="16"/>
-                <w:szCs w:val="16"/>
-              </w:rPr>
-              <w:t xml:space="preserve">USD 4,09</w:t>
-            </w:r>
-          </w:p>
-        </w:tc>
-        <w:tc>
-          <w:tcPr>
-            <w:tcW w:type="dxa" w:w="943"/>
-            <w:tcBorders>
-              <w:top w:val="single" w:color="BFBFBF" w:sz="4"/>
-              <w:left w:val="single" w:color="BFBFBF" w:sz="4"/>
-              <w:bottom w:val="single" w:color="BFBFBF" w:sz="4"/>
-              <w:right w:val="single" w:color="BFBFBF" w:sz="4"/>
-            </w:tcBorders>
-            <w:tcMar>
-              <w:top w:type="dxa" w:w="60"/>
-              <w:left w:type="dxa" w:w="100"/>
-              <w:bottom w:type="dxa" w:w="60"/>
-              <w:right w:type="dxa" w:w="100"/>
-            </w:tcMar>
-            <w:vAlign w:val="top"/>
-          </w:tcPr>
-          <w:p>
-            <w:pPr>
-              <w:spacing w:after="0" w:line="252"/>
-              <w:jc w:val="right"/>
-            </w:pPr>
-            <w:r>
-              <w:rPr>
-                <w:sz w:val="16"/>
-                <w:szCs w:val="16"/>
-              </w:rPr>
-              <w:t xml:space="preserve">4,1%</w:t>
-            </w:r>
-          </w:p>
-        </w:tc>
-        <w:tc>
-          <w:tcPr>
-            <w:tcW w:type="dxa" w:w="2829"/>
-            <w:tcBorders>
-              <w:top w:val="single" w:color="BFBFBF" w:sz="4"/>
-              <w:left w:val="single" w:color="BFBFBF" w:sz="4"/>
-              <w:bottom w:val="single" w:color="BFBFBF" w:sz="4"/>
-              <w:right w:val="single" w:color="BFBFBF" w:sz="4"/>
-            </w:tcBorders>
-            <w:tcMar>
-              <w:top w:type="dxa" w:w="60"/>
-              <w:left w:type="dxa" w:w="100"/>
-              <w:bottom w:type="dxa" w:w="60"/>
-              <w:right w:type="dxa" w:w="100"/>
-            </w:tcMar>
-            <w:vAlign w:val="top"/>
-          </w:tcPr>
-          <w:p>
-            <w:pPr>
-              <w:spacing w:after="0" w:line="252"/>
-              <w:jc w:val="left"/>
-            </w:pPr>
-            <w:r>
-              <w:rPr>
-                <w:sz w:val="16"/>
-                <w:szCs w:val="16"/>
-              </w:rPr>
-              <w:t xml:space="preserve">South Station → West End</w:t>
-            </w:r>
-          </w:p>
-          <w:p>
-            <w:pPr>
-              <w:spacing w:after="0" w:line="252"/>
-              <w:jc w:val="left"/>
-            </w:pPr>
-            <w:r>
-              <w:rPr>
-                <w:sz w:val="16"/>
-                <w:szCs w:val="16"/>
-              </w:rPr>
-              <w:t xml:space="preserve">South Station → North Station</w:t>
-            </w:r>
-          </w:p>
-        </w:tc>
-      </w:tr>
-      <w:tr>
-        <w:trPr>
-          <w:cantSplit/>
-        </w:trPr>
-        <w:tc>
-          <w:tcPr>
-            <w:tcW w:type="dxa" w:w="674"/>
-            <w:tcBorders>
-              <w:top w:val="single" w:color="BFBFBF" w:sz="4"/>
-              <w:left w:val="single" w:color="BFBFBF" w:sz="4"/>
-              <w:bottom w:val="single" w:color="BFBFBF" w:sz="4"/>
-              <w:right w:val="single" w:color="BFBFBF" w:sz="4"/>
-            </w:tcBorders>
-            <w:tcMar>
-              <w:top w:type="dxa" w:w="60"/>
-              <w:left w:type="dxa" w:w="100"/>
-              <w:bottom w:type="dxa" w:w="60"/>
-              <w:right w:type="dxa" w:w="100"/>
-            </w:tcMar>
-            <w:vAlign w:val="top"/>
-          </w:tcPr>
-          <w:p>
-            <w:pPr>
-              <w:spacing w:after="0" w:line="252"/>
-              <w:jc w:val="left"/>
-            </w:pPr>
-            <w:r>
-              <w:rPr>
-                <w:sz w:val="16"/>
-                <w:szCs w:val="16"/>
-              </w:rPr>
-              <w:t xml:space="preserve">4</w:t>
-            </w:r>
-          </w:p>
-        </w:tc>
-        <w:tc>
-          <w:tcPr>
-            <w:tcW w:type="dxa" w:w="1751"/>
-            <w:tcBorders>
-              <w:top w:val="single" w:color="BFBFBF" w:sz="4"/>
-              <w:left w:val="single" w:color="BFBFBF" w:sz="4"/>
-              <w:bottom w:val="single" w:color="BFBFBF" w:sz="4"/>
-              <w:right w:val="single" w:color="BFBFBF" w:sz="4"/>
-            </w:tcBorders>
-            <w:tcMar>
-              <w:top w:type="dxa" w:w="60"/>
-              <w:left w:type="dxa" w:w="100"/>
-              <w:bottom w:type="dxa" w:w="60"/>
-              <w:right w:type="dxa" w:w="100"/>
-            </w:tcMar>
-            <w:vAlign w:val="top"/>
-          </w:tcPr>
-          <w:p>
-            <w:pPr>
-              <w:spacing w:after="0" w:line="252"/>
-              <w:jc w:val="left"/>
-            </w:pPr>
-            <w:r>
-              <w:rPr>
-                <w:sz w:val="16"/>
-                <w:szCs w:val="16"/>
-              </w:rPr>
-              <w:t xml:space="preserve">Las más largas</w:t>
-            </w:r>
-          </w:p>
-        </w:tc>
-        <w:tc>
-          <w:tcPr>
-            <w:tcW w:type="dxa" w:w="674"/>
-            <w:tcBorders>
-              <w:top w:val="single" w:color="BFBFBF" w:sz="4"/>
-              <w:left w:val="single" w:color="BFBFBF" w:sz="4"/>
-              <w:bottom w:val="single" w:color="BFBFBF" w:sz="4"/>
-              <w:right w:val="single" w:color="BFBFBF" w:sz="4"/>
-            </w:tcBorders>
-            <w:tcMar>
-              <w:top w:type="dxa" w:w="60"/>
-              <w:left w:type="dxa" w:w="100"/>
-              <w:bottom w:type="dxa" w:w="60"/>
-              <w:right w:type="dxa" w:w="100"/>
-            </w:tcMar>
-            <w:vAlign w:val="top"/>
-          </w:tcPr>
-          <w:p>
-            <w:pPr>
-              <w:spacing w:after="0" w:line="252"/>
-              <w:jc w:val="right"/>
-            </w:pPr>
-            <w:r>
-              <w:rPr>
-                <w:sz w:val="16"/>
-                <w:szCs w:val="16"/>
-              </w:rPr>
-              <w:t xml:space="preserve">7</w:t>
-            </w:r>
-          </w:p>
-        </w:tc>
-        <w:tc>
-          <w:tcPr>
-            <w:tcW w:type="dxa" w:w="1010"/>
-            <w:tcBorders>
-              <w:top w:val="single" w:color="BFBFBF" w:sz="4"/>
-              <w:left w:val="single" w:color="BFBFBF" w:sz="4"/>
-              <w:bottom w:val="single" w:color="BFBFBF" w:sz="4"/>
-              <w:right w:val="single" w:color="BFBFBF" w:sz="4"/>
-            </w:tcBorders>
-            <w:tcMar>
-              <w:top w:type="dxa" w:w="60"/>
-              <w:left w:type="dxa" w:w="100"/>
-              <w:bottom w:type="dxa" w:w="60"/>
-              <w:right w:type="dxa" w:w="100"/>
-            </w:tcMar>
-            <w:vAlign w:val="top"/>
-          </w:tcPr>
-          <w:p>
-            <w:pPr>
-              <w:spacing w:after="0" w:line="252"/>
-              <w:jc w:val="right"/>
-            </w:pPr>
-            <w:r>
-              <w:rPr>
-                <w:sz w:val="16"/>
-                <w:szCs w:val="16"/>
-              </w:rPr>
-              <w:t xml:space="preserve">4,34 mi</w:t>
-            </w:r>
-          </w:p>
-        </w:tc>
-        <w:tc>
-          <w:tcPr>
-            <w:tcW w:type="dxa" w:w="1145"/>
-            <w:tcBorders>
-              <w:top w:val="single" w:color="BFBFBF" w:sz="4"/>
-              <w:left w:val="single" w:color="BFBFBF" w:sz="4"/>
-              <w:bottom w:val="single" w:color="BFBFBF" w:sz="4"/>
-              <w:right w:val="single" w:color="BFBFBF" w:sz="4"/>
-            </w:tcBorders>
-            <w:tcMar>
-              <w:top w:type="dxa" w:w="60"/>
-              <w:left w:type="dxa" w:w="100"/>
-              <w:bottom w:type="dxa" w:w="60"/>
-              <w:right w:type="dxa" w:w="100"/>
-            </w:tcMar>
-            <w:vAlign w:val="top"/>
-          </w:tcPr>
-          <w:p>
-            <w:pPr>
-              <w:spacing w:after="0" w:line="252"/>
-              <w:jc w:val="right"/>
-            </w:pPr>
-            <w:r>
-              <w:rPr>
-                <w:sz w:val="16"/>
-                <w:szCs w:val="16"/>
-              </w:rPr>
-              <w:t xml:space="preserve">USD 3,02</w:t>
-            </w:r>
-          </w:p>
-        </w:tc>
-        <w:tc>
-          <w:tcPr>
-            <w:tcW w:type="dxa" w:w="943"/>
-            <w:tcBorders>
-              <w:top w:val="single" w:color="BFBFBF" w:sz="4"/>
-              <w:left w:val="single" w:color="BFBFBF" w:sz="4"/>
-              <w:bottom w:val="single" w:color="BFBFBF" w:sz="4"/>
-              <w:right w:val="single" w:color="BFBFBF" w:sz="4"/>
-            </w:tcBorders>
-            <w:tcMar>
-              <w:top w:type="dxa" w:w="60"/>
-              <w:left w:type="dxa" w:w="100"/>
-              <w:bottom w:type="dxa" w:w="60"/>
-              <w:right w:type="dxa" w:w="100"/>
-            </w:tcMar>
-            <w:vAlign w:val="top"/>
-          </w:tcPr>
-          <w:p>
-            <w:pPr>
-              <w:spacing w:after="0" w:line="252"/>
-              <w:jc w:val="right"/>
-            </w:pPr>
-            <w:r>
-              <w:rPr>
-                <w:sz w:val="16"/>
-                <w:szCs w:val="16"/>
-              </w:rPr>
-              <w:t xml:space="preserve">9,9%</w:t>
-            </w:r>
-          </w:p>
-        </w:tc>
-        <w:tc>
-          <w:tcPr>
-            <w:tcW w:type="dxa" w:w="2829"/>
-            <w:tcBorders>
-              <w:top w:val="single" w:color="BFBFBF" w:sz="4"/>
-              <w:left w:val="single" w:color="BFBFBF" w:sz="4"/>
-              <w:bottom w:val="single" w:color="BFBFBF" w:sz="4"/>
-              <w:right w:val="single" w:color="BFBFBF" w:sz="4"/>
-            </w:tcBorders>
-            <w:tcMar>
-              <w:top w:type="dxa" w:w="60"/>
-              <w:left w:type="dxa" w:w="100"/>
-              <w:bottom w:type="dxa" w:w="60"/>
-              <w:right w:type="dxa" w:w="100"/>
-            </w:tcMar>
-            <w:vAlign w:val="top"/>
-          </w:tcPr>
-          <w:p>
-            <w:pPr>
-              <w:spacing w:after="0" w:line="252"/>
-              <w:jc w:val="left"/>
-            </w:pPr>
-            <w:r>
-              <w:rPr>
-                <w:sz w:val="16"/>
-                <w:szCs w:val="16"/>
-              </w:rPr>
-              <w:t xml:space="preserve">Fenway → Financial District</w:t>
-            </w:r>
-          </w:p>
-          <w:p>
-            <w:pPr>
-              <w:spacing w:after="0" w:line="252"/>
-              <w:jc w:val="left"/>
-            </w:pPr>
-            <w:r>
-              <w:rPr>
-                <w:sz w:val="16"/>
-                <w:szCs w:val="16"/>
-              </w:rPr>
-              <w:t xml:space="preserve">Northeastern University → Financial District</w:t>
+            <w:tcW w:type="dxa" w:w="1533"/>
+            <w:tcBorders>
+              <w:top w:val="single" w:color="BFBFBF" w:sz="4"/>
+              <w:left w:val="single" w:color="BFBFBF" w:sz="4"/>
+              <w:bottom w:val="single" w:color="BFBFBF" w:sz="4"/>
+              <w:right w:val="single" w:color="BFBFBF" w:sz="4"/>
+            </w:tcBorders>
+            <w:tcMar>
+              <w:top w:type="dxa" w:w="60"/>
+              <w:left w:type="dxa" w:w="100"/>
+              <w:bottom w:type="dxa" w:w="60"/>
+              <w:right w:type="dxa" w:w="100"/>
+            </w:tcMar>
+            <w:vAlign w:val="top"/>
+          </w:tcPr>
+          <w:p>
+            <w:pPr>
+              <w:spacing w:after="0" w:line="252"/>
+              <w:jc w:val="left"/>
+            </w:pPr>
+            <w:r>
+              <w:rPr>
+                <w:sz w:val="17"/>
+                <w:szCs w:val="17"/>
+              </w:rPr>
+              <w:t xml:space="preserve">Premium</w:t>
+            </w:r>
+          </w:p>
+        </w:tc>
+        <w:tc>
+          <w:tcPr>
+            <w:tcW w:type="dxa" w:w="4428"/>
+            <w:tcBorders>
+              <w:top w:val="single" w:color="BFBFBF" w:sz="4"/>
+              <w:left w:val="single" w:color="BFBFBF" w:sz="4"/>
+              <w:bottom w:val="single" w:color="BFBFBF" w:sz="4"/>
+              <w:right w:val="single" w:color="BFBFBF" w:sz="4"/>
+            </w:tcBorders>
+            <w:tcMar>
+              <w:top w:type="dxa" w:w="60"/>
+              <w:left w:type="dxa" w:w="100"/>
+              <w:bottom w:type="dxa" w:w="60"/>
+              <w:right w:type="dxa" w:w="100"/>
+            </w:tcMar>
+            <w:vAlign w:val="top"/>
+          </w:tcPr>
+          <w:p>
+            <w:pPr>
+              <w:spacing w:after="0" w:line="252"/>
+              <w:jc w:val="left"/>
+            </w:pPr>
+            <w:r>
+              <w:rPr>
+                <w:sz w:val="17"/>
+                <w:szCs w:val="17"/>
+              </w:rPr>
+              <w:t xml:space="preserve">Lux Black XL, Black SUV</w:t>
+            </w:r>
+          </w:p>
+        </w:tc>
+        <w:tc>
+          <w:tcPr>
+            <w:tcW w:type="dxa" w:w="1533"/>
+            <w:tcBorders>
+              <w:top w:val="single" w:color="BFBFBF" w:sz="4"/>
+              <w:left w:val="single" w:color="BFBFBF" w:sz="4"/>
+              <w:bottom w:val="single" w:color="BFBFBF" w:sz="4"/>
+              <w:right w:val="single" w:color="BFBFBF" w:sz="4"/>
+            </w:tcBorders>
+            <w:tcMar>
+              <w:top w:type="dxa" w:w="60"/>
+              <w:left w:type="dxa" w:w="100"/>
+              <w:bottom w:type="dxa" w:w="60"/>
+              <w:right w:type="dxa" w:w="100"/>
+            </w:tcMar>
+            <w:vAlign w:val="top"/>
+          </w:tcPr>
+          <w:p>
+            <w:pPr>
+              <w:spacing w:after="0" w:line="252"/>
+              <w:jc w:val="right"/>
+            </w:pPr>
+            <w:r>
+              <w:rPr>
+                <w:sz w:val="17"/>
+                <w:szCs w:val="17"/>
+              </w:rPr>
+              <w:t xml:space="preserve">21,9 a 22,5</w:t>
+            </w:r>
+          </w:p>
+        </w:tc>
+        <w:tc>
+          <w:tcPr>
+            <w:tcW w:type="dxa" w:w="1532"/>
+            <w:tcBorders>
+              <w:top w:val="single" w:color="BFBFBF" w:sz="4"/>
+              <w:left w:val="single" w:color="BFBFBF" w:sz="4"/>
+              <w:bottom w:val="single" w:color="BFBFBF" w:sz="4"/>
+              <w:right w:val="single" w:color="BFBFBF" w:sz="4"/>
+            </w:tcBorders>
+            <w:tcMar>
+              <w:top w:type="dxa" w:w="60"/>
+              <w:left w:type="dxa" w:w="100"/>
+              <w:bottom w:type="dxa" w:w="60"/>
+              <w:right w:type="dxa" w:w="100"/>
+            </w:tcMar>
+            <w:vAlign w:val="top"/>
+          </w:tcPr>
+          <w:p>
+            <w:pPr>
+              <w:spacing w:after="0" w:line="252"/>
+              <w:jc w:val="right"/>
+            </w:pPr>
+            <w:r>
+              <w:rPr>
+                <w:sz w:val="17"/>
+                <w:szCs w:val="17"/>
+              </w:rPr>
+              <w:t xml:space="preserve">3,53 a 4,24</w:t>
             </w:r>
           </w:p>
         </w:tc>
@@ -26779,7 +28666,12 @@
     </w:p>
     <w:p>
       <w:pPr>
-        <w:spacing w:after="120" w:before="0" w:line="276"/>
+        <w:pStyle w:val="ListParagraph"/>
+        <w:numPr>
+          <w:ilvl w:val="0"/>
+          <w:numId w:val="2"/>
+        </w:numPr>
+        <w:spacing w:after="80" w:line="276"/>
         <w:jc w:val="both"/>
       </w:pPr>
       <w:r>
@@ -26787,30 +28679,68 @@
           <w:b/>
           <w:bCs/>
         </w:rPr>
-        <w:t xml:space="preserve">H4 se confirma:</w:t>
-      </w:r>
-      <w:r>
-        <w:t xml:space="preserve"> el precio por milla más alto está en las rutas muy cortas, donde pesa la tarifa base (Financial District → South Station: USD 17,95 por milla en 0,41 millas). </w:t>
-      </w:r>
+        <w:t xml:space="preserve">Los 12 productos se reducen a tres familias de tarifa.</w:t>
+      </w:r>
+      <w:r>
+        <w:t xml:space="preserve"> Las diferencias de precio entre productos no son continuas: hay un escalón entre los económicos y el resto (el precio por milla se duplica) y otro entre los Black y los vehículos grandes de lujo (la tarifa base casi se duplica).</w:t>
+      </w:r>
+    </w:p>
+    <w:p>
+      <w:pPr>
+        <w:pStyle w:val="ListParagraph"/>
+        <w:numPr>
+          <w:ilvl w:val="0"/>
+          <w:numId w:val="2"/>
+        </w:numPr>
+        <w:spacing w:after="80" w:line="276"/>
+        <w:jc w:val="both"/>
+      </w:pPr>
       <w:r>
         <w:rPr>
           <w:b/>
           <w:bCs/>
         </w:rPr>
-        <w:t xml:space="preserve">H6 se confirma parcialmente:</w:t>
-      </w:r>
-      <w:r>
-        <w:t xml:space="preserve"> los perfiles son reconocibles y muestran que la distancia y el recargo son </w:t>
-      </w:r>
+        <w:t xml:space="preserve">Uber y Lyft arman el precio igual.</w:t>
+      </w:r>
+      <w:r>
+        <w:t xml:space="preserve"> Cada producto de Uber cae en la misma familia que su equivalente de Lyft (UberX con Lyft, UberXL con Lyft XL, Black con Lux Black, Black SUV con Lux Black XL): compiten con la misma estructura y las diferencias de H2 son ajustes dentro de cada familia.</w:t>
+      </w:r>
+    </w:p>
+    <w:p>
+      <w:pPr>
+        <w:pStyle w:val="ListParagraph"/>
+        <w:numPr>
+          <w:ilvl w:val="0"/>
+          <w:numId w:val="2"/>
+        </w:numPr>
+        <w:spacing w:after="80" w:line="276"/>
+        <w:jc w:val="both"/>
+      </w:pPr>
       <w:r>
         <w:rPr>
           <w:b/>
           <w:bCs/>
         </w:rPr>
-        <w:t xml:space="preserve">dos ejes distintos</w:t>
-      </w:r>
-      <w:r>
-        <w:t xml:space="preserve">: el recargo alto aparece en rutas de distintas distancias y se concentra en las que salen del oeste (Back Bay, Fenway, las universidades). La ruta con más recargo es Back Bay → Boston University (15,3%) y la de menos, Haymarket Square → Beacon Hill (0,6%). Es la misma conclusión que el modelo de clasificación, por un método distinto.</w:t>
+        <w:t xml:space="preserve">Explica por qué los viajes cortos son caros por milla (H4).</w:t>
+      </w:r>
+      <w:r>
+        <w:t xml:space="preserve"> Como la tarifa base se cobra siempre, el precio por milla es tarifa base / distancia + precio por milla. En UberX (base USD 6,40, USD 1,53 por milla), un viaje de 1 milla cuesta USD 7,94 por milla y uno de 5 millas, USD 2,81. Por eso la ruta más cara por milla es Financial District → South Station (USD 17,95 por milla en 0,41 millas): es muy corta, no es una zona cara.</w:t>
+      </w:r>
+    </w:p>
+    <w:p>
+      <w:pPr>
+        <w:spacing w:after="120" w:before="0" w:line="276"/>
+        <w:jc w:val="both"/>
+      </w:pPr>
+      <w:r>
+        <w:rPr>
+          <w:b/>
+          <w:bCs/>
+        </w:rPr>
+        <w:t xml:space="preserve">Limitación:</w:t>
+      </w:r>
+      <w:r>
+        <w:t xml:space="preserve"> son solo 12 puntos, así que el análisis es descriptivo. Lo presentamos como un resumen de la estructura tarifaria del mercado, que conecta con H1 (el producto es el principal factor del precio).</w:t>
       </w:r>
     </w:p>
     <w:p>
@@ -27314,7 +29244,7 @@
                 <w:sz w:val="18"/>
                 <w:szCs w:val="18"/>
               </w:rPr>
-              <w:t xml:space="preserve">Rutas muy cortas: hasta USD 17,95 por milla por la tarifa base.</w:t>
+              <w:t xml:space="preserve">Sí: las rutas muy cortas (hasta USD 17,95 por milla), por la tarifa base fija de cada producto.</w:t>
             </w:r>
           </w:p>
         </w:tc>
@@ -27510,7 +29440,7 @@
                 <w:sz w:val="18"/>
                 <w:szCs w:val="18"/>
               </w:rPr>
-              <w:t xml:space="preserve">4 perfiles de rutas reconocibles, con silueta baja y pareja (0,45).</w:t>
+              <w:t xml:space="preserve">Los 12 productos forman 3 familias de tarifa bien separadas (silueta 0,68).</w:t>
             </w:r>
           </w:p>
         </w:tc>
@@ -27541,7 +29471,7 @@
                 <w:sz w:val="18"/>
                 <w:szCs w:val="18"/>
               </w:rPr>
-              <w:t xml:space="preserve">Parcial</w:t>
+              <w:t xml:space="preserve">Confirmada</w:t>
             </w:r>
           </w:p>
         </w:tc>
@@ -28401,7 +30331,7 @@
                 <w:sz w:val="18"/>
                 <w:szCs w:val="18"/>
               </w:rPr>
-              <w:t xml:space="preserve">Segmentación de rutas con K-Means</w:t>
+              <w:t xml:space="preserve">Familias tarifarias de los productos con K-Means</w:t>
             </w:r>
           </w:p>
         </w:tc>

</xml_diff>

<commit_message>
docs(sprint-3): alinear la revision con la version final y agregar la consigna
- REVISION_ENTREGA3_PRELIMINAR.md: K-Means de productos, validacion temporal
  en orden, +87% de la particion aleatoria y accuracy del gradient boosting
- Informe: corregir frase de la seccion 5.3 (recall 0% sin balanceo)
- README: listar COMO_SE_PREDICE_EL_SURGE.md
- Agregar el PDF de la consigna del TP

Co-Authored-By: Claude Opus 5.5 <noreply@anthropic.com>
</commit_message>
<xml_diff>
--- a/Contenido Entrega 3 mejoras/1_Informe/Entrega3_Grupo11.docx
+++ b/Contenido Entrega 3 mejoras/1_Informe/Entrega3_Grupo11.docx
@@ -21069,10 +21069,10 @@
           <w:b/>
           <w:bCs/>
         </w:rPr>
-        <w:t xml:space="preserve">Sin balanceo, los modelos casi no detectan recargos con el umbral 0,5</w:t>
-      </w:r>
-      <w:r>
-        <w:t xml:space="preserve"> (recall de 0,0% como máximo), aunque la exactitud quede cerca del 91,7%: es el sesgo hacia la clase mayoritaria explicado en clase.</w:t>
+        <w:t xml:space="preserve">Sin balanceo, los modelos no detectan ningún recargo con el umbral 0,5</w:t>
+      </w:r>
+      <w:r>
+        <w:t xml:space="preserve"> (recall de 0%), aunque la exactitud quede en 91,7%: es el sesgo hacia la clase mayoritaria explicado en clase.</w:t>
       </w:r>
     </w:p>
     <w:p>

</xml_diff>